<commit_message>
docs: update README with CI email notification setup and Streamlit Cloud deployment instructions; modify .gitignore to include additional patterns
</commit_message>
<xml_diff>
--- a/heymax_documentation/HeyMax_Analytics_Documentation.docx
+++ b/heymax_documentation/HeyMax_Analytics_Documentation.docx
@@ -6,8 +6,13 @@
       <w:pPr>
         <w:pStyle w:val="Title"/>
       </w:pPr>
-      <w:r>
-        <w:t>HeyMax Analytics Project Documentation</w:t>
+      <w:proofErr w:type="spellStart"/>
+      <w:r>
+        <w:t>HeyMax</w:t>
+      </w:r>
+      <w:proofErr w:type="spellEnd"/>
+      <w:r>
+        <w:t xml:space="preserve"> Analytics Project Documentation</w:t>
       </w:r>
     </w:p>
     <w:sdt>
@@ -64,7 +69,7 @@
           <w:r>
             <w:fldChar w:fldCharType="separate"/>
           </w:r>
-          <w:hyperlink w:anchor="_Toc201536854" w:history="1">
+          <w:hyperlink w:anchor="_Toc201573632" w:history="1">
             <w:r>
               <w:rPr>
                 <w:rStyle w:val="Hyperlink"/>
@@ -91,7 +96,7 @@
                 <w:noProof/>
                 <w:webHidden/>
               </w:rPr>
-              <w:instrText xml:space="preserve"> PAGEREF _Toc201536854 \h </w:instrText>
+              <w:instrText xml:space="preserve"> PAGEREF _Toc201573632 \h </w:instrText>
             </w:r>
             <w:r>
               <w:rPr>
@@ -137,7 +142,7 @@
               <w14:ligatures w14:val="standardContextual"/>
             </w:rPr>
           </w:pPr>
-          <w:hyperlink w:anchor="_Toc201536855" w:history="1">
+          <w:hyperlink w:anchor="_Toc201573633" w:history="1">
             <w:r>
               <w:rPr>
                 <w:rStyle w:val="Hyperlink"/>
@@ -164,7 +169,7 @@
                 <w:noProof/>
                 <w:webHidden/>
               </w:rPr>
-              <w:instrText xml:space="preserve"> PAGEREF _Toc201536855 \h </w:instrText>
+              <w:instrText xml:space="preserve"> PAGEREF _Toc201573633 \h </w:instrText>
             </w:r>
             <w:r>
               <w:rPr>
@@ -210,7 +215,7 @@
               <w14:ligatures w14:val="standardContextual"/>
             </w:rPr>
           </w:pPr>
-          <w:hyperlink w:anchor="_Toc201536856" w:history="1">
+          <w:hyperlink w:anchor="_Toc201573634" w:history="1">
             <w:r>
               <w:rPr>
                 <w:rStyle w:val="Hyperlink"/>
@@ -237,7 +242,7 @@
                 <w:noProof/>
                 <w:webHidden/>
               </w:rPr>
-              <w:instrText xml:space="preserve"> PAGEREF _Toc201536856 \h </w:instrText>
+              <w:instrText xml:space="preserve"> PAGEREF _Toc201573634 \h </w:instrText>
             </w:r>
             <w:r>
               <w:rPr>
@@ -283,7 +288,7 @@
               <w14:ligatures w14:val="standardContextual"/>
             </w:rPr>
           </w:pPr>
-          <w:hyperlink w:anchor="_Toc201536857" w:history="1">
+          <w:hyperlink w:anchor="_Toc201573635" w:history="1">
             <w:r>
               <w:rPr>
                 <w:rStyle w:val="Hyperlink"/>
@@ -310,7 +315,7 @@
                 <w:noProof/>
                 <w:webHidden/>
               </w:rPr>
-              <w:instrText xml:space="preserve"> PAGEREF _Toc201536857 \h </w:instrText>
+              <w:instrText xml:space="preserve"> PAGEREF _Toc201573635 \h </w:instrText>
             </w:r>
             <w:r>
               <w:rPr>
@@ -356,7 +361,7 @@
               <w14:ligatures w14:val="standardContextual"/>
             </w:rPr>
           </w:pPr>
-          <w:hyperlink w:anchor="_Toc201536858" w:history="1">
+          <w:hyperlink w:anchor="_Toc201573636" w:history="1">
             <w:r>
               <w:rPr>
                 <w:rStyle w:val="Hyperlink"/>
@@ -383,7 +388,7 @@
                 <w:noProof/>
                 <w:webHidden/>
               </w:rPr>
-              <w:instrText xml:space="preserve"> PAGEREF _Toc201536858 \h </w:instrText>
+              <w:instrText xml:space="preserve"> PAGEREF _Toc201573636 \h </w:instrText>
             </w:r>
             <w:r>
               <w:rPr>
@@ -429,7 +434,7 @@
               <w14:ligatures w14:val="standardContextual"/>
             </w:rPr>
           </w:pPr>
-          <w:hyperlink w:anchor="_Toc201536859" w:history="1">
+          <w:hyperlink w:anchor="_Toc201573637" w:history="1">
             <w:r>
               <w:rPr>
                 <w:rStyle w:val="Hyperlink"/>
@@ -456,7 +461,7 @@
                 <w:noProof/>
                 <w:webHidden/>
               </w:rPr>
-              <w:instrText xml:space="preserve"> PAGEREF _Toc201536859 \h </w:instrText>
+              <w:instrText xml:space="preserve"> PAGEREF _Toc201573637 \h </w:instrText>
             </w:r>
             <w:r>
               <w:rPr>
@@ -502,7 +507,7 @@
               <w14:ligatures w14:val="standardContextual"/>
             </w:rPr>
           </w:pPr>
-          <w:hyperlink w:anchor="_Toc201536860" w:history="1">
+          <w:hyperlink w:anchor="_Toc201573638" w:history="1">
             <w:r>
               <w:rPr>
                 <w:rStyle w:val="Hyperlink"/>
@@ -529,7 +534,7 @@
                 <w:noProof/>
                 <w:webHidden/>
               </w:rPr>
-              <w:instrText xml:space="preserve"> PAGEREF _Toc201536860 \h </w:instrText>
+              <w:instrText xml:space="preserve"> PAGEREF _Toc201573638 \h </w:instrText>
             </w:r>
             <w:r>
               <w:rPr>
@@ -575,7 +580,7 @@
               <w14:ligatures w14:val="standardContextual"/>
             </w:rPr>
           </w:pPr>
-          <w:hyperlink w:anchor="_Toc201536861" w:history="1">
+          <w:hyperlink w:anchor="_Toc201573639" w:history="1">
             <w:r>
               <w:rPr>
                 <w:rStyle w:val="Hyperlink"/>
@@ -602,7 +607,7 @@
                 <w:noProof/>
                 <w:webHidden/>
               </w:rPr>
-              <w:instrText xml:space="preserve"> PAGEREF _Toc201536861 \h </w:instrText>
+              <w:instrText xml:space="preserve"> PAGEREF _Toc201573639 \h </w:instrText>
             </w:r>
             <w:r>
               <w:rPr>
@@ -648,7 +653,7 @@
               <w14:ligatures w14:val="standardContextual"/>
             </w:rPr>
           </w:pPr>
-          <w:hyperlink w:anchor="_Toc201536862" w:history="1">
+          <w:hyperlink w:anchor="_Toc201573640" w:history="1">
             <w:r>
               <w:rPr>
                 <w:rStyle w:val="Hyperlink"/>
@@ -675,7 +680,7 @@
                 <w:noProof/>
                 <w:webHidden/>
               </w:rPr>
-              <w:instrText xml:space="preserve"> PAGEREF _Toc201536862 \h </w:instrText>
+              <w:instrText xml:space="preserve"> PAGEREF _Toc201573640 \h </w:instrText>
             </w:r>
             <w:r>
               <w:rPr>
@@ -721,7 +726,7 @@
               <w14:ligatures w14:val="standardContextual"/>
             </w:rPr>
           </w:pPr>
-          <w:hyperlink w:anchor="_Toc201536863" w:history="1">
+          <w:hyperlink w:anchor="_Toc201573641" w:history="1">
             <w:r>
               <w:rPr>
                 <w:rStyle w:val="Hyperlink"/>
@@ -748,7 +753,7 @@
                 <w:noProof/>
                 <w:webHidden/>
               </w:rPr>
-              <w:instrText xml:space="preserve"> PAGEREF _Toc201536863 \h </w:instrText>
+              <w:instrText xml:space="preserve"> PAGEREF _Toc201573641 \h </w:instrText>
             </w:r>
             <w:r>
               <w:rPr>
@@ -794,7 +799,7 @@
               <w14:ligatures w14:val="standardContextual"/>
             </w:rPr>
           </w:pPr>
-          <w:hyperlink w:anchor="_Toc201536864" w:history="1">
+          <w:hyperlink w:anchor="_Toc201573642" w:history="1">
             <w:r>
               <w:rPr>
                 <w:rStyle w:val="Hyperlink"/>
@@ -821,7 +826,7 @@
                 <w:noProof/>
                 <w:webHidden/>
               </w:rPr>
-              <w:instrText xml:space="preserve"> PAGEREF _Toc201536864 \h </w:instrText>
+              <w:instrText xml:space="preserve"> PAGEREF _Toc201573642 \h </w:instrText>
             </w:r>
             <w:r>
               <w:rPr>
@@ -867,7 +872,7 @@
               <w14:ligatures w14:val="standardContextual"/>
             </w:rPr>
           </w:pPr>
-          <w:hyperlink w:anchor="_Toc201536865" w:history="1">
+          <w:hyperlink w:anchor="_Toc201573643" w:history="1">
             <w:r>
               <w:rPr>
                 <w:rStyle w:val="Hyperlink"/>
@@ -894,7 +899,7 @@
                 <w:noProof/>
                 <w:webHidden/>
               </w:rPr>
-              <w:instrText xml:space="preserve"> PAGEREF _Toc201536865 \h </w:instrText>
+              <w:instrText xml:space="preserve"> PAGEREF _Toc201573643 \h </w:instrText>
             </w:r>
             <w:r>
               <w:rPr>
@@ -940,7 +945,7 @@
               <w14:ligatures w14:val="standardContextual"/>
             </w:rPr>
           </w:pPr>
-          <w:hyperlink w:anchor="_Toc201536866" w:history="1">
+          <w:hyperlink w:anchor="_Toc201573644" w:history="1">
             <w:r>
               <w:rPr>
                 <w:rStyle w:val="Hyperlink"/>
@@ -967,7 +972,7 @@
                 <w:noProof/>
                 <w:webHidden/>
               </w:rPr>
-              <w:instrText xml:space="preserve"> PAGEREF _Toc201536866 \h </w:instrText>
+              <w:instrText xml:space="preserve"> PAGEREF _Toc201573644 \h </w:instrText>
             </w:r>
             <w:r>
               <w:rPr>
@@ -1013,7 +1018,7 @@
               <w14:ligatures w14:val="standardContextual"/>
             </w:rPr>
           </w:pPr>
-          <w:hyperlink w:anchor="_Toc201536867" w:history="1">
+          <w:hyperlink w:anchor="_Toc201573645" w:history="1">
             <w:r>
               <w:rPr>
                 <w:rStyle w:val="Hyperlink"/>
@@ -1040,7 +1045,7 @@
                 <w:noProof/>
                 <w:webHidden/>
               </w:rPr>
-              <w:instrText xml:space="preserve"> PAGEREF _Toc201536867 \h </w:instrText>
+              <w:instrText xml:space="preserve"> PAGEREF _Toc201573645 \h </w:instrText>
             </w:r>
             <w:r>
               <w:rPr>
@@ -1086,7 +1091,7 @@
               <w14:ligatures w14:val="standardContextual"/>
             </w:rPr>
           </w:pPr>
-          <w:hyperlink w:anchor="_Toc201536868" w:history="1">
+          <w:hyperlink w:anchor="_Toc201573646" w:history="1">
             <w:r>
               <w:rPr>
                 <w:rStyle w:val="Hyperlink"/>
@@ -1113,7 +1118,7 @@
                 <w:noProof/>
                 <w:webHidden/>
               </w:rPr>
-              <w:instrText xml:space="preserve"> PAGEREF _Toc201536868 \h </w:instrText>
+              <w:instrText xml:space="preserve"> PAGEREF _Toc201573646 \h </w:instrText>
             </w:r>
             <w:r>
               <w:rPr>
@@ -1159,7 +1164,7 @@
               <w14:ligatures w14:val="standardContextual"/>
             </w:rPr>
           </w:pPr>
-          <w:hyperlink w:anchor="_Toc201536869" w:history="1">
+          <w:hyperlink w:anchor="_Toc201573647" w:history="1">
             <w:r>
               <w:rPr>
                 <w:rStyle w:val="Hyperlink"/>
@@ -1186,7 +1191,7 @@
                 <w:noProof/>
                 <w:webHidden/>
               </w:rPr>
-              <w:instrText xml:space="preserve"> PAGEREF _Toc201536869 \h </w:instrText>
+              <w:instrText xml:space="preserve"> PAGEREF _Toc201573647 \h </w:instrText>
             </w:r>
             <w:r>
               <w:rPr>
@@ -1232,7 +1237,7 @@
               <w14:ligatures w14:val="standardContextual"/>
             </w:rPr>
           </w:pPr>
-          <w:hyperlink w:anchor="_Toc201536870" w:history="1">
+          <w:hyperlink w:anchor="_Toc201573648" w:history="1">
             <w:r>
               <w:rPr>
                 <w:rStyle w:val="Hyperlink"/>
@@ -1259,7 +1264,7 @@
                 <w:noProof/>
                 <w:webHidden/>
               </w:rPr>
-              <w:instrText xml:space="preserve"> PAGEREF _Toc201536870 \h </w:instrText>
+              <w:instrText xml:space="preserve"> PAGEREF _Toc201573648 \h </w:instrText>
             </w:r>
             <w:r>
               <w:rPr>
@@ -1305,7 +1310,7 @@
               <w14:ligatures w14:val="standardContextual"/>
             </w:rPr>
           </w:pPr>
-          <w:hyperlink w:anchor="_Toc201536871" w:history="1">
+          <w:hyperlink w:anchor="_Toc201573649" w:history="1">
             <w:r>
               <w:rPr>
                 <w:rStyle w:val="Hyperlink"/>
@@ -1332,7 +1337,7 @@
                 <w:noProof/>
                 <w:webHidden/>
               </w:rPr>
-              <w:instrText xml:space="preserve"> PAGEREF _Toc201536871 \h </w:instrText>
+              <w:instrText xml:space="preserve"> PAGEREF _Toc201573649 \h </w:instrText>
             </w:r>
             <w:r>
               <w:rPr>
@@ -1378,7 +1383,7 @@
               <w14:ligatures w14:val="standardContextual"/>
             </w:rPr>
           </w:pPr>
-          <w:hyperlink w:anchor="_Toc201536872" w:history="1">
+          <w:hyperlink w:anchor="_Toc201573650" w:history="1">
             <w:r>
               <w:rPr>
                 <w:rStyle w:val="Hyperlink"/>
@@ -1405,7 +1410,7 @@
                 <w:noProof/>
                 <w:webHidden/>
               </w:rPr>
-              <w:instrText xml:space="preserve"> PAGEREF _Toc201536872 \h </w:instrText>
+              <w:instrText xml:space="preserve"> PAGEREF _Toc201573650 \h </w:instrText>
             </w:r>
             <w:r>
               <w:rPr>
@@ -1451,7 +1456,7 @@
               <w14:ligatures w14:val="standardContextual"/>
             </w:rPr>
           </w:pPr>
-          <w:hyperlink w:anchor="_Toc201536873" w:history="1">
+          <w:hyperlink w:anchor="_Toc201573651" w:history="1">
             <w:r>
               <w:rPr>
                 <w:rStyle w:val="Hyperlink"/>
@@ -1478,7 +1483,7 @@
                 <w:noProof/>
                 <w:webHidden/>
               </w:rPr>
-              <w:instrText xml:space="preserve"> PAGEREF _Toc201536873 \h </w:instrText>
+              <w:instrText xml:space="preserve"> PAGEREF _Toc201573651 \h </w:instrText>
             </w:r>
             <w:r>
               <w:rPr>
@@ -1524,7 +1529,7 @@
               <w14:ligatures w14:val="standardContextual"/>
             </w:rPr>
           </w:pPr>
-          <w:hyperlink w:anchor="_Toc201536874" w:history="1">
+          <w:hyperlink w:anchor="_Toc201573652" w:history="1">
             <w:r>
               <w:rPr>
                 <w:rStyle w:val="Hyperlink"/>
@@ -1551,7 +1556,7 @@
                 <w:noProof/>
                 <w:webHidden/>
               </w:rPr>
-              <w:instrText xml:space="preserve"> PAGEREF _Toc201536874 \h </w:instrText>
+              <w:instrText xml:space="preserve"> PAGEREF _Toc201573652 \h </w:instrText>
             </w:r>
             <w:r>
               <w:rPr>
@@ -1597,7 +1602,7 @@
               <w14:ligatures w14:val="standardContextual"/>
             </w:rPr>
           </w:pPr>
-          <w:hyperlink w:anchor="_Toc201536875" w:history="1">
+          <w:hyperlink w:anchor="_Toc201573653" w:history="1">
             <w:r>
               <w:rPr>
                 <w:rStyle w:val="Hyperlink"/>
@@ -1624,7 +1629,7 @@
                 <w:noProof/>
                 <w:webHidden/>
               </w:rPr>
-              <w:instrText xml:space="preserve"> PAGEREF _Toc201536875 \h </w:instrText>
+              <w:instrText xml:space="preserve"> PAGEREF _Toc201573653 \h </w:instrText>
             </w:r>
             <w:r>
               <w:rPr>
@@ -1670,7 +1675,7 @@
               <w14:ligatures w14:val="standardContextual"/>
             </w:rPr>
           </w:pPr>
-          <w:hyperlink w:anchor="_Toc201536876" w:history="1">
+          <w:hyperlink w:anchor="_Toc201573654" w:history="1">
             <w:r>
               <w:rPr>
                 <w:rStyle w:val="Hyperlink"/>
@@ -1697,7 +1702,7 @@
                 <w:noProof/>
                 <w:webHidden/>
               </w:rPr>
-              <w:instrText xml:space="preserve"> PAGEREF _Toc201536876 \h </w:instrText>
+              <w:instrText xml:space="preserve"> PAGEREF _Toc201573654 \h </w:instrText>
             </w:r>
             <w:r>
               <w:rPr>
@@ -1743,13 +1748,13 @@
               <w14:ligatures w14:val="standardContextual"/>
             </w:rPr>
           </w:pPr>
-          <w:hyperlink w:anchor="_Toc201536877" w:history="1">
+          <w:hyperlink w:anchor="_Toc201573655" w:history="1">
             <w:r>
               <w:rPr>
                 <w:rStyle w:val="Hyperlink"/>
                 <w:noProof/>
               </w:rPr>
-              <w:t>Additional Enhancements to current dashboard</w:t>
+              <w:t>Planned UI enhancements</w:t>
             </w:r>
             <w:r>
               <w:rPr>
@@ -1770,7 +1775,7 @@
                 <w:noProof/>
                 <w:webHidden/>
               </w:rPr>
-              <w:instrText xml:space="preserve"> PAGEREF _Toc201536877 \h </w:instrText>
+              <w:instrText xml:space="preserve"> PAGEREF _Toc201573655 \h </w:instrText>
             </w:r>
             <w:r>
               <w:rPr>
@@ -1822,7 +1827,7 @@
       <w:pPr>
         <w:pStyle w:val="Heading1"/>
       </w:pPr>
-      <w:bookmarkStart w:id="0" w:name="_Toc201536854"/>
+      <w:bookmarkStart w:id="0" w:name="_Toc201573632"/>
       <w:r>
         <w:lastRenderedPageBreak/>
         <w:t>Project Overview</w:t>
@@ -1831,7 +1836,39 @@
     </w:p>
     <w:p>
       <w:r>
-        <w:t>This project sets up an end-to-end open-source data and analytics pipeline for HeyMax with an interactive analytics dashboard built using Streamlit, DuckDB, and dbt to analyze user lifecycle metrics over time. It supports monthly, weekly, and daily views with charts, retention triangle tables, KPIs, filters, and LLM-based insights.</w:t>
+        <w:t xml:space="preserve">This project sets up an end-to-end open-source data and analytics pipeline for </w:t>
+      </w:r>
+      <w:proofErr w:type="spellStart"/>
+      <w:r>
+        <w:t>HeyMax</w:t>
+      </w:r>
+      <w:proofErr w:type="spellEnd"/>
+      <w:r>
+        <w:t xml:space="preserve"> with an interactive analytics dashboard built using </w:t>
+      </w:r>
+      <w:proofErr w:type="spellStart"/>
+      <w:r>
+        <w:t>Streamlit</w:t>
+      </w:r>
+      <w:proofErr w:type="spellEnd"/>
+      <w:r>
+        <w:t xml:space="preserve">, </w:t>
+      </w:r>
+      <w:proofErr w:type="spellStart"/>
+      <w:r>
+        <w:t>DuckDB</w:t>
+      </w:r>
+      <w:proofErr w:type="spellEnd"/>
+      <w:r>
+        <w:t xml:space="preserve">, and </w:t>
+      </w:r>
+      <w:proofErr w:type="spellStart"/>
+      <w:r>
+        <w:t>dbt</w:t>
+      </w:r>
+      <w:proofErr w:type="spellEnd"/>
+      <w:r>
+        <w:t xml:space="preserve"> to analyze user lifecycle metrics over time. It supports monthly, weekly, and daily views with charts, retention triangle tables, KPIs, filters, and LLM-based insights.</w:t>
       </w:r>
     </w:p>
     <w:p>
@@ -1851,7 +1888,7 @@
       <w:pPr>
         <w:pStyle w:val="Heading1"/>
       </w:pPr>
-      <w:bookmarkStart w:id="1" w:name="_Toc201536855"/>
+      <w:bookmarkStart w:id="1" w:name="_Toc201573633"/>
       <w:r>
         <w:t>Features</w:t>
       </w:r>
@@ -1940,7 +1977,15 @@
         <w:ind w:left="720"/>
       </w:pPr>
       <w:r>
-        <w:t>💬 Ask your data (powered by OpenAI’s GPT-4)</w:t>
+        <w:t xml:space="preserve">💬 Ask your data (powered by </w:t>
+      </w:r>
+      <w:proofErr w:type="spellStart"/>
+      <w:r>
+        <w:t>OpenAI’s</w:t>
+      </w:r>
+      <w:proofErr w:type="spellEnd"/>
+      <w:r>
+        <w:t xml:space="preserve"> GPT-4)</w:t>
       </w:r>
     </w:p>
     <w:p>
@@ -1960,7 +2005,7 @@
       <w:pPr>
         <w:pStyle w:val="Heading1"/>
       </w:pPr>
-      <w:bookmarkStart w:id="2" w:name="_Toc201536856"/>
+      <w:bookmarkStart w:id="2" w:name="_Toc201573634"/>
       <w:r>
         <w:t>Setup</w:t>
       </w:r>
@@ -1972,14 +2017,45 @@
       </w:r>
     </w:p>
     <w:p>
-      <w:hyperlink r:id="rId7" w:history="1">
-        <w:r>
-          <w:rPr>
-            <w:rStyle w:val="Hyperlink"/>
-          </w:rPr>
-          <w:t>https://github.com/SANCHIT-GARG/heymax-analytics/blob/main/README.md</w:t>
-        </w:r>
-      </w:hyperlink>
+      <w:pPr>
+        <w:rPr>
+          <w:color w:val="0000FF" w:themeColor="hyperlink"/>
+          <w:u w:val="single"/>
+        </w:rPr>
+      </w:pPr>
+      <w:r>
+        <w:fldChar w:fldCharType="begin"/>
+      </w:r>
+      <w:r>
+        <w:instrText>HYPERLINK "https://github.com/SANCHIT-GARG/heymax-analytics/blob/main/README.md"</w:instrText>
+      </w:r>
+      <w:r>
+        <w:fldChar w:fldCharType="separate"/>
+      </w:r>
+      <w:r>
+        <w:rPr>
+          <w:rStyle w:val="Hyperlink"/>
+        </w:rPr>
+        <w:t>https://github.com/SANCHIT-GARG/heymax-analytics/blo</w:t>
+      </w:r>
+      <w:r>
+        <w:rPr>
+          <w:rStyle w:val="Hyperlink"/>
+        </w:rPr>
+        <w:t>b</w:t>
+      </w:r>
+      <w:r>
+        <w:rPr>
+          <w:rStyle w:val="Hyperlink"/>
+        </w:rPr>
+        <w:t>/main/README.md</w:t>
+      </w:r>
+      <w:r>
+        <w:rPr>
+          <w:rStyle w:val="Hyperlink"/>
+        </w:rPr>
+        <w:fldChar w:fldCharType="end"/>
+      </w:r>
       <w:r>
         <w:br/>
       </w:r>
@@ -1988,7 +2064,7 @@
       <w:pPr>
         <w:pStyle w:val="Heading1"/>
       </w:pPr>
-      <w:bookmarkStart w:id="3" w:name="_Toc201536857"/>
+      <w:bookmarkStart w:id="3" w:name="_Toc201573635"/>
       <w:r>
         <w:t>About the Data</w:t>
       </w:r>
@@ -2003,8 +2079,13 @@
         </w:tabs>
         <w:ind w:left="720"/>
       </w:pPr>
-      <w:r>
-        <w:t>event_time: timestamp, needs to be truncated to month</w:t>
+      <w:proofErr w:type="spellStart"/>
+      <w:r>
+        <w:t>event_time</w:t>
+      </w:r>
+      <w:proofErr w:type="spellEnd"/>
+      <w:r>
+        <w:t>: timestamp, needs to be truncated to month</w:t>
       </w:r>
     </w:p>
     <w:p>
@@ -2016,8 +2097,13 @@
         </w:tabs>
         <w:ind w:left="720"/>
       </w:pPr>
-      <w:r>
-        <w:t>user_id: string, uniquely identifies user</w:t>
+      <w:proofErr w:type="spellStart"/>
+      <w:r>
+        <w:t>user_id</w:t>
+      </w:r>
+      <w:proofErr w:type="spellEnd"/>
+      <w:r>
+        <w:t>: string, uniquely identifies user</w:t>
       </w:r>
     </w:p>
     <w:p>
@@ -2029,8 +2115,29 @@
         </w:tabs>
         <w:ind w:left="720"/>
       </w:pPr>
-      <w:r>
-        <w:t>event_type: e.g., miles_earned, miles_redeemed, share</w:t>
+      <w:proofErr w:type="spellStart"/>
+      <w:r>
+        <w:t>event_type</w:t>
+      </w:r>
+      <w:proofErr w:type="spellEnd"/>
+      <w:r>
+        <w:t xml:space="preserve">: e.g., </w:t>
+      </w:r>
+      <w:proofErr w:type="spellStart"/>
+      <w:r>
+        <w:t>miles_earned</w:t>
+      </w:r>
+      <w:proofErr w:type="spellEnd"/>
+      <w:r>
+        <w:t xml:space="preserve">, </w:t>
+      </w:r>
+      <w:proofErr w:type="spellStart"/>
+      <w:r>
+        <w:t>miles_redeemed</w:t>
+      </w:r>
+      <w:proofErr w:type="spellEnd"/>
+      <w:r>
+        <w:t>, share</w:t>
       </w:r>
     </w:p>
     <w:p>
@@ -2042,8 +2149,13 @@
         </w:tabs>
         <w:ind w:left="720"/>
       </w:pPr>
-      <w:r>
-        <w:t>transaction_category: dining, ecommerce, flight, etc.</w:t>
+      <w:proofErr w:type="spellStart"/>
+      <w:r>
+        <w:t>transaction_category</w:t>
+      </w:r>
+      <w:proofErr w:type="spellEnd"/>
+      <w:r>
+        <w:t>: dining, ecommerce, flight, etc.</w:t>
       </w:r>
     </w:p>
     <w:p>
@@ -2055,8 +2167,21 @@
         </w:tabs>
         <w:ind w:left="720"/>
       </w:pPr>
-      <w:r>
-        <w:t>miles_amount: some events may not have this (e.g. share)</w:t>
+      <w:proofErr w:type="spellStart"/>
+      <w:r>
+        <w:t>miles_amount</w:t>
+      </w:r>
+      <w:proofErr w:type="spellEnd"/>
+      <w:r>
+        <w:t>: some events may not have this (</w:t>
+      </w:r>
+      <w:proofErr w:type="gramStart"/>
+      <w:r>
+        <w:t>e.g.</w:t>
+      </w:r>
+      <w:proofErr w:type="gramEnd"/>
+      <w:r>
+        <w:t xml:space="preserve"> share)</w:t>
       </w:r>
     </w:p>
     <w:p>
@@ -2069,14 +2194,22 @@
         <w:ind w:left="720"/>
       </w:pPr>
       <w:r>
-        <w:t>platform, utm_source, country: standard metadata fields</w:t>
+        <w:t xml:space="preserve">platform, </w:t>
+      </w:r>
+      <w:proofErr w:type="spellStart"/>
+      <w:r>
+        <w:t>utm_source</w:t>
+      </w:r>
+      <w:proofErr w:type="spellEnd"/>
+      <w:r>
+        <w:t>, country: standard metadata fields</w:t>
       </w:r>
     </w:p>
     <w:p>
       <w:pPr>
         <w:pStyle w:val="Heading1"/>
       </w:pPr>
-      <w:bookmarkStart w:id="4" w:name="_Toc201536858"/>
+      <w:bookmarkStart w:id="4" w:name="_Toc201573636"/>
       <w:r>
         <w:t>Technology Stack</w:t>
       </w:r>
@@ -2086,7 +2219,7 @@
       <w:pPr>
         <w:pStyle w:val="Heading2"/>
       </w:pPr>
-      <w:bookmarkStart w:id="5" w:name="_Toc201536859"/>
+      <w:bookmarkStart w:id="5" w:name="_Toc201573637"/>
       <w:r>
         <w:t>DBT</w:t>
       </w:r>
@@ -2103,34 +2236,58 @@
         </w:rPr>
         <w:t>‘</w:t>
       </w:r>
+      <w:proofErr w:type="spellStart"/>
       <w:r>
         <w:rPr>
           <w:b/>
           <w:bCs/>
         </w:rPr>
-        <w:t>dbt docs generate</w:t>
+        <w:t>dbt</w:t>
+      </w:r>
+      <w:proofErr w:type="spellEnd"/>
+      <w:r>
+        <w:rPr>
+          <w:b/>
+          <w:bCs/>
+        </w:rPr>
+        <w:t xml:space="preserve"> docs generate</w:t>
       </w:r>
       <w:r>
         <w:t>’</w:t>
       </w:r>
       <w:r>
-        <w:t xml:space="preserve"> to view model docs. Parquet storage, partitioning, and sort keys improve performance in DuckDB.</w:t>
+        <w:t xml:space="preserve"> to view model docs. Parquet storage, partitioning, and sort keys improve performance in </w:t>
+      </w:r>
+      <w:proofErr w:type="spellStart"/>
+      <w:r>
+        <w:t>DuckDB</w:t>
+      </w:r>
+      <w:proofErr w:type="spellEnd"/>
+      <w:r>
+        <w:t>.</w:t>
       </w:r>
     </w:p>
     <w:p>
       <w:pPr>
         <w:pStyle w:val="Heading2"/>
       </w:pPr>
-      <w:bookmarkStart w:id="6" w:name="_Toc201536860"/>
+      <w:bookmarkStart w:id="6" w:name="_Toc201573638"/>
+      <w:proofErr w:type="spellStart"/>
       <w:r>
         <w:lastRenderedPageBreak/>
         <w:t>DuckDB</w:t>
       </w:r>
       <w:bookmarkEnd w:id="6"/>
+      <w:proofErr w:type="spellEnd"/>
     </w:p>
     <w:p>
-      <w:r>
-        <w:t>DuckDB is an OLAP SQL engine ideal for analytical queries. It supports in-memory operations, Parquet IO, and integrates with cloud environments. Query via CLI (</w:t>
+      <w:proofErr w:type="spellStart"/>
+      <w:r>
+        <w:t>DuckDB</w:t>
+      </w:r>
+      <w:proofErr w:type="spellEnd"/>
+      <w:r>
+        <w:t xml:space="preserve"> is an OLAP SQL engine ideal for analytical queries. It supports in-memory operations, Parquet IO, and integrates with cloud environments. Query via CLI (</w:t>
       </w:r>
       <w:r>
         <w:rPr>
@@ -2139,19 +2296,44 @@
         </w:rPr>
         <w:t>‘</w:t>
       </w:r>
+      <w:proofErr w:type="spellStart"/>
       <w:r>
         <w:rPr>
           <w:b/>
           <w:bCs/>
         </w:rPr>
-        <w:t>duckdb -u</w:t>
-      </w:r>
+        <w:t>duckdb</w:t>
+      </w:r>
+      <w:proofErr w:type="spellEnd"/>
       <w:r>
         <w:rPr>
           <w:b/>
           <w:bCs/>
         </w:rPr>
-        <w:t>i’</w:t>
+        <w:t xml:space="preserve"> -</w:t>
+      </w:r>
+      <w:proofErr w:type="spellStart"/>
+      <w:r>
+        <w:rPr>
+          <w:b/>
+          <w:bCs/>
+        </w:rPr>
+        <w:t>u</w:t>
+      </w:r>
+      <w:r>
+        <w:rPr>
+          <w:b/>
+          <w:bCs/>
+        </w:rPr>
+        <w:t>i</w:t>
+      </w:r>
+      <w:proofErr w:type="spellEnd"/>
+      <w:r>
+        <w:rPr>
+          <w:b/>
+          <w:bCs/>
+        </w:rPr>
+        <w:t>’</w:t>
       </w:r>
       <w:r>
         <w:t>) or embed in Python.</w:t>
@@ -2161,22 +2343,37 @@
       <w:pPr>
         <w:pStyle w:val="Heading2"/>
       </w:pPr>
-      <w:bookmarkStart w:id="7" w:name="_Toc201536861"/>
+      <w:bookmarkStart w:id="7" w:name="_Toc201573639"/>
+      <w:proofErr w:type="spellStart"/>
       <w:r>
         <w:t>Streamlit</w:t>
       </w:r>
       <w:bookmarkEnd w:id="7"/>
+      <w:proofErr w:type="spellEnd"/>
     </w:p>
     <w:p>
-      <w:r>
-        <w:t>Streamlit builds interactive Python dashboards rapidly. It supports Python-native components, real-time reactivity, and deploys easily on Streamlit Cloud.</w:t>
+      <w:proofErr w:type="spellStart"/>
+      <w:r>
+        <w:t>Streamlit</w:t>
+      </w:r>
+      <w:proofErr w:type="spellEnd"/>
+      <w:r>
+        <w:t xml:space="preserve"> builds interactive Python dashboards rapidly. It supports Python-native components, real-time reactivity, and deploys easily on </w:t>
+      </w:r>
+      <w:proofErr w:type="spellStart"/>
+      <w:r>
+        <w:t>Streamlit</w:t>
+      </w:r>
+      <w:proofErr w:type="spellEnd"/>
+      <w:r>
+        <w:t xml:space="preserve"> Cloud.</w:t>
       </w:r>
     </w:p>
     <w:p>
       <w:pPr>
         <w:pStyle w:val="Heading2"/>
       </w:pPr>
-      <w:bookmarkStart w:id="8" w:name="_Toc201536862"/>
+      <w:bookmarkStart w:id="8" w:name="_Toc201573640"/>
       <w:r>
         <w:t>GitHub Deployment</w:t>
       </w:r>
@@ -2191,7 +2388,23 @@
         </w:numPr>
       </w:pPr>
       <w:r>
-        <w:t>CI: Executes dbt runs/tests on every commit, emails logs, updates DuckDB, and runs daily at 8am.</w:t>
+        <w:t xml:space="preserve">CI: Executes </w:t>
+      </w:r>
+      <w:proofErr w:type="spellStart"/>
+      <w:r>
+        <w:t>dbt</w:t>
+      </w:r>
+      <w:proofErr w:type="spellEnd"/>
+      <w:r>
+        <w:t xml:space="preserve"> runs/tests on every commit, emails logs, updates </w:t>
+      </w:r>
+      <w:proofErr w:type="spellStart"/>
+      <w:r>
+        <w:t>DuckDB</w:t>
+      </w:r>
+      <w:proofErr w:type="spellEnd"/>
+      <w:r>
+        <w:t>, and runs daily at 8am.</w:t>
       </w:r>
       <w:r>
         <w:t xml:space="preserve"> (the runs can be configured based on the requirements)</w:t>
@@ -2206,14 +2419,22 @@
         </w:numPr>
       </w:pPr>
       <w:r>
-        <w:t>CD: Uses Streamlit Cloud linked to the repo for zero-touch deployments.</w:t>
+        <w:t xml:space="preserve">CD: Uses </w:t>
+      </w:r>
+      <w:proofErr w:type="spellStart"/>
+      <w:r>
+        <w:t>Streamlit</w:t>
+      </w:r>
+      <w:proofErr w:type="spellEnd"/>
+      <w:r>
+        <w:t xml:space="preserve"> Cloud linked to the repo for zero-touch deployments.</w:t>
       </w:r>
     </w:p>
     <w:p>
       <w:pPr>
         <w:pStyle w:val="Heading1"/>
       </w:pPr>
-      <w:bookmarkStart w:id="9" w:name="_Toc201536863"/>
+      <w:bookmarkStart w:id="9" w:name="_Toc201573641"/>
       <w:r>
         <w:t>Design Considerations</w:t>
       </w:r>
@@ -2223,7 +2444,7 @@
       <w:pPr>
         <w:pStyle w:val="Heading2"/>
       </w:pPr>
-      <w:bookmarkStart w:id="10" w:name="_Toc201536864"/>
+      <w:bookmarkStart w:id="10" w:name="_Toc201573642"/>
       <w:r>
         <w:t>1. Data Modeling and Transformation Logic</w:t>
       </w:r>
@@ -2231,14 +2452,54 @@
     </w:p>
     <w:p>
       <w:r>
-        <w:t>Raw events are loaded from CSV and staged via `stg_raw_events`. Business logic lives in intermediate models like `dim_users`, `fct_events`, and `user_lifecycle_*`, leveraging incremental materialization and delete+insert logic. Partitioning and sort keys enhance query speed.</w:t>
+        <w:t>Raw events are loaded from CSV and staged via `</w:t>
+      </w:r>
+      <w:proofErr w:type="spellStart"/>
+      <w:r>
+        <w:t>stg_raw_events</w:t>
+      </w:r>
+      <w:proofErr w:type="spellEnd"/>
+      <w:r>
+        <w:t>`. Business logic lives in intermediate models like `</w:t>
+      </w:r>
+      <w:proofErr w:type="spellStart"/>
+      <w:r>
+        <w:t>dim_users</w:t>
+      </w:r>
+      <w:proofErr w:type="spellEnd"/>
+      <w:r>
+        <w:t>`, `</w:t>
+      </w:r>
+      <w:proofErr w:type="spellStart"/>
+      <w:r>
+        <w:t>fct_events</w:t>
+      </w:r>
+      <w:proofErr w:type="spellEnd"/>
+      <w:r>
+        <w:t>`, and `</w:t>
+      </w:r>
+      <w:proofErr w:type="spellStart"/>
+      <w:r>
+        <w:t>user_lifecycle</w:t>
+      </w:r>
+      <w:proofErr w:type="spellEnd"/>
+      <w:r>
+        <w:t xml:space="preserve">_*`, leveraging incremental materialization and </w:t>
+      </w:r>
+      <w:proofErr w:type="spellStart"/>
+      <w:r>
+        <w:t>delete+insert</w:t>
+      </w:r>
+      <w:proofErr w:type="spellEnd"/>
+      <w:r>
+        <w:t xml:space="preserve"> logic. Partitioning and sort keys enhance query speed.</w:t>
       </w:r>
     </w:p>
     <w:p>
       <w:pPr>
         <w:pStyle w:val="Heading2"/>
       </w:pPr>
-      <w:bookmarkStart w:id="11" w:name="_Toc201536865"/>
+      <w:bookmarkStart w:id="11" w:name="_Toc201573643"/>
       <w:r>
         <w:t>2. Dashboard Design and Metric Clarity</w:t>
       </w:r>
@@ -2253,7 +2514,7 @@
       <w:pPr>
         <w:pStyle w:val="Heading2"/>
       </w:pPr>
-      <w:bookmarkStart w:id="12" w:name="_Toc201536866"/>
+      <w:bookmarkStart w:id="12" w:name="_Toc201573644"/>
       <w:r>
         <w:t>3. Code Readability, Structure, and Documentation</w:t>
       </w:r>
@@ -2261,41 +2522,83 @@
     </w:p>
     <w:p>
       <w:r>
-        <w:t>SQL follows layered foldering (staging, intermediate, growth). Python code is modular with tabs. Metadata is defined via `schema.yml`. CI/CD pipelines auto-generate docs and enforce quality.</w:t>
+        <w:t xml:space="preserve">SQL follows layered </w:t>
+      </w:r>
+      <w:proofErr w:type="spellStart"/>
+      <w:r>
+        <w:t>foldering</w:t>
+      </w:r>
+      <w:proofErr w:type="spellEnd"/>
+      <w:r>
+        <w:t xml:space="preserve"> (staging, intermediate, growth). Python code is modular with tabs. Metadata is defined via `</w:t>
+      </w:r>
+      <w:proofErr w:type="spellStart"/>
+      <w:r>
+        <w:t>schema.yml</w:t>
+      </w:r>
+      <w:proofErr w:type="spellEnd"/>
+      <w:r>
+        <w:t>`. CI/CD pipelines auto-generate docs and enforce quality.</w:t>
       </w:r>
     </w:p>
     <w:p>
       <w:pPr>
         <w:pStyle w:val="Heading2"/>
       </w:pPr>
-      <w:bookmarkStart w:id="13" w:name="_Toc201536867"/>
+      <w:bookmarkStart w:id="13" w:name="_Toc201573645"/>
       <w:r>
         <w:t>4. Design Tradeoffs, Testing, and Scaling Strategy</w:t>
       </w:r>
       <w:bookmarkEnd w:id="13"/>
     </w:p>
     <w:p>
-      <w:r>
-        <w:t>DuckDB offers blazing speed for local analytics but isn't built for high-concurrency</w:t>
-      </w:r>
-      <w:r>
-        <w:t xml:space="preserve"> and access based control</w:t>
+      <w:proofErr w:type="spellStart"/>
+      <w:r>
+        <w:t>DuckDB</w:t>
+      </w:r>
+      <w:proofErr w:type="spellEnd"/>
+      <w:r>
+        <w:t xml:space="preserve"> offers blazing speed for local analytics but isn't built for high-concurrency</w:t>
+      </w:r>
+      <w:r>
+        <w:t xml:space="preserve"> and </w:t>
+      </w:r>
+      <w:proofErr w:type="gramStart"/>
+      <w:r>
+        <w:t>access based</w:t>
+      </w:r>
+      <w:proofErr w:type="gramEnd"/>
+      <w:r>
+        <w:t xml:space="preserve"> control</w:t>
       </w:r>
       <w:r>
         <w:t xml:space="preserve">. </w:t>
       </w:r>
+      <w:proofErr w:type="spellStart"/>
       <w:r>
         <w:t>D</w:t>
       </w:r>
       <w:r>
-        <w:t>bt tests ensure data quality. The modular structure supports easy migration to BigQuery or Snowflake.</w:t>
+        <w:t>bt</w:t>
+      </w:r>
+      <w:proofErr w:type="spellEnd"/>
+      <w:r>
+        <w:t xml:space="preserve"> tests ensure data quality. The modular structure supports easy migration to </w:t>
+      </w:r>
+      <w:proofErr w:type="spellStart"/>
+      <w:r>
+        <w:t>BigQuery</w:t>
+      </w:r>
+      <w:proofErr w:type="spellEnd"/>
+      <w:r>
+        <w:t xml:space="preserve"> or Snowflake.</w:t>
       </w:r>
     </w:p>
     <w:p>
       <w:pPr>
         <w:pStyle w:val="Heading1"/>
       </w:pPr>
-      <w:bookmarkStart w:id="14" w:name="_Toc201536868"/>
+      <w:bookmarkStart w:id="14" w:name="_Toc201573646"/>
       <w:r>
         <w:t>DBT Modeling Strategy</w:t>
       </w:r>
@@ -2303,14 +2606,22 @@
     </w:p>
     <w:p>
       <w:r>
-        <w:t>This project uses a layered dbt modeling approach based on the Medallion Architecture. It transforms raw event data into actionable insights across daily, weekly, and monthly levels.</w:t>
+        <w:t xml:space="preserve">This project uses a layered </w:t>
+      </w:r>
+      <w:proofErr w:type="spellStart"/>
+      <w:r>
+        <w:t>dbt</w:t>
+      </w:r>
+      <w:proofErr w:type="spellEnd"/>
+      <w:r>
+        <w:t xml:space="preserve"> modeling approach based on the Medallion Architecture. It transforms raw event data into actionable insights across daily, weekly, and monthly levels.</w:t>
       </w:r>
     </w:p>
     <w:p>
       <w:pPr>
         <w:pStyle w:val="Heading2"/>
       </w:pPr>
-      <w:bookmarkStart w:id="15" w:name="_Toc201536869"/>
+      <w:bookmarkStart w:id="15" w:name="_Toc201573647"/>
       <w:r>
         <w:lastRenderedPageBreak/>
         <w:t>Model Summary</w:t>
@@ -2410,9 +2721,11 @@
             <w:tcW w:w="2235" w:type="dxa"/>
           </w:tcPr>
           <w:p>
+            <w:proofErr w:type="spellStart"/>
             <w:r>
               <w:t>stg_raw_events</w:t>
             </w:r>
+            <w:proofErr w:type="spellEnd"/>
           </w:p>
         </w:tc>
         <w:tc>
@@ -2478,9 +2791,11 @@
             <w:tcW w:w="2235" w:type="dxa"/>
           </w:tcPr>
           <w:p>
+            <w:proofErr w:type="spellStart"/>
             <w:r>
               <w:t>stg_events</w:t>
             </w:r>
+            <w:proofErr w:type="spellEnd"/>
           </w:p>
         </w:tc>
         <w:tc>
@@ -2547,9 +2862,11 @@
             <w:tcW w:w="2235" w:type="dxa"/>
           </w:tcPr>
           <w:p>
+            <w:proofErr w:type="spellStart"/>
             <w:r>
               <w:t>dim_users</w:t>
             </w:r>
+            <w:proofErr w:type="spellEnd"/>
           </w:p>
         </w:tc>
         <w:tc>
@@ -2586,9 +2903,11 @@
             <w:pPr>
               <w:cnfStyle w:val="000000100000" w:firstRow="0" w:lastRow="0" w:firstColumn="0" w:lastColumn="0" w:oddVBand="0" w:evenVBand="0" w:oddHBand="1" w:evenHBand="0" w:firstRowFirstColumn="0" w:firstRowLastColumn="0" w:lastRowFirstColumn="0" w:lastRowLastColumn="0"/>
             </w:pPr>
+            <w:proofErr w:type="spellStart"/>
             <w:r>
               <w:t>delete+insert</w:t>
             </w:r>
+            <w:proofErr w:type="spellEnd"/>
           </w:p>
         </w:tc>
         <w:tc>
@@ -2615,9 +2934,11 @@
             <w:tcW w:w="2235" w:type="dxa"/>
           </w:tcPr>
           <w:p>
+            <w:proofErr w:type="spellStart"/>
             <w:r>
               <w:t>fct_events</w:t>
             </w:r>
+            <w:proofErr w:type="spellEnd"/>
           </w:p>
         </w:tc>
         <w:tc>
@@ -2654,9 +2975,11 @@
             <w:pPr>
               <w:cnfStyle w:val="000000000000" w:firstRow="0" w:lastRow="0" w:firstColumn="0" w:lastColumn="0" w:oddVBand="0" w:evenVBand="0" w:oddHBand="0" w:evenHBand="0" w:firstRowFirstColumn="0" w:firstRowLastColumn="0" w:lastRowFirstColumn="0" w:lastRowLastColumn="0"/>
             </w:pPr>
+            <w:proofErr w:type="spellStart"/>
             <w:r>
               <w:t>delete+insert</w:t>
             </w:r>
+            <w:proofErr w:type="spellEnd"/>
           </w:p>
         </w:tc>
         <w:tc>
@@ -2684,8 +3007,13 @@
             <w:tcW w:w="2235" w:type="dxa"/>
           </w:tcPr>
           <w:p>
-            <w:r>
-              <w:t>user_lifecycle_*</w:t>
+            <w:proofErr w:type="spellStart"/>
+            <w:r>
+              <w:t>user_lifecycle</w:t>
+            </w:r>
+            <w:proofErr w:type="spellEnd"/>
+            <w:r>
+              <w:t>_*</w:t>
             </w:r>
           </w:p>
         </w:tc>
@@ -2723,9 +3051,11 @@
             <w:pPr>
               <w:cnfStyle w:val="000000100000" w:firstRow="0" w:lastRow="0" w:firstColumn="0" w:lastColumn="0" w:oddVBand="0" w:evenVBand="0" w:oddHBand="1" w:evenHBand="0" w:firstRowFirstColumn="0" w:firstRowLastColumn="0" w:lastRowFirstColumn="0" w:lastRowLastColumn="0"/>
             </w:pPr>
+            <w:proofErr w:type="spellStart"/>
             <w:r>
               <w:t>delete+insert</w:t>
             </w:r>
+            <w:proofErr w:type="spellEnd"/>
           </w:p>
         </w:tc>
         <w:tc>
@@ -2752,8 +3082,13 @@
             <w:tcW w:w="2235" w:type="dxa"/>
           </w:tcPr>
           <w:p>
-            <w:r>
-              <w:t>growth_metrics_*</w:t>
+            <w:proofErr w:type="spellStart"/>
+            <w:r>
+              <w:t>growth_metrics</w:t>
+            </w:r>
+            <w:proofErr w:type="spellEnd"/>
+            <w:r>
+              <w:t>_*</w:t>
             </w:r>
           </w:p>
         </w:tc>
@@ -2821,8 +3156,13 @@
             <w:tcW w:w="2235" w:type="dxa"/>
           </w:tcPr>
           <w:p>
-            <w:r>
-              <w:t>retention_triangle_*</w:t>
+            <w:proofErr w:type="spellStart"/>
+            <w:r>
+              <w:t>retention_triangle</w:t>
+            </w:r>
+            <w:proofErr w:type="spellEnd"/>
+            <w:r>
+              <w:t>_*</w:t>
             </w:r>
           </w:p>
         </w:tc>
@@ -2892,7 +3232,7 @@
       <w:pPr>
         <w:pStyle w:val="Heading2"/>
       </w:pPr>
-      <w:bookmarkStart w:id="16" w:name="_Toc201536870"/>
+      <w:bookmarkStart w:id="16" w:name="_Toc201573648"/>
       <w:r>
         <w:t>Layering and Its Benefits</w:t>
       </w:r>
@@ -2900,7 +3240,15 @@
     </w:p>
     <w:p>
       <w:r>
-        <w:t>This dbt project follows the Medallion Architecture:</w:t>
+        <w:t xml:space="preserve">This </w:t>
+      </w:r>
+      <w:proofErr w:type="spellStart"/>
+      <w:r>
+        <w:t>dbt</w:t>
+      </w:r>
+      <w:proofErr w:type="spellEnd"/>
+      <w:r>
+        <w:t xml:space="preserve"> project follows the Medallion Architecture:</w:t>
       </w:r>
     </w:p>
     <w:p>
@@ -2936,8 +3284,21 @@
         </w:numPr>
       </w:pPr>
       <w:r>
-        <w:t>Tables: stg_raw_events, stg_events</w:t>
-      </w:r>
+        <w:t xml:space="preserve">Tables: </w:t>
+      </w:r>
+      <w:proofErr w:type="spellStart"/>
+      <w:r>
+        <w:t>stg_raw_events</w:t>
+      </w:r>
+      <w:proofErr w:type="spellEnd"/>
+      <w:r>
+        <w:t xml:space="preserve">, </w:t>
+      </w:r>
+      <w:proofErr w:type="spellStart"/>
+      <w:r>
+        <w:t>stg_events</w:t>
+      </w:r>
+      <w:proofErr w:type="spellEnd"/>
     </w:p>
     <w:p>
       <w:pPr>
@@ -2960,7 +3321,15 @@
         </w:numPr>
       </w:pPr>
       <w:r>
-        <w:t>Why Tables? DuckDB benefits from persisted Parquet tables for fast reads.</w:t>
+        <w:t xml:space="preserve">Why Tables? </w:t>
+      </w:r>
+      <w:proofErr w:type="spellStart"/>
+      <w:r>
+        <w:t>DuckDB</w:t>
+      </w:r>
+      <w:proofErr w:type="spellEnd"/>
+      <w:r>
+        <w:t xml:space="preserve"> benefits from persisted Parquet tables for fast reads.</w:t>
       </w:r>
     </w:p>
     <w:p>
@@ -2996,7 +3365,31 @@
         </w:numPr>
       </w:pPr>
       <w:r>
-        <w:t>Tables: dim_users, fct_events, user_lifecycle_*</w:t>
+        <w:t xml:space="preserve">Tables: </w:t>
+      </w:r>
+      <w:proofErr w:type="spellStart"/>
+      <w:r>
+        <w:t>dim_users</w:t>
+      </w:r>
+      <w:proofErr w:type="spellEnd"/>
+      <w:r>
+        <w:t xml:space="preserve">, </w:t>
+      </w:r>
+      <w:proofErr w:type="spellStart"/>
+      <w:r>
+        <w:t>fct_events</w:t>
+      </w:r>
+      <w:proofErr w:type="spellEnd"/>
+      <w:r>
+        <w:t xml:space="preserve">, </w:t>
+      </w:r>
+      <w:proofErr w:type="spellStart"/>
+      <w:r>
+        <w:t>user_lifecycle</w:t>
+      </w:r>
+      <w:proofErr w:type="spellEnd"/>
+      <w:r>
+        <w:t>_*</w:t>
       </w:r>
     </w:p>
     <w:p>
@@ -3020,8 +3413,29 @@
         </w:numPr>
       </w:pPr>
       <w:r>
-        <w:t>Why delete+insert? Ensures upserts during recomputation</w:t>
-      </w:r>
+        <w:t xml:space="preserve">Why </w:t>
+      </w:r>
+      <w:proofErr w:type="spellStart"/>
+      <w:r>
+        <w:t>delete+insert</w:t>
+      </w:r>
+      <w:proofErr w:type="spellEnd"/>
+      <w:r>
+        <w:t xml:space="preserve">? Ensures </w:t>
+      </w:r>
+      <w:proofErr w:type="spellStart"/>
+      <w:r>
+        <w:t>upserts</w:t>
+      </w:r>
+      <w:proofErr w:type="spellEnd"/>
+      <w:r>
+        <w:t xml:space="preserve"> during </w:t>
+      </w:r>
+      <w:proofErr w:type="spellStart"/>
+      <w:r>
+        <w:t>recomputation</w:t>
+      </w:r>
+      <w:proofErr w:type="spellEnd"/>
     </w:p>
     <w:p>
       <w:pPr>
@@ -3056,7 +3470,23 @@
         </w:numPr>
       </w:pPr>
       <w:r>
-        <w:t>Views: growth_metrics_*, retention_triangle_*</w:t>
+        <w:t xml:space="preserve">Views: </w:t>
+      </w:r>
+      <w:proofErr w:type="spellStart"/>
+      <w:r>
+        <w:t>growth_metrics</w:t>
+      </w:r>
+      <w:proofErr w:type="spellEnd"/>
+      <w:r>
+        <w:t xml:space="preserve">_*, </w:t>
+      </w:r>
+      <w:proofErr w:type="spellStart"/>
+      <w:r>
+        <w:t>retention_triangle</w:t>
+      </w:r>
+      <w:proofErr w:type="spellEnd"/>
+      <w:r>
+        <w:t>_*</w:t>
       </w:r>
     </w:p>
     <w:p>
@@ -3078,7 +3508,7 @@
       <w:pPr>
         <w:pStyle w:val="Heading1"/>
       </w:pPr>
-      <w:bookmarkStart w:id="17" w:name="_Toc201536871"/>
+      <w:bookmarkStart w:id="17" w:name="_Toc201573649"/>
       <w:r>
         <w:lastRenderedPageBreak/>
         <w:t>Analysis and Insights</w:t>
@@ -3089,7 +3519,7 @@
       <w:pPr>
         <w:pStyle w:val="Heading2"/>
       </w:pPr>
-      <w:bookmarkStart w:id="18" w:name="_Toc201536872"/>
+      <w:bookmarkStart w:id="18" w:name="_Toc201573650"/>
       <w:r>
         <w:t>Assumptions</w:t>
       </w:r>
@@ -3116,7 +3546,15 @@
         </w:numPr>
       </w:pPr>
       <w:r>
-        <w:t>Users are uniquely identified by `user_id`.</w:t>
+        <w:t>Users are uniquely identified by `</w:t>
+      </w:r>
+      <w:proofErr w:type="spellStart"/>
+      <w:r>
+        <w:t>user_id</w:t>
+      </w:r>
+      <w:proofErr w:type="spellEnd"/>
+      <w:r>
+        <w:t>`.</w:t>
       </w:r>
     </w:p>
     <w:p>
@@ -3128,10 +3566,15 @@
         </w:numPr>
       </w:pPr>
       <w:r>
-        <w:t>T</w:t>
-      </w:r>
-      <w:r>
-        <w:t>he `event_time` field is the basis for all time-based aggregations (daily/weekly/monthly).</w:t>
+        <w:t>The `</w:t>
+      </w:r>
+      <w:proofErr w:type="spellStart"/>
+      <w:r>
+        <w:t>event_time</w:t>
+      </w:r>
+      <w:proofErr w:type="spellEnd"/>
+      <w:r>
+        <w:t>` field is the basis for all time-based aggregations (daily/weekly/monthly).</w:t>
       </w:r>
     </w:p>
     <w:p>
@@ -3174,7 +3617,7 @@
       <w:pPr>
         <w:pStyle w:val="Heading2"/>
       </w:pPr>
-      <w:bookmarkStart w:id="19" w:name="_Toc201536873"/>
+      <w:bookmarkStart w:id="19" w:name="_Toc201573651"/>
       <w:r>
         <w:t>Metric Definitions</w:t>
       </w:r>
@@ -3213,13 +3656,7 @@
         </w:numPr>
       </w:pPr>
       <w:r>
-        <w:t>Retained User</w:t>
-      </w:r>
-      <w:r>
-        <w:t>s</w:t>
-      </w:r>
-      <w:r>
-        <w:t>: Users active in both the current and previous period.</w:t>
+        <w:t>Retained Users: Users active in both the current and previous period.</w:t>
       </w:r>
     </w:p>
     <w:p>
@@ -3267,20 +3704,14 @@
         </w:numPr>
       </w:pPr>
       <w:r>
-        <w:t>Quick Rati</w:t>
-      </w:r>
-      <w:r>
-        <w:t>o</w:t>
-      </w:r>
-      <w:r>
-        <w:t>: (New + Resurrected) / Churned — indicates growth vs loss balance.</w:t>
+        <w:t>Quick Ratio: (New + Resurrected) / Churned — indicates growth vs loss balance.</w:t>
       </w:r>
     </w:p>
     <w:p>
       <w:pPr>
         <w:pStyle w:val="Heading2"/>
       </w:pPr>
-      <w:bookmarkStart w:id="20" w:name="_Toc201536874"/>
+      <w:bookmarkStart w:id="20" w:name="_Toc201573652"/>
       <w:r>
         <w:t>Insights</w:t>
       </w:r>
@@ -3350,7 +3781,7 @@
       <w:pPr>
         <w:pStyle w:val="Heading2"/>
       </w:pPr>
-      <w:bookmarkStart w:id="21" w:name="_Toc201536875"/>
+      <w:bookmarkStart w:id="21" w:name="_Toc201573653"/>
       <w:r>
         <w:lastRenderedPageBreak/>
         <w:t>Follow-up Questions</w:t>
@@ -3429,7 +3860,7 @@
           <w:rFonts w:ascii="Apple Color Emoji" w:hAnsi="Apple Color Emoji" w:cs="Apple Color Emoji"/>
         </w:rPr>
       </w:pPr>
-      <w:bookmarkStart w:id="22" w:name="_Toc201536876"/>
+      <w:bookmarkStart w:id="22" w:name="_Toc201573654"/>
       <w:r>
         <w:t>Future Enhancements and Scaling Roadmap</w:t>
       </w:r>
@@ -3544,11 +3975,21 @@
             <w:hideMark/>
           </w:tcPr>
           <w:p>
-            <w:r>
-              <w:t xml:space="preserve">Redshift , </w:t>
-            </w:r>
-            <w:r>
-              <w:t>BigQuery, Snowflake, Databricks</w:t>
+            <w:proofErr w:type="gramStart"/>
+            <w:r>
+              <w:t>Redshift ,</w:t>
+            </w:r>
+            <w:proofErr w:type="gramEnd"/>
+            <w:r>
+              <w:t xml:space="preserve"> </w:t>
+            </w:r>
+            <w:proofErr w:type="spellStart"/>
+            <w:r>
+              <w:t>BigQuery</w:t>
+            </w:r>
+            <w:proofErr w:type="spellEnd"/>
+            <w:r>
+              <w:t>, Snowflake, Databricks</w:t>
             </w:r>
           </w:p>
         </w:tc>
@@ -3586,8 +4027,21 @@
           </w:tcPr>
           <w:p>
             <w:r>
-              <w:t>Airflow, dbt Cloud, Dagster</w:t>
-            </w:r>
+              <w:t xml:space="preserve">Airflow, </w:t>
+            </w:r>
+            <w:proofErr w:type="spellStart"/>
+            <w:r>
+              <w:t>dbt</w:t>
+            </w:r>
+            <w:proofErr w:type="spellEnd"/>
+            <w:r>
+              <w:t xml:space="preserve"> Cloud, </w:t>
+            </w:r>
+            <w:proofErr w:type="spellStart"/>
+            <w:r>
+              <w:t>Dagster</w:t>
+            </w:r>
+            <w:proofErr w:type="spellEnd"/>
           </w:p>
         </w:tc>
         <w:tc>
@@ -3597,7 +4051,15 @@
           </w:tcPr>
           <w:p>
             <w:r>
-              <w:t>Automates dbt runs, testing, dependency management, and alerting</w:t>
+              <w:t xml:space="preserve">Automates </w:t>
+            </w:r>
+            <w:proofErr w:type="spellStart"/>
+            <w:r>
+              <w:t>dbt</w:t>
+            </w:r>
+            <w:proofErr w:type="spellEnd"/>
+            <w:r>
+              <w:t xml:space="preserve"> runs, testing, dependency management, and alerting</w:t>
             </w:r>
           </w:p>
         </w:tc>
@@ -3624,8 +4086,13 @@
           </w:tcPr>
           <w:p>
             <w:r>
-              <w:t>Looker, Tableau, Metabase</w:t>
-            </w:r>
+              <w:t xml:space="preserve">Looker, Tableau, </w:t>
+            </w:r>
+            <w:proofErr w:type="spellStart"/>
+            <w:r>
+              <w:t>Metabase</w:t>
+            </w:r>
+            <w:proofErr w:type="spellEnd"/>
           </w:p>
         </w:tc>
         <w:tc>
@@ -3683,18 +4150,9 @@
       <w:pPr>
         <w:pStyle w:val="Heading2"/>
       </w:pPr>
-      <w:bookmarkStart w:id="23" w:name="_Toc201536877"/>
-      <w:r>
-        <w:t>Additional</w:t>
-      </w:r>
-      <w:r>
-        <w:t xml:space="preserve"> </w:t>
-      </w:r>
-      <w:r>
-        <w:t>Enhancements</w:t>
-      </w:r>
-      <w:r>
-        <w:t xml:space="preserve"> to current dashboard</w:t>
+      <w:bookmarkStart w:id="23" w:name="_Toc201573655"/>
+      <w:r>
+        <w:t>Planned UI enhancements</w:t>
       </w:r>
       <w:bookmarkEnd w:id="23"/>
     </w:p>
@@ -3768,10 +4226,23 @@
         <w:t>role-based access and authentication</w:t>
       </w:r>
       <w:r>
-        <w:t xml:space="preserve"> in the Streamlit app using </w:t>
-      </w:r>
-      <w:r>
-        <w:t>streamlit-authenticator</w:t>
+        <w:t xml:space="preserve"> in the </w:t>
+      </w:r>
+      <w:proofErr w:type="spellStart"/>
+      <w:r>
+        <w:t>Streamlit</w:t>
+      </w:r>
+      <w:proofErr w:type="spellEnd"/>
+      <w:r>
+        <w:t xml:space="preserve"> app using </w:t>
+      </w:r>
+      <w:proofErr w:type="spellStart"/>
+      <w:r>
+        <w:t>streamlit</w:t>
+      </w:r>
+      <w:proofErr w:type="spellEnd"/>
+      <w:r>
+        <w:t>-authenticator</w:t>
       </w:r>
     </w:p>
     <w:p>

</xml_diff>

<commit_message>
docs: update README with live dashboard link and improve documentation files
</commit_message>
<xml_diff>
--- a/heymax_documentation/HeyMax_Analytics_Documentation.docx
+++ b/heymax_documentation/HeyMax_Analytics_Documentation.docx
@@ -33,7 +33,10 @@
       </w:sdtPr>
       <w:sdtEndPr>
         <w:rPr>
+          <w:rFonts w:ascii="Times New Roman" w:eastAsia="Times New Roman" w:hAnsi="Times New Roman" w:cs="Times New Roman"/>
           <w:noProof/>
+          <w:sz w:val="24"/>
+          <w:szCs w:val="24"/>
         </w:rPr>
       </w:sdtEndPr>
       <w:sdtContent>
@@ -54,9 +57,6 @@
             <w:rPr>
               <w:noProof/>
               <w:kern w:val="2"/>
-              <w:sz w:val="24"/>
-              <w:szCs w:val="24"/>
-              <w:lang w:val="en-IN" w:eastAsia="en-GB"/>
               <w14:ligatures w14:val="standardContextual"/>
             </w:rPr>
           </w:pPr>
@@ -69,10 +69,11 @@
           <w:r>
             <w:fldChar w:fldCharType="separate"/>
           </w:r>
-          <w:hyperlink w:anchor="_Toc201573632" w:history="1">
+          <w:hyperlink w:anchor="_Toc201584176" w:history="1">
             <w:r>
               <w:rPr>
                 <w:rStyle w:val="Hyperlink"/>
+                <w:rFonts w:eastAsiaTheme="majorEastAsia"/>
                 <w:noProof/>
               </w:rPr>
               <w:t>Project Overview</w:t>
@@ -96,7 +97,7 @@
                 <w:noProof/>
                 <w:webHidden/>
               </w:rPr>
-              <w:instrText xml:space="preserve"> PAGEREF _Toc201573632 \h </w:instrText>
+              <w:instrText xml:space="preserve"> PAGEREF _Toc201584176 \h </w:instrText>
             </w:r>
             <w:r>
               <w:rPr>
@@ -136,16 +137,14 @@
             <w:rPr>
               <w:noProof/>
               <w:kern w:val="2"/>
-              <w:sz w:val="24"/>
-              <w:szCs w:val="24"/>
-              <w:lang w:val="en-IN" w:eastAsia="en-GB"/>
               <w14:ligatures w14:val="standardContextual"/>
             </w:rPr>
           </w:pPr>
-          <w:hyperlink w:anchor="_Toc201573633" w:history="1">
+          <w:hyperlink w:anchor="_Toc201584177" w:history="1">
             <w:r>
               <w:rPr>
                 <w:rStyle w:val="Hyperlink"/>
+                <w:rFonts w:eastAsiaTheme="majorEastAsia"/>
                 <w:noProof/>
               </w:rPr>
               <w:t>Features</w:t>
@@ -169,7 +168,7 @@
                 <w:noProof/>
                 <w:webHidden/>
               </w:rPr>
-              <w:instrText xml:space="preserve"> PAGEREF _Toc201573633 \h </w:instrText>
+              <w:instrText xml:space="preserve"> PAGEREF _Toc201584177 \h </w:instrText>
             </w:r>
             <w:r>
               <w:rPr>
@@ -209,16 +208,14 @@
             <w:rPr>
               <w:noProof/>
               <w:kern w:val="2"/>
-              <w:sz w:val="24"/>
-              <w:szCs w:val="24"/>
-              <w:lang w:val="en-IN" w:eastAsia="en-GB"/>
               <w14:ligatures w14:val="standardContextual"/>
             </w:rPr>
           </w:pPr>
-          <w:hyperlink w:anchor="_Toc201573634" w:history="1">
+          <w:hyperlink w:anchor="_Toc201584178" w:history="1">
             <w:r>
               <w:rPr>
                 <w:rStyle w:val="Hyperlink"/>
+                <w:rFonts w:eastAsiaTheme="majorEastAsia"/>
                 <w:noProof/>
               </w:rPr>
               <w:t>Setup</w:t>
@@ -242,7 +239,7 @@
                 <w:noProof/>
                 <w:webHidden/>
               </w:rPr>
-              <w:instrText xml:space="preserve"> PAGEREF _Toc201573634 \h </w:instrText>
+              <w:instrText xml:space="preserve"> PAGEREF _Toc201584178 \h </w:instrText>
             </w:r>
             <w:r>
               <w:rPr>
@@ -282,16 +279,14 @@
             <w:rPr>
               <w:noProof/>
               <w:kern w:val="2"/>
-              <w:sz w:val="24"/>
-              <w:szCs w:val="24"/>
-              <w:lang w:val="en-IN" w:eastAsia="en-GB"/>
               <w14:ligatures w14:val="standardContextual"/>
             </w:rPr>
           </w:pPr>
-          <w:hyperlink w:anchor="_Toc201573635" w:history="1">
+          <w:hyperlink w:anchor="_Toc201584179" w:history="1">
             <w:r>
               <w:rPr>
                 <w:rStyle w:val="Hyperlink"/>
+                <w:rFonts w:eastAsiaTheme="majorEastAsia"/>
                 <w:noProof/>
               </w:rPr>
               <w:t>About the Data</w:t>
@@ -315,7 +310,7 @@
                 <w:noProof/>
                 <w:webHidden/>
               </w:rPr>
-              <w:instrText xml:space="preserve"> PAGEREF _Toc201573635 \h </w:instrText>
+              <w:instrText xml:space="preserve"> PAGEREF _Toc201584179 \h </w:instrText>
             </w:r>
             <w:r>
               <w:rPr>
@@ -355,16 +350,14 @@
             <w:rPr>
               <w:noProof/>
               <w:kern w:val="2"/>
-              <w:sz w:val="24"/>
-              <w:szCs w:val="24"/>
-              <w:lang w:val="en-IN" w:eastAsia="en-GB"/>
               <w14:ligatures w14:val="standardContextual"/>
             </w:rPr>
           </w:pPr>
-          <w:hyperlink w:anchor="_Toc201573636" w:history="1">
+          <w:hyperlink w:anchor="_Toc201584180" w:history="1">
             <w:r>
               <w:rPr>
                 <w:rStyle w:val="Hyperlink"/>
+                <w:rFonts w:eastAsiaTheme="majorEastAsia"/>
                 <w:noProof/>
               </w:rPr>
               <w:t>Technology Stack</w:t>
@@ -388,7 +381,7 @@
                 <w:noProof/>
                 <w:webHidden/>
               </w:rPr>
-              <w:instrText xml:space="preserve"> PAGEREF _Toc201573636 \h </w:instrText>
+              <w:instrText xml:space="preserve"> PAGEREF _Toc201584180 \h </w:instrText>
             </w:r>
             <w:r>
               <w:rPr>
@@ -428,16 +421,14 @@
             <w:rPr>
               <w:noProof/>
               <w:kern w:val="2"/>
-              <w:sz w:val="24"/>
-              <w:szCs w:val="24"/>
-              <w:lang w:val="en-IN" w:eastAsia="en-GB"/>
               <w14:ligatures w14:val="standardContextual"/>
             </w:rPr>
           </w:pPr>
-          <w:hyperlink w:anchor="_Toc201573637" w:history="1">
+          <w:hyperlink w:anchor="_Toc201584181" w:history="1">
             <w:r>
               <w:rPr>
                 <w:rStyle w:val="Hyperlink"/>
+                <w:rFonts w:eastAsiaTheme="majorEastAsia"/>
                 <w:noProof/>
               </w:rPr>
               <w:t>DBT</w:t>
@@ -461,7 +452,7 @@
                 <w:noProof/>
                 <w:webHidden/>
               </w:rPr>
-              <w:instrText xml:space="preserve"> PAGEREF _Toc201573637 \h </w:instrText>
+              <w:instrText xml:space="preserve"> PAGEREF _Toc201584181 \h </w:instrText>
             </w:r>
             <w:r>
               <w:rPr>
@@ -501,16 +492,14 @@
             <w:rPr>
               <w:noProof/>
               <w:kern w:val="2"/>
-              <w:sz w:val="24"/>
-              <w:szCs w:val="24"/>
-              <w:lang w:val="en-IN" w:eastAsia="en-GB"/>
               <w14:ligatures w14:val="standardContextual"/>
             </w:rPr>
           </w:pPr>
-          <w:hyperlink w:anchor="_Toc201573638" w:history="1">
+          <w:hyperlink w:anchor="_Toc201584182" w:history="1">
             <w:r>
               <w:rPr>
                 <w:rStyle w:val="Hyperlink"/>
+                <w:rFonts w:eastAsiaTheme="majorEastAsia"/>
                 <w:noProof/>
               </w:rPr>
               <w:t>DuckDB</w:t>
@@ -534,7 +523,7 @@
                 <w:noProof/>
                 <w:webHidden/>
               </w:rPr>
-              <w:instrText xml:space="preserve"> PAGEREF _Toc201573638 \h </w:instrText>
+              <w:instrText xml:space="preserve"> PAGEREF _Toc201584182 \h </w:instrText>
             </w:r>
             <w:r>
               <w:rPr>
@@ -574,16 +563,14 @@
             <w:rPr>
               <w:noProof/>
               <w:kern w:val="2"/>
-              <w:sz w:val="24"/>
-              <w:szCs w:val="24"/>
-              <w:lang w:val="en-IN" w:eastAsia="en-GB"/>
               <w14:ligatures w14:val="standardContextual"/>
             </w:rPr>
           </w:pPr>
-          <w:hyperlink w:anchor="_Toc201573639" w:history="1">
+          <w:hyperlink w:anchor="_Toc201584183" w:history="1">
             <w:r>
               <w:rPr>
                 <w:rStyle w:val="Hyperlink"/>
+                <w:rFonts w:eastAsiaTheme="majorEastAsia"/>
                 <w:noProof/>
               </w:rPr>
               <w:t>Streamlit</w:t>
@@ -607,7 +594,7 @@
                 <w:noProof/>
                 <w:webHidden/>
               </w:rPr>
-              <w:instrText xml:space="preserve"> PAGEREF _Toc201573639 \h </w:instrText>
+              <w:instrText xml:space="preserve"> PAGEREF _Toc201584183 \h </w:instrText>
             </w:r>
             <w:r>
               <w:rPr>
@@ -647,16 +634,14 @@
             <w:rPr>
               <w:noProof/>
               <w:kern w:val="2"/>
-              <w:sz w:val="24"/>
-              <w:szCs w:val="24"/>
-              <w:lang w:val="en-IN" w:eastAsia="en-GB"/>
               <w14:ligatures w14:val="standardContextual"/>
             </w:rPr>
           </w:pPr>
-          <w:hyperlink w:anchor="_Toc201573640" w:history="1">
+          <w:hyperlink w:anchor="_Toc201584184" w:history="1">
             <w:r>
               <w:rPr>
                 <w:rStyle w:val="Hyperlink"/>
+                <w:rFonts w:eastAsiaTheme="majorEastAsia"/>
                 <w:noProof/>
               </w:rPr>
               <w:t>GitHub Deployment</w:t>
@@ -680,7 +665,7 @@
                 <w:noProof/>
                 <w:webHidden/>
               </w:rPr>
-              <w:instrText xml:space="preserve"> PAGEREF _Toc201573640 \h </w:instrText>
+              <w:instrText xml:space="preserve"> PAGEREF _Toc201584184 \h </w:instrText>
             </w:r>
             <w:r>
               <w:rPr>
@@ -720,16 +705,14 @@
             <w:rPr>
               <w:noProof/>
               <w:kern w:val="2"/>
-              <w:sz w:val="24"/>
-              <w:szCs w:val="24"/>
-              <w:lang w:val="en-IN" w:eastAsia="en-GB"/>
               <w14:ligatures w14:val="standardContextual"/>
             </w:rPr>
           </w:pPr>
-          <w:hyperlink w:anchor="_Toc201573641" w:history="1">
+          <w:hyperlink w:anchor="_Toc201584185" w:history="1">
             <w:r>
               <w:rPr>
                 <w:rStyle w:val="Hyperlink"/>
+                <w:rFonts w:eastAsiaTheme="majorEastAsia"/>
                 <w:noProof/>
               </w:rPr>
               <w:t>Design Considerations</w:t>
@@ -753,7 +736,7 @@
                 <w:noProof/>
                 <w:webHidden/>
               </w:rPr>
-              <w:instrText xml:space="preserve"> PAGEREF _Toc201573641 \h </w:instrText>
+              <w:instrText xml:space="preserve"> PAGEREF _Toc201584185 \h </w:instrText>
             </w:r>
             <w:r>
               <w:rPr>
@@ -793,16 +776,14 @@
             <w:rPr>
               <w:noProof/>
               <w:kern w:val="2"/>
-              <w:sz w:val="24"/>
-              <w:szCs w:val="24"/>
-              <w:lang w:val="en-IN" w:eastAsia="en-GB"/>
               <w14:ligatures w14:val="standardContextual"/>
             </w:rPr>
           </w:pPr>
-          <w:hyperlink w:anchor="_Toc201573642" w:history="1">
+          <w:hyperlink w:anchor="_Toc201584186" w:history="1">
             <w:r>
               <w:rPr>
                 <w:rStyle w:val="Hyperlink"/>
+                <w:rFonts w:eastAsiaTheme="majorEastAsia"/>
                 <w:noProof/>
               </w:rPr>
               <w:t>1. Data Modeling and Transformation Logic</w:t>
@@ -826,7 +807,7 @@
                 <w:noProof/>
                 <w:webHidden/>
               </w:rPr>
-              <w:instrText xml:space="preserve"> PAGEREF _Toc201573642 \h </w:instrText>
+              <w:instrText xml:space="preserve"> PAGEREF _Toc201584186 \h </w:instrText>
             </w:r>
             <w:r>
               <w:rPr>
@@ -866,16 +847,14 @@
             <w:rPr>
               <w:noProof/>
               <w:kern w:val="2"/>
-              <w:sz w:val="24"/>
-              <w:szCs w:val="24"/>
-              <w:lang w:val="en-IN" w:eastAsia="en-GB"/>
               <w14:ligatures w14:val="standardContextual"/>
             </w:rPr>
           </w:pPr>
-          <w:hyperlink w:anchor="_Toc201573643" w:history="1">
+          <w:hyperlink w:anchor="_Toc201584187" w:history="1">
             <w:r>
               <w:rPr>
                 <w:rStyle w:val="Hyperlink"/>
+                <w:rFonts w:eastAsiaTheme="majorEastAsia"/>
                 <w:noProof/>
               </w:rPr>
               <w:t>2. Dashboard Design and Metric Clarity</w:t>
@@ -899,7 +878,7 @@
                 <w:noProof/>
                 <w:webHidden/>
               </w:rPr>
-              <w:instrText xml:space="preserve"> PAGEREF _Toc201573643 \h </w:instrText>
+              <w:instrText xml:space="preserve"> PAGEREF _Toc201584187 \h </w:instrText>
             </w:r>
             <w:r>
               <w:rPr>
@@ -939,16 +918,14 @@
             <w:rPr>
               <w:noProof/>
               <w:kern w:val="2"/>
-              <w:sz w:val="24"/>
-              <w:szCs w:val="24"/>
-              <w:lang w:val="en-IN" w:eastAsia="en-GB"/>
               <w14:ligatures w14:val="standardContextual"/>
             </w:rPr>
           </w:pPr>
-          <w:hyperlink w:anchor="_Toc201573644" w:history="1">
+          <w:hyperlink w:anchor="_Toc201584188" w:history="1">
             <w:r>
               <w:rPr>
                 <w:rStyle w:val="Hyperlink"/>
+                <w:rFonts w:eastAsiaTheme="majorEastAsia"/>
                 <w:noProof/>
               </w:rPr>
               <w:t>3. Code Readability, Structure, and Documentation</w:t>
@@ -972,7 +949,7 @@
                 <w:noProof/>
                 <w:webHidden/>
               </w:rPr>
-              <w:instrText xml:space="preserve"> PAGEREF _Toc201573644 \h </w:instrText>
+              <w:instrText xml:space="preserve"> PAGEREF _Toc201584188 \h </w:instrText>
             </w:r>
             <w:r>
               <w:rPr>
@@ -1012,16 +989,14 @@
             <w:rPr>
               <w:noProof/>
               <w:kern w:val="2"/>
-              <w:sz w:val="24"/>
-              <w:szCs w:val="24"/>
-              <w:lang w:val="en-IN" w:eastAsia="en-GB"/>
               <w14:ligatures w14:val="standardContextual"/>
             </w:rPr>
           </w:pPr>
-          <w:hyperlink w:anchor="_Toc201573645" w:history="1">
+          <w:hyperlink w:anchor="_Toc201584189" w:history="1">
             <w:r>
               <w:rPr>
                 <w:rStyle w:val="Hyperlink"/>
+                <w:rFonts w:eastAsiaTheme="majorEastAsia"/>
                 <w:noProof/>
               </w:rPr>
               <w:t>4. Design Tradeoffs, Testing, and Scaling Strategy</w:t>
@@ -1045,7 +1020,7 @@
                 <w:noProof/>
                 <w:webHidden/>
               </w:rPr>
-              <w:instrText xml:space="preserve"> PAGEREF _Toc201573645 \h </w:instrText>
+              <w:instrText xml:space="preserve"> PAGEREF _Toc201584189 \h </w:instrText>
             </w:r>
             <w:r>
               <w:rPr>
@@ -1085,16 +1060,14 @@
             <w:rPr>
               <w:noProof/>
               <w:kern w:val="2"/>
-              <w:sz w:val="24"/>
-              <w:szCs w:val="24"/>
-              <w:lang w:val="en-IN" w:eastAsia="en-GB"/>
               <w14:ligatures w14:val="standardContextual"/>
             </w:rPr>
           </w:pPr>
-          <w:hyperlink w:anchor="_Toc201573646" w:history="1">
+          <w:hyperlink w:anchor="_Toc201584190" w:history="1">
             <w:r>
               <w:rPr>
                 <w:rStyle w:val="Hyperlink"/>
+                <w:rFonts w:eastAsiaTheme="majorEastAsia"/>
                 <w:noProof/>
               </w:rPr>
               <w:t>DBT Modeling Strategy</w:t>
@@ -1118,7 +1091,7 @@
                 <w:noProof/>
                 <w:webHidden/>
               </w:rPr>
-              <w:instrText xml:space="preserve"> PAGEREF _Toc201573646 \h </w:instrText>
+              <w:instrText xml:space="preserve"> PAGEREF _Toc201584190 \h </w:instrText>
             </w:r>
             <w:r>
               <w:rPr>
@@ -1158,16 +1131,14 @@
             <w:rPr>
               <w:noProof/>
               <w:kern w:val="2"/>
-              <w:sz w:val="24"/>
-              <w:szCs w:val="24"/>
-              <w:lang w:val="en-IN" w:eastAsia="en-GB"/>
               <w14:ligatures w14:val="standardContextual"/>
             </w:rPr>
           </w:pPr>
-          <w:hyperlink w:anchor="_Toc201573647" w:history="1">
+          <w:hyperlink w:anchor="_Toc201584191" w:history="1">
             <w:r>
               <w:rPr>
                 <w:rStyle w:val="Hyperlink"/>
+                <w:rFonts w:eastAsiaTheme="majorEastAsia"/>
                 <w:noProof/>
               </w:rPr>
               <w:t>Model Summary</w:t>
@@ -1191,7 +1162,7 @@
                 <w:noProof/>
                 <w:webHidden/>
               </w:rPr>
-              <w:instrText xml:space="preserve"> PAGEREF _Toc201573647 \h </w:instrText>
+              <w:instrText xml:space="preserve"> PAGEREF _Toc201584191 \h </w:instrText>
             </w:r>
             <w:r>
               <w:rPr>
@@ -1231,16 +1202,14 @@
             <w:rPr>
               <w:noProof/>
               <w:kern w:val="2"/>
-              <w:sz w:val="24"/>
-              <w:szCs w:val="24"/>
-              <w:lang w:val="en-IN" w:eastAsia="en-GB"/>
               <w14:ligatures w14:val="standardContextual"/>
             </w:rPr>
           </w:pPr>
-          <w:hyperlink w:anchor="_Toc201573648" w:history="1">
+          <w:hyperlink w:anchor="_Toc201584192" w:history="1">
             <w:r>
               <w:rPr>
                 <w:rStyle w:val="Hyperlink"/>
+                <w:rFonts w:eastAsiaTheme="majorEastAsia"/>
                 <w:noProof/>
               </w:rPr>
               <w:t>Layering and Its Benefits</w:t>
@@ -1264,7 +1233,7 @@
                 <w:noProof/>
                 <w:webHidden/>
               </w:rPr>
-              <w:instrText xml:space="preserve"> PAGEREF _Toc201573648 \h </w:instrText>
+              <w:instrText xml:space="preserve"> PAGEREF _Toc201584192 \h </w:instrText>
             </w:r>
             <w:r>
               <w:rPr>
@@ -1304,16 +1273,14 @@
             <w:rPr>
               <w:noProof/>
               <w:kern w:val="2"/>
-              <w:sz w:val="24"/>
-              <w:szCs w:val="24"/>
-              <w:lang w:val="en-IN" w:eastAsia="en-GB"/>
               <w14:ligatures w14:val="standardContextual"/>
             </w:rPr>
           </w:pPr>
-          <w:hyperlink w:anchor="_Toc201573649" w:history="1">
+          <w:hyperlink w:anchor="_Toc201584193" w:history="1">
             <w:r>
               <w:rPr>
                 <w:rStyle w:val="Hyperlink"/>
+                <w:rFonts w:eastAsiaTheme="majorEastAsia"/>
                 <w:noProof/>
               </w:rPr>
               <w:t>Analysis and Insights</w:t>
@@ -1337,7 +1304,7 @@
                 <w:noProof/>
                 <w:webHidden/>
               </w:rPr>
-              <w:instrText xml:space="preserve"> PAGEREF _Toc201573649 \h </w:instrText>
+              <w:instrText xml:space="preserve"> PAGEREF _Toc201584193 \h </w:instrText>
             </w:r>
             <w:r>
               <w:rPr>
@@ -1377,16 +1344,14 @@
             <w:rPr>
               <w:noProof/>
               <w:kern w:val="2"/>
-              <w:sz w:val="24"/>
-              <w:szCs w:val="24"/>
-              <w:lang w:val="en-IN" w:eastAsia="en-GB"/>
               <w14:ligatures w14:val="standardContextual"/>
             </w:rPr>
           </w:pPr>
-          <w:hyperlink w:anchor="_Toc201573650" w:history="1">
+          <w:hyperlink w:anchor="_Toc201584194" w:history="1">
             <w:r>
               <w:rPr>
                 <w:rStyle w:val="Hyperlink"/>
+                <w:rFonts w:eastAsiaTheme="majorEastAsia"/>
                 <w:noProof/>
               </w:rPr>
               <w:t>Assumptions</w:t>
@@ -1410,7 +1375,7 @@
                 <w:noProof/>
                 <w:webHidden/>
               </w:rPr>
-              <w:instrText xml:space="preserve"> PAGEREF _Toc201573650 \h </w:instrText>
+              <w:instrText xml:space="preserve"> PAGEREF _Toc201584194 \h </w:instrText>
             </w:r>
             <w:r>
               <w:rPr>
@@ -1450,16 +1415,14 @@
             <w:rPr>
               <w:noProof/>
               <w:kern w:val="2"/>
-              <w:sz w:val="24"/>
-              <w:szCs w:val="24"/>
-              <w:lang w:val="en-IN" w:eastAsia="en-GB"/>
               <w14:ligatures w14:val="standardContextual"/>
             </w:rPr>
           </w:pPr>
-          <w:hyperlink w:anchor="_Toc201573651" w:history="1">
+          <w:hyperlink w:anchor="_Toc201584195" w:history="1">
             <w:r>
               <w:rPr>
                 <w:rStyle w:val="Hyperlink"/>
+                <w:rFonts w:eastAsiaTheme="majorEastAsia"/>
                 <w:noProof/>
               </w:rPr>
               <w:t>Metric Definitions</w:t>
@@ -1483,7 +1446,7 @@
                 <w:noProof/>
                 <w:webHidden/>
               </w:rPr>
-              <w:instrText xml:space="preserve"> PAGEREF _Toc201573651 \h </w:instrText>
+              <w:instrText xml:space="preserve"> PAGEREF _Toc201584195 \h </w:instrText>
             </w:r>
             <w:r>
               <w:rPr>
@@ -1523,16 +1486,14 @@
             <w:rPr>
               <w:noProof/>
               <w:kern w:val="2"/>
-              <w:sz w:val="24"/>
-              <w:szCs w:val="24"/>
-              <w:lang w:val="en-IN" w:eastAsia="en-GB"/>
               <w14:ligatures w14:val="standardContextual"/>
             </w:rPr>
           </w:pPr>
-          <w:hyperlink w:anchor="_Toc201573652" w:history="1">
+          <w:hyperlink w:anchor="_Toc201584196" w:history="1">
             <w:r>
               <w:rPr>
                 <w:rStyle w:val="Hyperlink"/>
+                <w:rFonts w:eastAsiaTheme="majorEastAsia"/>
                 <w:noProof/>
               </w:rPr>
               <w:t>Insights</w:t>
@@ -1556,7 +1517,7 @@
                 <w:noProof/>
                 <w:webHidden/>
               </w:rPr>
-              <w:instrText xml:space="preserve"> PAGEREF _Toc201573652 \h </w:instrText>
+              <w:instrText xml:space="preserve"> PAGEREF _Toc201584196 \h </w:instrText>
             </w:r>
             <w:r>
               <w:rPr>
@@ -1596,16 +1557,14 @@
             <w:rPr>
               <w:noProof/>
               <w:kern w:val="2"/>
-              <w:sz w:val="24"/>
-              <w:szCs w:val="24"/>
-              <w:lang w:val="en-IN" w:eastAsia="en-GB"/>
               <w14:ligatures w14:val="standardContextual"/>
             </w:rPr>
           </w:pPr>
-          <w:hyperlink w:anchor="_Toc201573653" w:history="1">
+          <w:hyperlink w:anchor="_Toc201584197" w:history="1">
             <w:r>
               <w:rPr>
                 <w:rStyle w:val="Hyperlink"/>
+                <w:rFonts w:eastAsiaTheme="majorEastAsia"/>
                 <w:noProof/>
               </w:rPr>
               <w:t>Follow-up Questions</w:t>
@@ -1629,7 +1588,7 @@
                 <w:noProof/>
                 <w:webHidden/>
               </w:rPr>
-              <w:instrText xml:space="preserve"> PAGEREF _Toc201573653 \h </w:instrText>
+              <w:instrText xml:space="preserve"> PAGEREF _Toc201584197 \h </w:instrText>
             </w:r>
             <w:r>
               <w:rPr>
@@ -1669,16 +1628,14 @@
             <w:rPr>
               <w:noProof/>
               <w:kern w:val="2"/>
-              <w:sz w:val="24"/>
-              <w:szCs w:val="24"/>
-              <w:lang w:val="en-IN" w:eastAsia="en-GB"/>
               <w14:ligatures w14:val="standardContextual"/>
             </w:rPr>
           </w:pPr>
-          <w:hyperlink w:anchor="_Toc201573654" w:history="1">
+          <w:hyperlink w:anchor="_Toc201584198" w:history="1">
             <w:r>
               <w:rPr>
                 <w:rStyle w:val="Hyperlink"/>
+                <w:rFonts w:eastAsiaTheme="majorEastAsia"/>
                 <w:noProof/>
               </w:rPr>
               <w:t>Future Enhancements and Scaling Roadmap</w:t>
@@ -1702,7 +1659,7 @@
                 <w:noProof/>
                 <w:webHidden/>
               </w:rPr>
-              <w:instrText xml:space="preserve"> PAGEREF _Toc201573654 \h </w:instrText>
+              <w:instrText xml:space="preserve"> PAGEREF _Toc201584198 \h </w:instrText>
             </w:r>
             <w:r>
               <w:rPr>
@@ -1722,7 +1679,7 @@
                 <w:noProof/>
                 <w:webHidden/>
               </w:rPr>
-              <w:t>5</w:t>
+              <w:t>6</w:t>
             </w:r>
             <w:r>
               <w:rPr>
@@ -1742,16 +1699,14 @@
             <w:rPr>
               <w:noProof/>
               <w:kern w:val="2"/>
-              <w:sz w:val="24"/>
-              <w:szCs w:val="24"/>
-              <w:lang w:val="en-IN" w:eastAsia="en-GB"/>
               <w14:ligatures w14:val="standardContextual"/>
             </w:rPr>
           </w:pPr>
-          <w:hyperlink w:anchor="_Toc201573655" w:history="1">
+          <w:hyperlink w:anchor="_Toc201584199" w:history="1">
             <w:r>
               <w:rPr>
                 <w:rStyle w:val="Hyperlink"/>
+                <w:rFonts w:eastAsiaTheme="majorEastAsia"/>
                 <w:noProof/>
               </w:rPr>
               <w:t>Planned UI enhancements</w:t>
@@ -1775,7 +1730,7 @@
                 <w:noProof/>
                 <w:webHidden/>
               </w:rPr>
-              <w:instrText xml:space="preserve"> PAGEREF _Toc201573655 \h </w:instrText>
+              <w:instrText xml:space="preserve"> PAGEREF _Toc201584199 \h </w:instrText>
             </w:r>
             <w:r>
               <w:rPr>
@@ -1795,7 +1750,7 @@
                 <w:noProof/>
                 <w:webHidden/>
               </w:rPr>
-              <w:t>5</w:t>
+              <w:t>6</w:t>
             </w:r>
             <w:r>
               <w:rPr>
@@ -1827,7 +1782,7 @@
       <w:pPr>
         <w:pStyle w:val="Heading1"/>
       </w:pPr>
-      <w:bookmarkStart w:id="0" w:name="_Toc201573632"/>
+      <w:bookmarkStart w:id="0" w:name="_Toc201584176"/>
       <w:r>
         <w:lastRenderedPageBreak/>
         <w:t>Project Overview</w:t>
@@ -1836,41 +1791,10 @@
     </w:p>
     <w:p>
       <w:r>
-        <w:t xml:space="preserve">This project sets up an end-to-end open-source data and analytics pipeline for </w:t>
-      </w:r>
-      <w:proofErr w:type="spellStart"/>
-      <w:r>
-        <w:t>HeyMax</w:t>
-      </w:r>
-      <w:proofErr w:type="spellEnd"/>
-      <w:r>
-        <w:t xml:space="preserve"> with an interactive analytics dashboard built using </w:t>
-      </w:r>
-      <w:proofErr w:type="spellStart"/>
-      <w:r>
-        <w:t>Streamlit</w:t>
-      </w:r>
-      <w:proofErr w:type="spellEnd"/>
-      <w:r>
-        <w:t xml:space="preserve">, </w:t>
-      </w:r>
-      <w:proofErr w:type="spellStart"/>
-      <w:r>
-        <w:t>DuckDB</w:t>
-      </w:r>
-      <w:proofErr w:type="spellEnd"/>
-      <w:r>
-        <w:t xml:space="preserve">, and </w:t>
-      </w:r>
-      <w:proofErr w:type="spellStart"/>
-      <w:r>
-        <w:t>dbt</w:t>
-      </w:r>
-      <w:proofErr w:type="spellEnd"/>
-      <w:r>
-        <w:t xml:space="preserve"> to analyze user lifecycle metrics over time. It supports monthly, weekly, and daily views with charts, retention triangle tables, KPIs, filters, and LLM-based insights.</w:t>
+        <w:t>This project sets up an end-to-end open-source data and analytics pipeline for HeyMax with an interactive analytics dashboard built using Streamlit, DuckDB, and dbt to analyze user lifecycle metrics over time. It supports monthly, weekly, and daily views with charts, retention triangle tables, KPIs, filters, and LLM-based insights.</w:t>
       </w:r>
     </w:p>
+    <w:p/>
     <w:p>
       <w:r>
         <w:t xml:space="preserve">Access the live dashboard here: </w:t>
@@ -1888,7 +1812,7 @@
       <w:pPr>
         <w:pStyle w:val="Heading1"/>
       </w:pPr>
-      <w:bookmarkStart w:id="1" w:name="_Toc201573633"/>
+      <w:bookmarkStart w:id="1" w:name="_Toc201584177"/>
       <w:r>
         <w:t>Features</w:t>
       </w:r>
@@ -1977,15 +1901,7 @@
         <w:ind w:left="720"/>
       </w:pPr>
       <w:r>
-        <w:t xml:space="preserve">💬 Ask your data (powered by </w:t>
-      </w:r>
-      <w:proofErr w:type="spellStart"/>
-      <w:r>
-        <w:t>OpenAI’s</w:t>
-      </w:r>
-      <w:proofErr w:type="spellEnd"/>
-      <w:r>
-        <w:t xml:space="preserve"> GPT-4)</w:t>
+        <w:t>💬 Ask your data (powered by OpenAI’s GPT-4)</w:t>
       </w:r>
     </w:p>
     <w:p>
@@ -2005,7 +1921,7 @@
       <w:pPr>
         <w:pStyle w:val="Heading1"/>
       </w:pPr>
-      <w:bookmarkStart w:id="2" w:name="_Toc201573634"/>
+      <w:bookmarkStart w:id="2" w:name="_Toc201584178"/>
       <w:r>
         <w:t>Setup</w:t>
       </w:r>
@@ -2023,39 +1939,14 @@
           <w:u w:val="single"/>
         </w:rPr>
       </w:pPr>
-      <w:r>
-        <w:fldChar w:fldCharType="begin"/>
-      </w:r>
-      <w:r>
-        <w:instrText>HYPERLINK "https://github.com/SANCHIT-GARG/heymax-analytics/blob/main/README.md"</w:instrText>
-      </w:r>
-      <w:r>
-        <w:fldChar w:fldCharType="separate"/>
-      </w:r>
-      <w:r>
-        <w:rPr>
-          <w:rStyle w:val="Hyperlink"/>
-        </w:rPr>
-        <w:t>https://github.com/SANCHIT-GARG/heymax-analytics/blo</w:t>
-      </w:r>
-      <w:r>
-        <w:rPr>
-          <w:rStyle w:val="Hyperlink"/>
-        </w:rPr>
-        <w:t>b</w:t>
-      </w:r>
-      <w:r>
-        <w:rPr>
-          <w:rStyle w:val="Hyperlink"/>
-        </w:rPr>
-        <w:t>/main/README.md</w:t>
-      </w:r>
-      <w:r>
-        <w:rPr>
-          <w:rStyle w:val="Hyperlink"/>
-        </w:rPr>
-        <w:fldChar w:fldCharType="end"/>
-      </w:r>
+      <w:hyperlink r:id="rId7" w:history="1">
+        <w:r>
+          <w:rPr>
+            <w:rStyle w:val="Hyperlink"/>
+          </w:rPr>
+          <w:t>https://github.com/SANCHIT-GARG/heymax-analytics/blob/main/README.md</w:t>
+        </w:r>
+      </w:hyperlink>
       <w:r>
         <w:br/>
       </w:r>
@@ -2064,7 +1955,7 @@
       <w:pPr>
         <w:pStyle w:val="Heading1"/>
       </w:pPr>
-      <w:bookmarkStart w:id="3" w:name="_Toc201573635"/>
+      <w:bookmarkStart w:id="3" w:name="_Toc201584179"/>
       <w:r>
         <w:t>About the Data</w:t>
       </w:r>
@@ -2079,13 +1970,8 @@
         </w:tabs>
         <w:ind w:left="720"/>
       </w:pPr>
-      <w:proofErr w:type="spellStart"/>
-      <w:r>
-        <w:t>event_time</w:t>
-      </w:r>
-      <w:proofErr w:type="spellEnd"/>
-      <w:r>
-        <w:t>: timestamp, needs to be truncated to month</w:t>
+      <w:r>
+        <w:t>event_time: timestamp, needs to be truncated to month</w:t>
       </w:r>
     </w:p>
     <w:p>
@@ -2097,13 +1983,8 @@
         </w:tabs>
         <w:ind w:left="720"/>
       </w:pPr>
-      <w:proofErr w:type="spellStart"/>
-      <w:r>
-        <w:t>user_id</w:t>
-      </w:r>
-      <w:proofErr w:type="spellEnd"/>
-      <w:r>
-        <w:t>: string, uniquely identifies user</w:t>
+      <w:r>
+        <w:t>user_id: string, uniquely identifies user</w:t>
       </w:r>
     </w:p>
     <w:p>
@@ -2115,29 +1996,8 @@
         </w:tabs>
         <w:ind w:left="720"/>
       </w:pPr>
-      <w:proofErr w:type="spellStart"/>
-      <w:r>
-        <w:t>event_type</w:t>
-      </w:r>
-      <w:proofErr w:type="spellEnd"/>
-      <w:r>
-        <w:t xml:space="preserve">: e.g., </w:t>
-      </w:r>
-      <w:proofErr w:type="spellStart"/>
-      <w:r>
-        <w:t>miles_earned</w:t>
-      </w:r>
-      <w:proofErr w:type="spellEnd"/>
-      <w:r>
-        <w:t xml:space="preserve">, </w:t>
-      </w:r>
-      <w:proofErr w:type="spellStart"/>
-      <w:r>
-        <w:t>miles_redeemed</w:t>
-      </w:r>
-      <w:proofErr w:type="spellEnd"/>
-      <w:r>
-        <w:t>, share</w:t>
+      <w:r>
+        <w:t>event_type: e.g., miles_earned, miles_redeemed, share</w:t>
       </w:r>
     </w:p>
     <w:p>
@@ -2173,15 +2033,7 @@
       </w:r>
       <w:proofErr w:type="spellEnd"/>
       <w:r>
-        <w:t>: some events may not have this (</w:t>
-      </w:r>
-      <w:proofErr w:type="gramStart"/>
-      <w:r>
-        <w:t>e.g.</w:t>
-      </w:r>
-      <w:proofErr w:type="gramEnd"/>
-      <w:r>
-        <w:t xml:space="preserve"> share)</w:t>
+        <w:t>: some events may not have this (e.g. share)</w:t>
       </w:r>
     </w:p>
     <w:p>
@@ -2209,7 +2061,7 @@
       <w:pPr>
         <w:pStyle w:val="Heading1"/>
       </w:pPr>
-      <w:bookmarkStart w:id="4" w:name="_Toc201573636"/>
+      <w:bookmarkStart w:id="4" w:name="_Toc201584180"/>
       <w:r>
         <w:t>Technology Stack</w:t>
       </w:r>
@@ -2219,7 +2071,7 @@
       <w:pPr>
         <w:pStyle w:val="Heading2"/>
       </w:pPr>
-      <w:bookmarkStart w:id="5" w:name="_Toc201573637"/>
+      <w:bookmarkStart w:id="5" w:name="_Toc201584181"/>
       <w:r>
         <w:t>DBT</w:t>
       </w:r>
@@ -2236,58 +2088,34 @@
         </w:rPr>
         <w:t>‘</w:t>
       </w:r>
-      <w:proofErr w:type="spellStart"/>
       <w:r>
         <w:rPr>
           <w:b/>
           <w:bCs/>
         </w:rPr>
-        <w:t>dbt</w:t>
-      </w:r>
-      <w:proofErr w:type="spellEnd"/>
-      <w:r>
-        <w:rPr>
-          <w:b/>
-          <w:bCs/>
-        </w:rPr>
-        <w:t xml:space="preserve"> docs generate</w:t>
+        <w:t>dbt docs generate</w:t>
       </w:r>
       <w:r>
         <w:t>’</w:t>
       </w:r>
       <w:r>
-        <w:t xml:space="preserve"> to view model docs. Parquet storage, partitioning, and sort keys improve performance in </w:t>
-      </w:r>
-      <w:proofErr w:type="spellStart"/>
-      <w:r>
-        <w:t>DuckDB</w:t>
-      </w:r>
-      <w:proofErr w:type="spellEnd"/>
-      <w:r>
-        <w:t>.</w:t>
+        <w:t xml:space="preserve"> to view model docs. Parquet storage, partitioning, and sort keys improve performance in DuckDB.</w:t>
       </w:r>
     </w:p>
     <w:p>
       <w:pPr>
         <w:pStyle w:val="Heading2"/>
       </w:pPr>
-      <w:bookmarkStart w:id="6" w:name="_Toc201573638"/>
-      <w:proofErr w:type="spellStart"/>
+      <w:bookmarkStart w:id="6" w:name="_Toc201584182"/>
       <w:r>
         <w:lastRenderedPageBreak/>
         <w:t>DuckDB</w:t>
       </w:r>
       <w:bookmarkEnd w:id="6"/>
-      <w:proofErr w:type="spellEnd"/>
     </w:p>
     <w:p>
-      <w:proofErr w:type="spellStart"/>
-      <w:r>
-        <w:t>DuckDB</w:t>
-      </w:r>
-      <w:proofErr w:type="spellEnd"/>
-      <w:r>
-        <w:t xml:space="preserve"> is an OLAP SQL engine ideal for analytical queries. It supports in-memory operations, Parquet IO, and integrates with cloud environments. Query via CLI (</w:t>
+      <w:r>
+        <w:t>DuckDB is an OLAP SQL engine ideal for analytical queries. It supports in-memory operations, Parquet IO, and integrates with cloud environments. Query via CLI (</w:t>
       </w:r>
       <w:r>
         <w:rPr>
@@ -2343,37 +2171,22 @@
       <w:pPr>
         <w:pStyle w:val="Heading2"/>
       </w:pPr>
-      <w:bookmarkStart w:id="7" w:name="_Toc201573639"/>
-      <w:proofErr w:type="spellStart"/>
+      <w:bookmarkStart w:id="7" w:name="_Toc201584183"/>
       <w:r>
         <w:t>Streamlit</w:t>
       </w:r>
       <w:bookmarkEnd w:id="7"/>
-      <w:proofErr w:type="spellEnd"/>
     </w:p>
     <w:p>
-      <w:proofErr w:type="spellStart"/>
-      <w:r>
-        <w:t>Streamlit</w:t>
-      </w:r>
-      <w:proofErr w:type="spellEnd"/>
-      <w:r>
-        <w:t xml:space="preserve"> builds interactive Python dashboards rapidly. It supports Python-native components, real-time reactivity, and deploys easily on </w:t>
-      </w:r>
-      <w:proofErr w:type="spellStart"/>
-      <w:r>
-        <w:t>Streamlit</w:t>
-      </w:r>
-      <w:proofErr w:type="spellEnd"/>
-      <w:r>
-        <w:t xml:space="preserve"> Cloud.</w:t>
+      <w:r>
+        <w:t>Streamlit builds interactive Python dashboards rapidly. It supports Python-native components, real-time reactivity, and deploys easily on Streamlit Cloud.</w:t>
       </w:r>
     </w:p>
     <w:p>
       <w:pPr>
         <w:pStyle w:val="Heading2"/>
       </w:pPr>
-      <w:bookmarkStart w:id="8" w:name="_Toc201573640"/>
+      <w:bookmarkStart w:id="8" w:name="_Toc201584184"/>
       <w:r>
         <w:t>GitHub Deployment</w:t>
       </w:r>
@@ -2388,23 +2201,7 @@
         </w:numPr>
       </w:pPr>
       <w:r>
-        <w:t xml:space="preserve">CI: Executes </w:t>
-      </w:r>
-      <w:proofErr w:type="spellStart"/>
-      <w:r>
-        <w:t>dbt</w:t>
-      </w:r>
-      <w:proofErr w:type="spellEnd"/>
-      <w:r>
-        <w:t xml:space="preserve"> runs/tests on every commit, emails logs, updates </w:t>
-      </w:r>
-      <w:proofErr w:type="spellStart"/>
-      <w:r>
-        <w:t>DuckDB</w:t>
-      </w:r>
-      <w:proofErr w:type="spellEnd"/>
-      <w:r>
-        <w:t>, and runs daily at 8am.</w:t>
+        <w:t>CI: Executes dbt runs/tests on every commit, emails logs, updates DuckDB, and runs daily at 8am.</w:t>
       </w:r>
       <w:r>
         <w:t xml:space="preserve"> (the runs can be configured based on the requirements)</w:t>
@@ -2419,22 +2216,14 @@
         </w:numPr>
       </w:pPr>
       <w:r>
-        <w:t xml:space="preserve">CD: Uses </w:t>
-      </w:r>
-      <w:proofErr w:type="spellStart"/>
-      <w:r>
-        <w:t>Streamlit</w:t>
-      </w:r>
-      <w:proofErr w:type="spellEnd"/>
-      <w:r>
-        <w:t xml:space="preserve"> Cloud linked to the repo for zero-touch deployments.</w:t>
+        <w:t>CD: Uses Streamlit Cloud linked to the repo for zero-touch deployments.</w:t>
       </w:r>
     </w:p>
     <w:p>
       <w:pPr>
         <w:pStyle w:val="Heading1"/>
       </w:pPr>
-      <w:bookmarkStart w:id="9" w:name="_Toc201573641"/>
+      <w:bookmarkStart w:id="9" w:name="_Toc201584185"/>
       <w:r>
         <w:t>Design Considerations</w:t>
       </w:r>
@@ -2444,7 +2233,7 @@
       <w:pPr>
         <w:pStyle w:val="Heading2"/>
       </w:pPr>
-      <w:bookmarkStart w:id="10" w:name="_Toc201573642"/>
+      <w:bookmarkStart w:id="10" w:name="_Toc201584186"/>
       <w:r>
         <w:t>1. Data Modeling and Transformation Logic</w:t>
       </w:r>
@@ -2499,7 +2288,7 @@
       <w:pPr>
         <w:pStyle w:val="Heading2"/>
       </w:pPr>
-      <w:bookmarkStart w:id="11" w:name="_Toc201573643"/>
+      <w:bookmarkStart w:id="11" w:name="_Toc201584187"/>
       <w:r>
         <w:t>2. Dashboard Design and Metric Clarity</w:t>
       </w:r>
@@ -2509,96 +2298,232 @@
       <w:r>
         <w:t>The dashboard offers toggles for daily/weekly/monthly views, chart summaries, cohort tables, and KPIs. Users can filter by date and export CSVs. LLM integration allows natural language queries.</w:t>
       </w:r>
+      <w:r>
+        <w:t xml:space="preserve"> </w:t>
+      </w:r>
+      <w:r>
+        <w:br/>
+      </w:r>
+      <w:r>
+        <w:br/>
+        <w:t>Example questions for LLM:</w:t>
+      </w:r>
     </w:p>
     <w:p>
       <w:pPr>
+        <w:pStyle w:val="ListParagraph"/>
+        <w:numPr>
+          <w:ilvl w:val="0"/>
+          <w:numId w:val="19"/>
+        </w:numPr>
+      </w:pPr>
+      <w:r>
+        <w:t>What month had the highest churn rate?</w:t>
+      </w:r>
+    </w:p>
+    <w:p>
+      <w:pPr>
+        <w:pStyle w:val="ListParagraph"/>
+        <w:numPr>
+          <w:ilvl w:val="0"/>
+          <w:numId w:val="19"/>
+        </w:numPr>
+      </w:pPr>
+      <w:r>
+        <w:t>Compare new users vs resurrected users in April.</w:t>
+      </w:r>
+    </w:p>
+    <w:p>
+      <w:pPr>
+        <w:pStyle w:val="ListParagraph"/>
+        <w:numPr>
+          <w:ilvl w:val="0"/>
+          <w:numId w:val="19"/>
+        </w:numPr>
+      </w:pPr>
+      <w:r>
+        <w:t>Why did quick ratio drop in May?</w:t>
+      </w:r>
+    </w:p>
+    <w:p>
+      <w:pPr>
+        <w:pStyle w:val="ListParagraph"/>
+        <w:numPr>
+          <w:ilvl w:val="0"/>
+          <w:numId w:val="19"/>
+        </w:numPr>
+      </w:pPr>
+      <w:r>
+        <w:t>How many users were retained after 3 months from the March cohort?</w:t>
+      </w:r>
+    </w:p>
+    <w:p/>
+    <w:p/>
+    <w:p>
+      <w:pPr>
         <w:pStyle w:val="Heading2"/>
       </w:pPr>
-      <w:bookmarkStart w:id="12" w:name="_Toc201573644"/>
+      <w:bookmarkStart w:id="12" w:name="_Toc201584188"/>
       <w:r>
         <w:t>3. Code Readability, Structure, and Documentation</w:t>
       </w:r>
       <w:bookmarkEnd w:id="12"/>
     </w:p>
     <w:p>
-      <w:r>
-        <w:t xml:space="preserve">SQL follows layered </w:t>
+      <w:bookmarkStart w:id="13" w:name="_Toc201584189"/>
+      <w:r>
+        <w:t>The project uses a clean structure with layered SQL folders (</w:t>
+      </w:r>
+      <w:r>
+        <w:t>staging</w:t>
+      </w:r>
+      <w:r>
+        <w:t xml:space="preserve">, </w:t>
+      </w:r>
+      <w:r>
+        <w:t>intermediate</w:t>
+      </w:r>
+      <w:r>
+        <w:t xml:space="preserve">, </w:t>
+      </w:r>
+      <w:r>
+        <w:t>growth</w:t>
+      </w:r>
+      <w:r>
+        <w:t xml:space="preserve">) and modular Python code organized into </w:t>
       </w:r>
       <w:proofErr w:type="spellStart"/>
       <w:r>
-        <w:t>foldering</w:t>
+        <w:t>Streamlit</w:t>
       </w:r>
       <w:proofErr w:type="spellEnd"/>
       <w:r>
-        <w:t xml:space="preserve"> (staging, intermediate, growth). Python code is modular with tabs. Metadata is defined via `</w:t>
-      </w:r>
-      <w:proofErr w:type="spellStart"/>
+        <w:t xml:space="preserve"> tabs. Metadata and tests are defined via </w:t>
+      </w:r>
       <w:r>
         <w:t>schema.yml</w:t>
       </w:r>
-      <w:proofErr w:type="spellEnd"/>
-      <w:r>
-        <w:t>`. CI/CD pipelines auto-generate docs and enforce quality.</w:t>
+      <w:r>
+        <w:t>.</w:t>
       </w:r>
     </w:p>
     <w:p>
+      <w:r>
+        <w:t>CI is set up using GitHub Actions (</w:t>
+      </w:r>
+      <w:r>
+        <w:t>.</w:t>
+      </w:r>
+      <w:proofErr w:type="spellStart"/>
+      <w:r>
+        <w:t>github</w:t>
+      </w:r>
+      <w:proofErr w:type="spellEnd"/>
+      <w:r>
+        <w:t>/workflows/</w:t>
+      </w:r>
+      <w:proofErr w:type="spellStart"/>
+      <w:r>
+        <w:t>dbt_run.yml</w:t>
+      </w:r>
+      <w:proofErr w:type="spellEnd"/>
+      <w:r>
+        <w:t xml:space="preserve">) to run </w:t>
+      </w:r>
+      <w:proofErr w:type="spellStart"/>
+      <w:r>
+        <w:t>dbt</w:t>
+      </w:r>
+      <w:proofErr w:type="spellEnd"/>
+      <w:r>
+        <w:t xml:space="preserve">, update </w:t>
+      </w:r>
+      <w:proofErr w:type="spellStart"/>
+      <w:r>
+        <w:t>heymax.duckdb</w:t>
+      </w:r>
+      <w:proofErr w:type="spellEnd"/>
+      <w:r>
+        <w:t>, and send email notifications on success/failure using GitHub secrets (</w:t>
+      </w:r>
+      <w:r>
+        <w:t>EMAIL_USER</w:t>
+      </w:r>
+      <w:r>
+        <w:t xml:space="preserve">, </w:t>
+      </w:r>
+      <w:r>
+        <w:t>EMAIL_PASSWORD</w:t>
+      </w:r>
+      <w:r>
+        <w:t>). It runs on every commit and daily at 8 AM.</w:t>
+      </w:r>
+    </w:p>
+    <w:p>
+      <w:r>
+        <w:t xml:space="preserve">CD is handled via </w:t>
+      </w:r>
+      <w:proofErr w:type="spellStart"/>
+      <w:r>
+        <w:t>Streamlit</w:t>
+      </w:r>
+      <w:proofErr w:type="spellEnd"/>
+      <w:r>
+        <w:t xml:space="preserve"> Cloud, auto-deploying the app (</w:t>
+      </w:r>
+      <w:r>
+        <w:t>dashboard.py</w:t>
+      </w:r>
+      <w:r>
+        <w:t xml:space="preserve">) on every push to </w:t>
+      </w:r>
+      <w:r>
+        <w:t>main</w:t>
+      </w:r>
+      <w:r>
+        <w:t>.</w:t>
+      </w:r>
+    </w:p>
+    <w:p>
       <w:pPr>
         <w:pStyle w:val="Heading2"/>
       </w:pPr>
-      <w:bookmarkStart w:id="13" w:name="_Toc201573645"/>
-      <w:r>
-        <w:t>4. Design Tradeoffs, Testing, and Scaling Strategy</w:t>
+      <w:r>
+        <w:lastRenderedPageBreak/>
+        <w:t xml:space="preserve">4. Design </w:t>
+      </w:r>
+      <w:proofErr w:type="spellStart"/>
+      <w:r>
+        <w:t>Tradeoffs</w:t>
+      </w:r>
+      <w:proofErr w:type="spellEnd"/>
+      <w:r>
+        <w:t>, Testing, and Scaling Strategy</w:t>
       </w:r>
       <w:bookmarkEnd w:id="13"/>
     </w:p>
     <w:p>
-      <w:proofErr w:type="spellStart"/>
-      <w:r>
-        <w:t>DuckDB</w:t>
-      </w:r>
-      <w:proofErr w:type="spellEnd"/>
-      <w:r>
-        <w:t xml:space="preserve"> offers blazing speed for local analytics but isn't built for high-concurrency</w:t>
-      </w:r>
-      <w:r>
-        <w:t xml:space="preserve"> and </w:t>
-      </w:r>
-      <w:proofErr w:type="gramStart"/>
-      <w:r>
-        <w:t>access based</w:t>
-      </w:r>
-      <w:proofErr w:type="gramEnd"/>
-      <w:r>
-        <w:t xml:space="preserve"> control</w:t>
+      <w:r>
+        <w:t>DuckDB offers blazing speed for local analytics but isn't built for high-concurrency</w:t>
+      </w:r>
+      <w:r>
+        <w:t xml:space="preserve"> and access based control</w:t>
       </w:r>
       <w:r>
         <w:t xml:space="preserve">. </w:t>
       </w:r>
-      <w:proofErr w:type="spellStart"/>
       <w:r>
         <w:t>D</w:t>
       </w:r>
       <w:r>
-        <w:t>bt</w:t>
-      </w:r>
-      <w:proofErr w:type="spellEnd"/>
-      <w:r>
-        <w:t xml:space="preserve"> tests ensure data quality. The modular structure supports easy migration to </w:t>
-      </w:r>
-      <w:proofErr w:type="spellStart"/>
-      <w:r>
-        <w:t>BigQuery</w:t>
-      </w:r>
-      <w:proofErr w:type="spellEnd"/>
-      <w:r>
-        <w:t xml:space="preserve"> or Snowflake.</w:t>
+        <w:t>bt tests ensure data quality. The modular structure supports easy migration to BigQuery or Snowflake.</w:t>
       </w:r>
     </w:p>
     <w:p>
       <w:pPr>
         <w:pStyle w:val="Heading1"/>
       </w:pPr>
-      <w:bookmarkStart w:id="14" w:name="_Toc201573646"/>
+      <w:bookmarkStart w:id="14" w:name="_Toc201584190"/>
       <w:r>
         <w:t>DBT Modeling Strategy</w:t>
       </w:r>
@@ -2606,24 +2531,15 @@
     </w:p>
     <w:p>
       <w:r>
-        <w:t xml:space="preserve">This project uses a layered </w:t>
-      </w:r>
-      <w:proofErr w:type="spellStart"/>
-      <w:r>
-        <w:t>dbt</w:t>
-      </w:r>
-      <w:proofErr w:type="spellEnd"/>
-      <w:r>
-        <w:t xml:space="preserve"> modeling approach based on the Medallion Architecture. It transforms raw event data into actionable insights across daily, weekly, and monthly levels.</w:t>
+        <w:t>This project uses a layered dbt modeling approach based on the Medallion Architecture. It transforms raw event data into actionable insights across daily, weekly, and monthly levels.</w:t>
       </w:r>
     </w:p>
     <w:p>
       <w:pPr>
         <w:pStyle w:val="Heading2"/>
       </w:pPr>
-      <w:bookmarkStart w:id="15" w:name="_Toc201573647"/>
-      <w:r>
-        <w:lastRenderedPageBreak/>
+      <w:bookmarkStart w:id="15" w:name="_Toc201584191"/>
+      <w:r>
         <w:t>Model Summary</w:t>
       </w:r>
       <w:bookmarkEnd w:id="15"/>
@@ -2635,11 +2551,11 @@
         <w:tblLook w:val="04A0" w:firstRow="1" w:lastRow="0" w:firstColumn="1" w:lastColumn="0" w:noHBand="0" w:noVBand="1"/>
       </w:tblPr>
       <w:tblGrid>
-        <w:gridCol w:w="2235"/>
-        <w:gridCol w:w="1559"/>
-        <w:gridCol w:w="1843"/>
-        <w:gridCol w:w="1701"/>
-        <w:gridCol w:w="1492"/>
+        <w:gridCol w:w="2309"/>
+        <w:gridCol w:w="1548"/>
+        <w:gridCol w:w="1840"/>
+        <w:gridCol w:w="1681"/>
+        <w:gridCol w:w="1452"/>
       </w:tblGrid>
       <w:tr>
         <w:trPr>
@@ -3232,7 +3148,7 @@
       <w:pPr>
         <w:pStyle w:val="Heading2"/>
       </w:pPr>
-      <w:bookmarkStart w:id="16" w:name="_Toc201573648"/>
+      <w:bookmarkStart w:id="16" w:name="_Toc201584192"/>
       <w:r>
         <w:t>Layering and Its Benefits</w:t>
       </w:r>
@@ -3240,15 +3156,7 @@
     </w:p>
     <w:p>
       <w:r>
-        <w:t xml:space="preserve">This </w:t>
-      </w:r>
-      <w:proofErr w:type="spellStart"/>
-      <w:r>
-        <w:t>dbt</w:t>
-      </w:r>
-      <w:proofErr w:type="spellEnd"/>
-      <w:r>
-        <w:t xml:space="preserve"> project follows the Medallion Architecture:</w:t>
+        <w:t>This dbt project follows the Medallion Architecture:</w:t>
       </w:r>
     </w:p>
     <w:p>
@@ -3321,15 +3229,7 @@
         </w:numPr>
       </w:pPr>
       <w:r>
-        <w:t xml:space="preserve">Why Tables? </w:t>
-      </w:r>
-      <w:proofErr w:type="spellStart"/>
-      <w:r>
-        <w:t>DuckDB</w:t>
-      </w:r>
-      <w:proofErr w:type="spellEnd"/>
-      <w:r>
-        <w:t xml:space="preserve"> benefits from persisted Parquet tables for fast reads.</w:t>
+        <w:t>Why Tables? DuckDB benefits from persisted Parquet tables for fast reads.</w:t>
       </w:r>
     </w:p>
     <w:p>
@@ -3508,9 +3408,8 @@
       <w:pPr>
         <w:pStyle w:val="Heading1"/>
       </w:pPr>
-      <w:bookmarkStart w:id="17" w:name="_Toc201573649"/>
-      <w:r>
-        <w:lastRenderedPageBreak/>
+      <w:bookmarkStart w:id="17" w:name="_Toc201584193"/>
+      <w:r>
         <w:t>Analysis and Insights</w:t>
       </w:r>
       <w:bookmarkEnd w:id="17"/>
@@ -3519,7 +3418,7 @@
       <w:pPr>
         <w:pStyle w:val="Heading2"/>
       </w:pPr>
-      <w:bookmarkStart w:id="18" w:name="_Toc201573650"/>
+      <w:bookmarkStart w:id="18" w:name="_Toc201584194"/>
       <w:r>
         <w:t>Assumptions</w:t>
       </w:r>
@@ -3534,7 +3433,7 @@
         </w:numPr>
       </w:pPr>
       <w:r>
-        <w:t>Each row in the source event data represents a unique user activity.</w:t>
+        <w:t>Users are uniquely identified by `user_id`.</w:t>
       </w:r>
     </w:p>
     <w:p>
@@ -3546,15 +3445,7 @@
         </w:numPr>
       </w:pPr>
       <w:r>
-        <w:t>Users are uniquely identified by `</w:t>
-      </w:r>
-      <w:proofErr w:type="spellStart"/>
-      <w:r>
-        <w:t>user_id</w:t>
-      </w:r>
-      <w:proofErr w:type="spellEnd"/>
-      <w:r>
-        <w:t>`.</w:t>
+        <w:t>The `event_time` field is the basis for all time-based aggregations (daily/weekly/monthly).</w:t>
       </w:r>
     </w:p>
     <w:p>
@@ -3566,58 +3457,14 @@
         </w:numPr>
       </w:pPr>
       <w:r>
-        <w:t>The `</w:t>
-      </w:r>
-      <w:proofErr w:type="spellStart"/>
-      <w:r>
-        <w:t>event_time</w:t>
-      </w:r>
-      <w:proofErr w:type="spellEnd"/>
-      <w:r>
-        <w:t>` field is the basis for all time-based aggregations (daily/weekly/monthly).</w:t>
+        <w:t>Metrics are aggregated at the user level, not event count level.</w:t>
       </w:r>
     </w:p>
     <w:p>
       <w:pPr>
-        <w:pStyle w:val="ListParagraph"/>
-        <w:numPr>
-          <w:ilvl w:val="0"/>
-          <w:numId w:val="13"/>
-        </w:numPr>
-      </w:pPr>
-      <w:r>
-        <w:t>Retention is calculated based on activity in consecutive periods post-cohort.</w:t>
-      </w:r>
-    </w:p>
-    <w:p>
-      <w:pPr>
-        <w:pStyle w:val="ListParagraph"/>
-        <w:numPr>
-          <w:ilvl w:val="0"/>
-          <w:numId w:val="13"/>
-        </w:numPr>
-      </w:pPr>
-      <w:r>
-        <w:t>Metrics are aggregated at the user level, not event count level.</w:t>
-      </w:r>
-    </w:p>
-    <w:p>
-      <w:pPr>
-        <w:pStyle w:val="ListParagraph"/>
-        <w:numPr>
-          <w:ilvl w:val="0"/>
-          <w:numId w:val="13"/>
-        </w:numPr>
-      </w:pPr>
-      <w:r>
-        <w:t>Churned users are defined as those who were active in the previous period but not in the current one.</w:t>
-      </w:r>
-    </w:p>
-    <w:p>
-      <w:pPr>
         <w:pStyle w:val="Heading2"/>
       </w:pPr>
-      <w:bookmarkStart w:id="19" w:name="_Toc201573651"/>
+      <w:bookmarkStart w:id="19" w:name="_Toc201584195"/>
       <w:r>
         <w:t>Metric Definitions</w:t>
       </w:r>
@@ -3711,7 +3558,7 @@
       <w:pPr>
         <w:pStyle w:val="Heading2"/>
       </w:pPr>
-      <w:bookmarkStart w:id="20" w:name="_Toc201573652"/>
+      <w:bookmarkStart w:id="20" w:name="_Toc201584196"/>
       <w:r>
         <w:t>Insights</w:t>
       </w:r>
@@ -3726,7 +3573,15 @@
         </w:numPr>
       </w:pPr>
       <w:r>
-        <w:t>There is a noticeable decline in new user acquisition beginning in March 2025, observed in both monthly and weekly data. No new users were recorded in the monthly dataset after March, and weekly data shows a complete halt starting the week of March 23. This suggests potential issues with acquisition strategies, marketing gaps, or external market shifts.</w:t>
+        <w:rPr>
+          <w:b/>
+          <w:bCs/>
+        </w:rPr>
+        <w:t>Limitations in New User Insights Due to Data Framing</w:t>
+      </w:r>
+      <w:r>
+        <w:br/>
+        <w:t>The observed decline in new user acquisition starting March 2025—visible in both weekly and monthly views—should be interpreted with caution. The dataset spans only three months, which is a relatively short timeframe to draw strong conclusions. Additionally, the logic currently used to define "new users" considers any user seen for the first time in this dataset as new. This can lead to misleading inferences once the entire known user pool has been seen at least once. The lack of new users beyond a certain point is not necessarily a reflection of acquisition failure, but rather of dataset boundaries and how identity is framed. To gain stronger confidence, we would benefit from either historical context or continued data collection over the coming months.</w:t>
       </w:r>
     </w:p>
     <w:p>
@@ -3738,7 +3593,15 @@
         </w:numPr>
       </w:pPr>
       <w:r>
-        <w:t>Despite the drop in new users, retention rates remained strong in a few segments. Weekly cohorts from March 9 and 16 maintained 100% retention, and daily cohorts consistently showed full retention on day 0. This highlights that users who were acquired during that period were highly engaged initially.</w:t>
+        <w:rPr>
+          <w:b/>
+          <w:bCs/>
+        </w:rPr>
+        <w:t>Unusually Perfect Retention Suggests Potential Simulation or Definition Gap</w:t>
+      </w:r>
+      <w:r>
+        <w:br/>
+        <w:t>Weekly cohorts from March 9 and March 16 show a 100% retention rate, and daily cohorts consistently report full day-0 retention. While promising on the surface, such flawless retention is rare in real-world scenarios and suggests either simulation or a potential misalignment in how user activity/inactivity is defined. In most practical cases, some degree of churn is expected—even among early adopters. This highlights the need to revisit how activity is being measured and validate if this aligns with the business’s operational definition of an "active" user.</w:t>
       </w:r>
     </w:p>
     <w:p>
@@ -3750,7 +3613,32 @@
         </w:numPr>
       </w:pPr>
       <w:r>
-        <w:t>Retention tends to fall off rapidly across all periods. For example, the monthly March cohort dropped to 0% retention by month four, while daily cohorts often lose a significant portion of users after the first or second day. This points to a need for stronger post-onboarding engagement strategies.</w:t>
+        <w:rPr>
+          <w:b/>
+          <w:bCs/>
+        </w:rPr>
+        <w:lastRenderedPageBreak/>
+        <w:t xml:space="preserve">Cohort Retention Drop Is Artificial—A </w:t>
+      </w:r>
+      <w:proofErr w:type="spellStart"/>
+      <w:r>
+        <w:rPr>
+          <w:b/>
+          <w:bCs/>
+        </w:rPr>
+        <w:t>Byproduct</w:t>
+      </w:r>
+      <w:proofErr w:type="spellEnd"/>
+      <w:r>
+        <w:rPr>
+          <w:b/>
+          <w:bCs/>
+        </w:rPr>
+        <w:t xml:space="preserve"> of Augmented Analysis</w:t>
+      </w:r>
+      <w:r>
+        <w:br/>
+        <w:t>The observed retention drop for the March cohort by month four is not from the actual user data but stems from artificially extending the timeline to construct a cohort matrix. This augmentation was necessary to build a complete cohort view, but the resulting retention decline is not organically present in the data. In fact, across all original data points, retention appears unusually consistent, which once again suggests either simulated data or the need to review how we’re calculating lifecycle metrics in context of the business use case.</w:t>
       </w:r>
     </w:p>
     <w:p>
@@ -3762,7 +3650,23 @@
         </w:numPr>
       </w:pPr>
       <w:r>
-        <w:t>Daily metrics consistently show a quick ratio greater than 1, indicating that user growth (new + resurrected) often outpaces churn. This is a positive signal for user health during active periods, but it must be sustained with ongoing acquisition.</w:t>
+        <w:rPr>
+          <w:b/>
+          <w:bCs/>
+        </w:rPr>
+        <w:t>Quick Ratio Trends Suggest Healthy Growth—With the Caveat of Incomplete Inputs</w:t>
+      </w:r>
+      <w:r>
+        <w:br/>
+        <w:t xml:space="preserve">Across the daily granularity, the quick ratio remains consistently above 1—indicating that user growth (new + resurrected) exceeds churn. While this is typically a positive signal, it should be interpreted in the context of the dataset’s constraints. The definitions of “new” and “resurrected” users need scrutiny to ensure they reflect meaningful user </w:t>
+      </w:r>
+      <w:proofErr w:type="spellStart"/>
+      <w:r>
+        <w:t>behavior</w:t>
+      </w:r>
+      <w:proofErr w:type="spellEnd"/>
+      <w:r>
+        <w:t>, especially when data completeness is in question. Without this validation, quick ratio patterns may present a skewed picture of growth health.</w:t>
       </w:r>
     </w:p>
     <w:p>
@@ -3774,16 +3678,23 @@
         </w:numPr>
       </w:pPr>
       <w:r>
-        <w:t>Daily data reveals irregular acquisition behavior—significant spikes (e.g., 52 new users on March 8) followed by prolonged inactivity (e.g., no new users from June 1 onward). This inconsistency underscores the importance of establishing reliable, scalable growth channels.</w:t>
+        <w:rPr>
+          <w:b/>
+          <w:bCs/>
+        </w:rPr>
+        <w:t>Acquisition Spikes Point to Irregular Patterns—But Must Be Verified for Authenticity</w:t>
+      </w:r>
+      <w:r>
+        <w:br/>
+        <w:t>Daily user trends reveal sharp acquisition spikes—such as 52 users on March 8—followed by long periods of inactivity, including no new users from March 14 onward. While this hints at unreliable or burst-driven growth mechanisms, it again raises the question of whether this pattern is real or shaped by dataset simulation or framing artifacts. For any sustainable growth analysis, we must establish that acquisition signals are grounded in accurate and complete tracking logic.</w:t>
       </w:r>
     </w:p>
     <w:p>
       <w:pPr>
         <w:pStyle w:val="Heading2"/>
       </w:pPr>
-      <w:bookmarkStart w:id="21" w:name="_Toc201573653"/>
-      <w:r>
-        <w:lastRenderedPageBreak/>
+      <w:bookmarkStart w:id="21" w:name="_Toc201584197"/>
+      <w:r>
         <w:t>Follow-up Questions</w:t>
       </w:r>
       <w:bookmarkEnd w:id="21"/>
@@ -3797,7 +3708,7 @@
         </w:numPr>
       </w:pPr>
       <w:r>
-        <w:t>What changes occurred around March 2025 in marketing campaigns, product launches, pricing, or external factors that might explain the observed decline in user acquisition?</w:t>
+        <w:t>What specific changes in marketing strategy, product rollout, or external conditions occurred around March 2025 that could explain the observed decline in new user acquisition?</w:t>
       </w:r>
     </w:p>
     <w:p>
@@ -3809,7 +3720,15 @@
         </w:numPr>
       </w:pPr>
       <w:r>
-        <w:t>What characteristics define high-retention cohorts, such as those seen in the weekly and daily segments from early March? Are there acquisition sources, features, or behaviors that correlate with these outcomes?</w:t>
+        <w:t xml:space="preserve">Are the high-retention cohorts from early March linked to specific acquisition sources, campaigns, or onboarding flows that could be </w:t>
+      </w:r>
+      <w:proofErr w:type="spellStart"/>
+      <w:r>
+        <w:t>analyzed</w:t>
+      </w:r>
+      <w:proofErr w:type="spellEnd"/>
+      <w:r>
+        <w:t xml:space="preserve"> and replicated?</w:t>
       </w:r>
     </w:p>
     <w:p>
@@ -3821,7 +3740,15 @@
         </w:numPr>
       </w:pPr>
       <w:r>
-        <w:t>Are strategies currently in place to simultaneously support acquisition and retention? If so, how are they performing and being iterated?</w:t>
+        <w:t xml:space="preserve">Should the definitions of "new," "active," or "churned" users be revised to align more closely with business logic and better reflect true customer </w:t>
+      </w:r>
+      <w:proofErr w:type="spellStart"/>
+      <w:r>
+        <w:t>behavior</w:t>
+      </w:r>
+      <w:proofErr w:type="spellEnd"/>
+      <w:r>
+        <w:t>?</w:t>
       </w:r>
     </w:p>
     <w:p>
@@ -3833,26 +3760,26 @@
         </w:numPr>
       </w:pPr>
       <w:r>
-        <w:t>What improvements can be made to convert initial engagement (e.g., day 0 or week 1 activity) into longer-term usage, such as through onboarding flows, lifecycle messaging, or product nudges?</w:t>
+        <w:t xml:space="preserve">Given the limited timeframe and unusually high retention patterns, is the dataset complete and representative of real user </w:t>
+      </w:r>
+      <w:proofErr w:type="spellStart"/>
+      <w:r>
+        <w:t>behavior</w:t>
+      </w:r>
+      <w:proofErr w:type="spellEnd"/>
+      <w:r>
+        <w:t>, or should its reliability be validated before basing decisions on these trends?</w:t>
       </w:r>
     </w:p>
     <w:p>
       <w:pPr>
-        <w:pStyle w:val="ListParagraph"/>
-        <w:numPr>
-          <w:ilvl w:val="0"/>
-          <w:numId w:val="14"/>
-        </w:numPr>
-      </w:pPr>
-      <w:r>
-        <w:t>Given the sporadic nature of daily acquisition spikes, what mechanisms (e.g., referrals, targeted outreach, event-based campaigns) could help replicate and sustain those surges?</w:t>
-      </w:r>
+        <w:pStyle w:val="Heading1"/>
+      </w:pPr>
     </w:p>
-    <w:p>
-      <w:pPr>
-        <w:pStyle w:val="Heading1"/>
-      </w:pPr>
-    </w:p>
+    <w:p/>
+    <w:p/>
+    <w:p/>
+    <w:p/>
     <w:p>
       <w:pPr>
         <w:pStyle w:val="Heading1"/>
@@ -3860,8 +3787,9 @@
           <w:rFonts w:ascii="Apple Color Emoji" w:hAnsi="Apple Color Emoji" w:cs="Apple Color Emoji"/>
         </w:rPr>
       </w:pPr>
-      <w:bookmarkStart w:id="22" w:name="_Toc201573654"/>
-      <w:r>
+      <w:bookmarkStart w:id="22" w:name="_Toc201584198"/>
+      <w:r>
+        <w:lastRenderedPageBreak/>
         <w:t>Future Enhancements and Scaling Roadmap</w:t>
       </w:r>
       <w:bookmarkEnd w:id="22"/>
@@ -3975,21 +3903,11 @@
             <w:hideMark/>
           </w:tcPr>
           <w:p>
-            <w:proofErr w:type="gramStart"/>
-            <w:r>
-              <w:t>Redshift ,</w:t>
-            </w:r>
-            <w:proofErr w:type="gramEnd"/>
-            <w:r>
-              <w:t xml:space="preserve"> </w:t>
-            </w:r>
-            <w:proofErr w:type="spellStart"/>
-            <w:r>
-              <w:t>BigQuery</w:t>
-            </w:r>
-            <w:proofErr w:type="spellEnd"/>
-            <w:r>
-              <w:t>, Snowflake, Databricks</w:t>
+            <w:r>
+              <w:t xml:space="preserve">Redshift , </w:t>
+            </w:r>
+            <w:r>
+              <w:t>BigQuery, Snowflake, Databricks</w:t>
             </w:r>
           </w:p>
         </w:tc>
@@ -4027,21 +3945,8 @@
           </w:tcPr>
           <w:p>
             <w:r>
-              <w:t xml:space="preserve">Airflow, </w:t>
-            </w:r>
-            <w:proofErr w:type="spellStart"/>
-            <w:r>
-              <w:t>dbt</w:t>
-            </w:r>
-            <w:proofErr w:type="spellEnd"/>
-            <w:r>
-              <w:t xml:space="preserve"> Cloud, </w:t>
-            </w:r>
-            <w:proofErr w:type="spellStart"/>
-            <w:r>
-              <w:t>Dagster</w:t>
-            </w:r>
-            <w:proofErr w:type="spellEnd"/>
+              <w:t>Airflow, dbt Cloud, Dagster</w:t>
+            </w:r>
           </w:p>
         </w:tc>
         <w:tc>
@@ -4051,15 +3956,7 @@
           </w:tcPr>
           <w:p>
             <w:r>
-              <w:t xml:space="preserve">Automates </w:t>
-            </w:r>
-            <w:proofErr w:type="spellStart"/>
-            <w:r>
-              <w:t>dbt</w:t>
-            </w:r>
-            <w:proofErr w:type="spellEnd"/>
-            <w:r>
-              <w:t xml:space="preserve"> runs, testing, dependency management, and alerting</w:t>
+              <w:t>Automates dbt runs, testing, dependency management, and alerting</w:t>
             </w:r>
           </w:p>
         </w:tc>
@@ -4086,13 +3983,8 @@
           </w:tcPr>
           <w:p>
             <w:r>
-              <w:t xml:space="preserve">Looker, Tableau, </w:t>
-            </w:r>
-            <w:proofErr w:type="spellStart"/>
-            <w:r>
-              <w:t>Metabase</w:t>
-            </w:r>
-            <w:proofErr w:type="spellEnd"/>
+              <w:t>Looker, Tableau, Metabase</w:t>
+            </w:r>
           </w:p>
         </w:tc>
         <w:tc>
@@ -4150,7 +4042,7 @@
       <w:pPr>
         <w:pStyle w:val="Heading2"/>
       </w:pPr>
-      <w:bookmarkStart w:id="23" w:name="_Toc201573655"/>
+      <w:bookmarkStart w:id="23" w:name="_Toc201584199"/>
       <w:r>
         <w:t>Planned UI enhancements</w:t>
       </w:r>
@@ -4226,23 +4118,10 @@
         <w:t>role-based access and authentication</w:t>
       </w:r>
       <w:r>
-        <w:t xml:space="preserve"> in the </w:t>
-      </w:r>
-      <w:proofErr w:type="spellStart"/>
-      <w:r>
-        <w:t>Streamlit</w:t>
-      </w:r>
-      <w:proofErr w:type="spellEnd"/>
-      <w:r>
-        <w:t xml:space="preserve"> app using </w:t>
-      </w:r>
-      <w:proofErr w:type="spellStart"/>
-      <w:r>
-        <w:t>streamlit</w:t>
-      </w:r>
-      <w:proofErr w:type="spellEnd"/>
-      <w:r>
-        <w:t>-authenticator</w:t>
+        <w:t xml:space="preserve"> in the Streamlit app using </w:t>
+      </w:r>
+      <w:r>
+        <w:t>streamlit-authenticator</w:t>
       </w:r>
     </w:p>
     <w:p>
@@ -4456,6 +4335,119 @@
     </w:lvl>
   </w:abstractNum>
   <w:abstractNum w:abstractNumId="9" w15:restartNumberingAfterBreak="0">
+    <w:nsid w:val="06EF3980"/>
+    <w:multiLevelType w:val="hybridMultilevel"/>
+    <w:tmpl w:val="52644BEA"/>
+    <w:lvl w:ilvl="0" w:tplc="08090001">
+      <w:start w:val="1"/>
+      <w:numFmt w:val="bullet"/>
+      <w:lvlText w:val=""/>
+      <w:lvlJc w:val="left"/>
+      <w:pPr>
+        <w:ind w:left="720" w:hanging="360"/>
+      </w:pPr>
+      <w:rPr>
+        <w:rFonts w:ascii="Symbol" w:hAnsi="Symbol" w:hint="default"/>
+      </w:rPr>
+    </w:lvl>
+    <w:lvl w:ilvl="1" w:tplc="08090003" w:tentative="1">
+      <w:start w:val="1"/>
+      <w:numFmt w:val="bullet"/>
+      <w:lvlText w:val="o"/>
+      <w:lvlJc w:val="left"/>
+      <w:pPr>
+        <w:ind w:left="1440" w:hanging="360"/>
+      </w:pPr>
+      <w:rPr>
+        <w:rFonts w:ascii="Courier New" w:hAnsi="Courier New" w:cs="Courier New" w:hint="default"/>
+      </w:rPr>
+    </w:lvl>
+    <w:lvl w:ilvl="2" w:tplc="08090005" w:tentative="1">
+      <w:start w:val="1"/>
+      <w:numFmt w:val="bullet"/>
+      <w:lvlText w:val=""/>
+      <w:lvlJc w:val="left"/>
+      <w:pPr>
+        <w:ind w:left="2160" w:hanging="360"/>
+      </w:pPr>
+      <w:rPr>
+        <w:rFonts w:ascii="Wingdings" w:hAnsi="Wingdings" w:hint="default"/>
+      </w:rPr>
+    </w:lvl>
+    <w:lvl w:ilvl="3" w:tplc="08090001" w:tentative="1">
+      <w:start w:val="1"/>
+      <w:numFmt w:val="bullet"/>
+      <w:lvlText w:val=""/>
+      <w:lvlJc w:val="left"/>
+      <w:pPr>
+        <w:ind w:left="2880" w:hanging="360"/>
+      </w:pPr>
+      <w:rPr>
+        <w:rFonts w:ascii="Symbol" w:hAnsi="Symbol" w:hint="default"/>
+      </w:rPr>
+    </w:lvl>
+    <w:lvl w:ilvl="4" w:tplc="08090003" w:tentative="1">
+      <w:start w:val="1"/>
+      <w:numFmt w:val="bullet"/>
+      <w:lvlText w:val="o"/>
+      <w:lvlJc w:val="left"/>
+      <w:pPr>
+        <w:ind w:left="3600" w:hanging="360"/>
+      </w:pPr>
+      <w:rPr>
+        <w:rFonts w:ascii="Courier New" w:hAnsi="Courier New" w:cs="Courier New" w:hint="default"/>
+      </w:rPr>
+    </w:lvl>
+    <w:lvl w:ilvl="5" w:tplc="08090005" w:tentative="1">
+      <w:start w:val="1"/>
+      <w:numFmt w:val="bullet"/>
+      <w:lvlText w:val=""/>
+      <w:lvlJc w:val="left"/>
+      <w:pPr>
+        <w:ind w:left="4320" w:hanging="360"/>
+      </w:pPr>
+      <w:rPr>
+        <w:rFonts w:ascii="Wingdings" w:hAnsi="Wingdings" w:hint="default"/>
+      </w:rPr>
+    </w:lvl>
+    <w:lvl w:ilvl="6" w:tplc="08090001" w:tentative="1">
+      <w:start w:val="1"/>
+      <w:numFmt w:val="bullet"/>
+      <w:lvlText w:val=""/>
+      <w:lvlJc w:val="left"/>
+      <w:pPr>
+        <w:ind w:left="5040" w:hanging="360"/>
+      </w:pPr>
+      <w:rPr>
+        <w:rFonts w:ascii="Symbol" w:hAnsi="Symbol" w:hint="default"/>
+      </w:rPr>
+    </w:lvl>
+    <w:lvl w:ilvl="7" w:tplc="08090003" w:tentative="1">
+      <w:start w:val="1"/>
+      <w:numFmt w:val="bullet"/>
+      <w:lvlText w:val="o"/>
+      <w:lvlJc w:val="left"/>
+      <w:pPr>
+        <w:ind w:left="5760" w:hanging="360"/>
+      </w:pPr>
+      <w:rPr>
+        <w:rFonts w:ascii="Courier New" w:hAnsi="Courier New" w:cs="Courier New" w:hint="default"/>
+      </w:rPr>
+    </w:lvl>
+    <w:lvl w:ilvl="8" w:tplc="08090005" w:tentative="1">
+      <w:start w:val="1"/>
+      <w:numFmt w:val="bullet"/>
+      <w:lvlText w:val=""/>
+      <w:lvlJc w:val="left"/>
+      <w:pPr>
+        <w:ind w:left="6480" w:hanging="360"/>
+      </w:pPr>
+      <w:rPr>
+        <w:rFonts w:ascii="Wingdings" w:hAnsi="Wingdings" w:hint="default"/>
+      </w:rPr>
+    </w:lvl>
+  </w:abstractNum>
+  <w:abstractNum w:abstractNumId="10" w15:restartNumberingAfterBreak="0">
     <w:nsid w:val="113844B2"/>
     <w:multiLevelType w:val="multilevel"/>
     <w:tmpl w:val="4A32E96E"/>
@@ -4604,7 +4596,7 @@
       </w:rPr>
     </w:lvl>
   </w:abstractNum>
-  <w:abstractNum w:abstractNumId="10" w15:restartNumberingAfterBreak="0">
+  <w:abstractNum w:abstractNumId="11" w15:restartNumberingAfterBreak="0">
     <w:nsid w:val="16D5300B"/>
     <w:multiLevelType w:val="hybridMultilevel"/>
     <w:tmpl w:val="A15245FC"/>
@@ -4717,7 +4709,120 @@
       </w:rPr>
     </w:lvl>
   </w:abstractNum>
-  <w:abstractNum w:abstractNumId="11" w15:restartNumberingAfterBreak="0">
+  <w:abstractNum w:abstractNumId="12" w15:restartNumberingAfterBreak="0">
+    <w:nsid w:val="1943515E"/>
+    <w:multiLevelType w:val="hybridMultilevel"/>
+    <w:tmpl w:val="92EE1980"/>
+    <w:lvl w:ilvl="0" w:tplc="08090001">
+      <w:start w:val="1"/>
+      <w:numFmt w:val="bullet"/>
+      <w:lvlText w:val=""/>
+      <w:lvlJc w:val="left"/>
+      <w:pPr>
+        <w:ind w:left="720" w:hanging="360"/>
+      </w:pPr>
+      <w:rPr>
+        <w:rFonts w:ascii="Symbol" w:hAnsi="Symbol" w:hint="default"/>
+      </w:rPr>
+    </w:lvl>
+    <w:lvl w:ilvl="1" w:tplc="08090003" w:tentative="1">
+      <w:start w:val="1"/>
+      <w:numFmt w:val="bullet"/>
+      <w:lvlText w:val="o"/>
+      <w:lvlJc w:val="left"/>
+      <w:pPr>
+        <w:ind w:left="1440" w:hanging="360"/>
+      </w:pPr>
+      <w:rPr>
+        <w:rFonts w:ascii="Courier New" w:hAnsi="Courier New" w:cs="Courier New" w:hint="default"/>
+      </w:rPr>
+    </w:lvl>
+    <w:lvl w:ilvl="2" w:tplc="08090005" w:tentative="1">
+      <w:start w:val="1"/>
+      <w:numFmt w:val="bullet"/>
+      <w:lvlText w:val=""/>
+      <w:lvlJc w:val="left"/>
+      <w:pPr>
+        <w:ind w:left="2160" w:hanging="360"/>
+      </w:pPr>
+      <w:rPr>
+        <w:rFonts w:ascii="Wingdings" w:hAnsi="Wingdings" w:hint="default"/>
+      </w:rPr>
+    </w:lvl>
+    <w:lvl w:ilvl="3" w:tplc="08090001" w:tentative="1">
+      <w:start w:val="1"/>
+      <w:numFmt w:val="bullet"/>
+      <w:lvlText w:val=""/>
+      <w:lvlJc w:val="left"/>
+      <w:pPr>
+        <w:ind w:left="2880" w:hanging="360"/>
+      </w:pPr>
+      <w:rPr>
+        <w:rFonts w:ascii="Symbol" w:hAnsi="Symbol" w:hint="default"/>
+      </w:rPr>
+    </w:lvl>
+    <w:lvl w:ilvl="4" w:tplc="08090003" w:tentative="1">
+      <w:start w:val="1"/>
+      <w:numFmt w:val="bullet"/>
+      <w:lvlText w:val="o"/>
+      <w:lvlJc w:val="left"/>
+      <w:pPr>
+        <w:ind w:left="3600" w:hanging="360"/>
+      </w:pPr>
+      <w:rPr>
+        <w:rFonts w:ascii="Courier New" w:hAnsi="Courier New" w:cs="Courier New" w:hint="default"/>
+      </w:rPr>
+    </w:lvl>
+    <w:lvl w:ilvl="5" w:tplc="08090005" w:tentative="1">
+      <w:start w:val="1"/>
+      <w:numFmt w:val="bullet"/>
+      <w:lvlText w:val=""/>
+      <w:lvlJc w:val="left"/>
+      <w:pPr>
+        <w:ind w:left="4320" w:hanging="360"/>
+      </w:pPr>
+      <w:rPr>
+        <w:rFonts w:ascii="Wingdings" w:hAnsi="Wingdings" w:hint="default"/>
+      </w:rPr>
+    </w:lvl>
+    <w:lvl w:ilvl="6" w:tplc="08090001" w:tentative="1">
+      <w:start w:val="1"/>
+      <w:numFmt w:val="bullet"/>
+      <w:lvlText w:val=""/>
+      <w:lvlJc w:val="left"/>
+      <w:pPr>
+        <w:ind w:left="5040" w:hanging="360"/>
+      </w:pPr>
+      <w:rPr>
+        <w:rFonts w:ascii="Symbol" w:hAnsi="Symbol" w:hint="default"/>
+      </w:rPr>
+    </w:lvl>
+    <w:lvl w:ilvl="7" w:tplc="08090003" w:tentative="1">
+      <w:start w:val="1"/>
+      <w:numFmt w:val="bullet"/>
+      <w:lvlText w:val="o"/>
+      <w:lvlJc w:val="left"/>
+      <w:pPr>
+        <w:ind w:left="5760" w:hanging="360"/>
+      </w:pPr>
+      <w:rPr>
+        <w:rFonts w:ascii="Courier New" w:hAnsi="Courier New" w:cs="Courier New" w:hint="default"/>
+      </w:rPr>
+    </w:lvl>
+    <w:lvl w:ilvl="8" w:tplc="08090005" w:tentative="1">
+      <w:start w:val="1"/>
+      <w:numFmt w:val="bullet"/>
+      <w:lvlText w:val=""/>
+      <w:lvlJc w:val="left"/>
+      <w:pPr>
+        <w:ind w:left="6480" w:hanging="360"/>
+      </w:pPr>
+      <w:rPr>
+        <w:rFonts w:ascii="Wingdings" w:hAnsi="Wingdings" w:hint="default"/>
+      </w:rPr>
+    </w:lvl>
+  </w:abstractNum>
+  <w:abstractNum w:abstractNumId="13" w15:restartNumberingAfterBreak="0">
     <w:nsid w:val="209F2B09"/>
     <w:multiLevelType w:val="hybridMultilevel"/>
     <w:tmpl w:val="89B2E68A"/>
@@ -4830,7 +4935,7 @@
       </w:rPr>
     </w:lvl>
   </w:abstractNum>
-  <w:abstractNum w:abstractNumId="12" w15:restartNumberingAfterBreak="0">
+  <w:abstractNum w:abstractNumId="14" w15:restartNumberingAfterBreak="0">
     <w:nsid w:val="28590DB8"/>
     <w:multiLevelType w:val="hybridMultilevel"/>
     <w:tmpl w:val="E7A2C7D4"/>
@@ -4943,7 +5048,7 @@
       </w:rPr>
     </w:lvl>
   </w:abstractNum>
-  <w:abstractNum w:abstractNumId="13" w15:restartNumberingAfterBreak="0">
+  <w:abstractNum w:abstractNumId="15" w15:restartNumberingAfterBreak="0">
     <w:nsid w:val="3EAB6635"/>
     <w:multiLevelType w:val="multilevel"/>
     <w:tmpl w:val="8064EBB0"/>
@@ -5092,7 +5197,7 @@
       </w:rPr>
     </w:lvl>
   </w:abstractNum>
-  <w:abstractNum w:abstractNumId="14" w15:restartNumberingAfterBreak="0">
+  <w:abstractNum w:abstractNumId="16" w15:restartNumberingAfterBreak="0">
     <w:nsid w:val="47C63428"/>
     <w:multiLevelType w:val="hybridMultilevel"/>
     <w:tmpl w:val="1FC42958"/>
@@ -5205,7 +5310,156 @@
       </w:rPr>
     </w:lvl>
   </w:abstractNum>
-  <w:abstractNum w:abstractNumId="15" w15:restartNumberingAfterBreak="0">
+  <w:abstractNum w:abstractNumId="17" w15:restartNumberingAfterBreak="0">
+    <w:nsid w:val="4F8A1E39"/>
+    <w:multiLevelType w:val="multilevel"/>
+    <w:tmpl w:val="60680DB0"/>
+    <w:lvl w:ilvl="0">
+      <w:start w:val="1"/>
+      <w:numFmt w:val="bullet"/>
+      <w:lvlText w:val=""/>
+      <w:lvlJc w:val="left"/>
+      <w:pPr>
+        <w:tabs>
+          <w:tab w:val="num" w:pos="720"/>
+        </w:tabs>
+        <w:ind w:left="720" w:hanging="360"/>
+      </w:pPr>
+      <w:rPr>
+        <w:rFonts w:ascii="Symbol" w:hAnsi="Symbol" w:hint="default"/>
+        <w:sz w:val="20"/>
+      </w:rPr>
+    </w:lvl>
+    <w:lvl w:ilvl="1" w:tentative="1">
+      <w:start w:val="1"/>
+      <w:numFmt w:val="bullet"/>
+      <w:lvlText w:val="o"/>
+      <w:lvlJc w:val="left"/>
+      <w:pPr>
+        <w:tabs>
+          <w:tab w:val="num" w:pos="1440"/>
+        </w:tabs>
+        <w:ind w:left="1440" w:hanging="360"/>
+      </w:pPr>
+      <w:rPr>
+        <w:rFonts w:ascii="Courier New" w:hAnsi="Courier New" w:hint="default"/>
+        <w:sz w:val="20"/>
+      </w:rPr>
+    </w:lvl>
+    <w:lvl w:ilvl="2" w:tentative="1">
+      <w:start w:val="1"/>
+      <w:numFmt w:val="bullet"/>
+      <w:lvlText w:val=""/>
+      <w:lvlJc w:val="left"/>
+      <w:pPr>
+        <w:tabs>
+          <w:tab w:val="num" w:pos="2160"/>
+        </w:tabs>
+        <w:ind w:left="2160" w:hanging="360"/>
+      </w:pPr>
+      <w:rPr>
+        <w:rFonts w:ascii="Wingdings" w:hAnsi="Wingdings" w:hint="default"/>
+        <w:sz w:val="20"/>
+      </w:rPr>
+    </w:lvl>
+    <w:lvl w:ilvl="3" w:tentative="1">
+      <w:start w:val="1"/>
+      <w:numFmt w:val="bullet"/>
+      <w:lvlText w:val=""/>
+      <w:lvlJc w:val="left"/>
+      <w:pPr>
+        <w:tabs>
+          <w:tab w:val="num" w:pos="2880"/>
+        </w:tabs>
+        <w:ind w:left="2880" w:hanging="360"/>
+      </w:pPr>
+      <w:rPr>
+        <w:rFonts w:ascii="Wingdings" w:hAnsi="Wingdings" w:hint="default"/>
+        <w:sz w:val="20"/>
+      </w:rPr>
+    </w:lvl>
+    <w:lvl w:ilvl="4" w:tentative="1">
+      <w:start w:val="1"/>
+      <w:numFmt w:val="bullet"/>
+      <w:lvlText w:val=""/>
+      <w:lvlJc w:val="left"/>
+      <w:pPr>
+        <w:tabs>
+          <w:tab w:val="num" w:pos="3600"/>
+        </w:tabs>
+        <w:ind w:left="3600" w:hanging="360"/>
+      </w:pPr>
+      <w:rPr>
+        <w:rFonts w:ascii="Wingdings" w:hAnsi="Wingdings" w:hint="default"/>
+        <w:sz w:val="20"/>
+      </w:rPr>
+    </w:lvl>
+    <w:lvl w:ilvl="5" w:tentative="1">
+      <w:start w:val="1"/>
+      <w:numFmt w:val="bullet"/>
+      <w:lvlText w:val=""/>
+      <w:lvlJc w:val="left"/>
+      <w:pPr>
+        <w:tabs>
+          <w:tab w:val="num" w:pos="4320"/>
+        </w:tabs>
+        <w:ind w:left="4320" w:hanging="360"/>
+      </w:pPr>
+      <w:rPr>
+        <w:rFonts w:ascii="Wingdings" w:hAnsi="Wingdings" w:hint="default"/>
+        <w:sz w:val="20"/>
+      </w:rPr>
+    </w:lvl>
+    <w:lvl w:ilvl="6" w:tentative="1">
+      <w:start w:val="1"/>
+      <w:numFmt w:val="bullet"/>
+      <w:lvlText w:val=""/>
+      <w:lvlJc w:val="left"/>
+      <w:pPr>
+        <w:tabs>
+          <w:tab w:val="num" w:pos="5040"/>
+        </w:tabs>
+        <w:ind w:left="5040" w:hanging="360"/>
+      </w:pPr>
+      <w:rPr>
+        <w:rFonts w:ascii="Wingdings" w:hAnsi="Wingdings" w:hint="default"/>
+        <w:sz w:val="20"/>
+      </w:rPr>
+    </w:lvl>
+    <w:lvl w:ilvl="7" w:tentative="1">
+      <w:start w:val="1"/>
+      <w:numFmt w:val="bullet"/>
+      <w:lvlText w:val=""/>
+      <w:lvlJc w:val="left"/>
+      <w:pPr>
+        <w:tabs>
+          <w:tab w:val="num" w:pos="5760"/>
+        </w:tabs>
+        <w:ind w:left="5760" w:hanging="360"/>
+      </w:pPr>
+      <w:rPr>
+        <w:rFonts w:ascii="Wingdings" w:hAnsi="Wingdings" w:hint="default"/>
+        <w:sz w:val="20"/>
+      </w:rPr>
+    </w:lvl>
+    <w:lvl w:ilvl="8" w:tentative="1">
+      <w:start w:val="1"/>
+      <w:numFmt w:val="bullet"/>
+      <w:lvlText w:val=""/>
+      <w:lvlJc w:val="left"/>
+      <w:pPr>
+        <w:tabs>
+          <w:tab w:val="num" w:pos="6480"/>
+        </w:tabs>
+        <w:ind w:left="6480" w:hanging="360"/>
+      </w:pPr>
+      <w:rPr>
+        <w:rFonts w:ascii="Wingdings" w:hAnsi="Wingdings" w:hint="default"/>
+        <w:sz w:val="20"/>
+      </w:rPr>
+    </w:lvl>
+  </w:abstractNum>
+  <w:abstractNum w:abstractNumId="18" w15:restartNumberingAfterBreak="0">
     <w:nsid w:val="56F12039"/>
     <w:multiLevelType w:val="multilevel"/>
     <w:tmpl w:val="E9482D4E"/>
@@ -5354,7 +5608,7 @@
       </w:rPr>
     </w:lvl>
   </w:abstractNum>
-  <w:abstractNum w:abstractNumId="16" w15:restartNumberingAfterBreak="0">
+  <w:abstractNum w:abstractNumId="19" w15:restartNumberingAfterBreak="0">
     <w:nsid w:val="599F67BA"/>
     <w:multiLevelType w:val="hybridMultilevel"/>
     <w:tmpl w:val="61B4BAD0"/>
@@ -5474,28 +5728,37 @@
     <w:abstractNumId w:val="0"/>
   </w:num>
   <w:num w:numId="10" w16cid:durableId="1692994770">
+    <w:abstractNumId w:val="19"/>
+  </w:num>
+  <w:num w:numId="11" w16cid:durableId="874269845">
+    <w:abstractNumId w:val="18"/>
+  </w:num>
+  <w:num w:numId="12" w16cid:durableId="118309106">
     <w:abstractNumId w:val="16"/>
   </w:num>
-  <w:num w:numId="11" w16cid:durableId="874269845">
+  <w:num w:numId="13" w16cid:durableId="1088382983">
+    <w:abstractNumId w:val="14"/>
+  </w:num>
+  <w:num w:numId="14" w16cid:durableId="368147521">
+    <w:abstractNumId w:val="13"/>
+  </w:num>
+  <w:num w:numId="15" w16cid:durableId="742336721">
+    <w:abstractNumId w:val="11"/>
+  </w:num>
+  <w:num w:numId="16" w16cid:durableId="1324046926">
+    <w:abstractNumId w:val="10"/>
+  </w:num>
+  <w:num w:numId="17" w16cid:durableId="1063262301">
     <w:abstractNumId w:val="15"/>
   </w:num>
-  <w:num w:numId="12" w16cid:durableId="118309106">
-    <w:abstractNumId w:val="14"/>
+  <w:num w:numId="18" w16cid:durableId="1066106748">
+    <w:abstractNumId w:val="17"/>
   </w:num>
-  <w:num w:numId="13" w16cid:durableId="1088382983">
+  <w:num w:numId="19" w16cid:durableId="39791805">
     <w:abstractNumId w:val="12"/>
   </w:num>
-  <w:num w:numId="14" w16cid:durableId="368147521">
-    <w:abstractNumId w:val="11"/>
-  </w:num>
-  <w:num w:numId="15" w16cid:durableId="742336721">
-    <w:abstractNumId w:val="10"/>
-  </w:num>
-  <w:num w:numId="16" w16cid:durableId="1324046926">
+  <w:num w:numId="20" w16cid:durableId="1814983454">
     <w:abstractNumId w:val="9"/>
-  </w:num>
-  <w:num w:numId="17" w16cid:durableId="1063262301">
-    <w:abstractNumId w:val="13"/>
   </w:num>
 </w:numbering>
 </file>
@@ -5889,7 +6152,16 @@
   <w:style w:type="paragraph" w:default="1" w:styleId="Normal">
     <w:name w:val="Normal"/>
     <w:qFormat/>
-    <w:rsid w:val="00FC693F"/>
+    <w:rsid w:val="005F5FFC"/>
+    <w:pPr>
+      <w:spacing w:after="0" w:line="240" w:lineRule="auto"/>
+    </w:pPr>
+    <w:rPr>
+      <w:rFonts w:ascii="Times New Roman" w:eastAsia="Times New Roman" w:hAnsi="Times New Roman" w:cs="Times New Roman"/>
+      <w:sz w:val="24"/>
+      <w:szCs w:val="24"/>
+      <w:lang w:val="en-IN" w:eastAsia="en-GB"/>
+    </w:rPr>
   </w:style>
   <w:style w:type="paragraph" w:styleId="Heading1">
     <w:name w:val="heading 1"/>
@@ -5902,7 +6174,7 @@
     <w:pPr>
       <w:keepNext/>
       <w:keepLines/>
-      <w:spacing w:before="480" w:after="0"/>
+      <w:spacing w:before="480"/>
       <w:outlineLvl w:val="0"/>
     </w:pPr>
     <w:rPr>
@@ -5926,7 +6198,7 @@
     <w:pPr>
       <w:keepNext/>
       <w:keepLines/>
-      <w:spacing w:before="200" w:after="0"/>
+      <w:spacing w:before="200"/>
       <w:outlineLvl w:val="1"/>
     </w:pPr>
     <w:rPr>
@@ -5950,7 +6222,7 @@
     <w:pPr>
       <w:keepNext/>
       <w:keepLines/>
-      <w:spacing w:before="200" w:after="0"/>
+      <w:spacing w:before="200"/>
       <w:outlineLvl w:val="2"/>
     </w:pPr>
     <w:rPr>
@@ -5973,7 +6245,7 @@
     <w:pPr>
       <w:keepNext/>
       <w:keepLines/>
-      <w:spacing w:before="200" w:after="0"/>
+      <w:spacing w:before="200"/>
       <w:outlineLvl w:val="3"/>
     </w:pPr>
     <w:rPr>
@@ -5998,7 +6270,7 @@
     <w:pPr>
       <w:keepNext/>
       <w:keepLines/>
-      <w:spacing w:before="200" w:after="0"/>
+      <w:spacing w:before="200"/>
       <w:outlineLvl w:val="4"/>
     </w:pPr>
     <w:rPr>
@@ -6019,7 +6291,7 @@
     <w:pPr>
       <w:keepNext/>
       <w:keepLines/>
-      <w:spacing w:before="200" w:after="0"/>
+      <w:spacing w:before="200"/>
       <w:outlineLvl w:val="5"/>
     </w:pPr>
     <w:rPr>
@@ -6042,7 +6314,7 @@
     <w:pPr>
       <w:keepNext/>
       <w:keepLines/>
-      <w:spacing w:before="200" w:after="0"/>
+      <w:spacing w:before="200"/>
       <w:outlineLvl w:val="6"/>
     </w:pPr>
     <w:rPr>
@@ -6065,7 +6337,7 @@
     <w:pPr>
       <w:keepNext/>
       <w:keepLines/>
-      <w:spacing w:before="200" w:after="0"/>
+      <w:spacing w:before="200"/>
       <w:outlineLvl w:val="7"/>
     </w:pPr>
     <w:rPr>
@@ -6088,7 +6360,7 @@
     <w:pPr>
       <w:keepNext/>
       <w:keepLines/>
-      <w:spacing w:before="200" w:after="0"/>
+      <w:spacing w:before="200"/>
       <w:outlineLvl w:val="8"/>
     </w:pPr>
     <w:rPr>
@@ -6139,7 +6411,6 @@
         <w:tab w:val="center" w:pos="4680"/>
         <w:tab w:val="right" w:pos="9360"/>
       </w:tabs>
-      <w:spacing w:after="0" w:line="240" w:lineRule="auto"/>
     </w:pPr>
   </w:style>
   <w:style w:type="character" w:customStyle="1" w:styleId="HeaderChar">
@@ -6161,7 +6432,6 @@
         <w:tab w:val="center" w:pos="4680"/>
         <w:tab w:val="right" w:pos="9360"/>
       </w:tabs>
-      <w:spacing w:after="0" w:line="240" w:lineRule="auto"/>
     </w:pPr>
   </w:style>
   <w:style w:type="character" w:customStyle="1" w:styleId="FooterChar">
@@ -6235,7 +6505,7 @@
       <w:pBdr>
         <w:bottom w:val="single" w:sz="8" w:space="4" w:color="4F81BD" w:themeColor="accent1"/>
       </w:pBdr>
-      <w:spacing w:after="300" w:line="240" w:lineRule="auto"/>
+      <w:spacing w:after="300"/>
       <w:contextualSpacing/>
     </w:pPr>
     <w:rPr>
@@ -6281,8 +6551,6 @@
       <w:iCs/>
       <w:color w:val="4F81BD" w:themeColor="accent1"/>
       <w:spacing w:val="15"/>
-      <w:sz w:val="24"/>
-      <w:szCs w:val="24"/>
     </w:rPr>
   </w:style>
   <w:style w:type="character" w:customStyle="1" w:styleId="SubtitleChar">
@@ -6677,9 +6945,6 @@
     <w:unhideWhenUsed/>
     <w:qFormat/>
     <w:rsid w:val="00FC693F"/>
-    <w:pPr>
-      <w:spacing w:line="240" w:lineRule="auto"/>
-    </w:pPr>
     <w:rPr>
       <w:b/>
       <w:bCs/>
@@ -16985,14 +17250,8 @@
     <w:unhideWhenUsed/>
     <w:rsid w:val="003272AF"/>
     <w:pPr>
-      <w:spacing w:before="100" w:beforeAutospacing="1" w:after="100" w:afterAutospacing="1" w:line="240" w:lineRule="auto"/>
+      <w:spacing w:before="100" w:beforeAutospacing="1" w:after="100" w:afterAutospacing="1"/>
     </w:pPr>
-    <w:rPr>
-      <w:rFonts w:ascii="Times New Roman" w:eastAsia="Times New Roman" w:hAnsi="Times New Roman" w:cs="Times New Roman"/>
-      <w:sz w:val="24"/>
-      <w:szCs w:val="24"/>
-      <w:lang w:val="en-IN" w:eastAsia="en-GB"/>
-    </w:rPr>
   </w:style>
   <w:style w:type="character" w:styleId="HTMLCode">
     <w:name w:val="HTML Code"/>

</xml_diff>

<commit_message>
docs: update HeyMax Analytics documentation in DOCX and PDF formats
</commit_message>
<xml_diff>
--- a/heymax_documentation/HeyMax_Analytics_Documentation.docx
+++ b/heymax_documentation/HeyMax_Analytics_Documentation.docx
@@ -5,6 +5,7 @@
     <w:p>
       <w:pPr>
         <w:pStyle w:val="Title"/>
+        <w:spacing w:line="276" w:lineRule="auto"/>
       </w:pPr>
       <w:proofErr w:type="spellStart"/>
       <w:r>
@@ -43,6 +44,7 @@
         <w:p>
           <w:pPr>
             <w:pStyle w:val="TOCHeading"/>
+            <w:spacing w:line="276" w:lineRule="auto"/>
           </w:pPr>
           <w:r>
             <w:t>Table of Contents</w:t>
@@ -55,6 +57,7 @@
               <w:tab w:val="right" w:leader="dot" w:pos="8630"/>
             </w:tabs>
             <w:rPr>
+              <w:rFonts w:asciiTheme="minorHAnsi" w:eastAsiaTheme="minorEastAsia" w:hAnsiTheme="minorHAnsi" w:cstheme="minorBidi"/>
               <w:noProof/>
               <w:kern w:val="2"/>
               <w14:ligatures w14:val="standardContextual"/>
@@ -69,7 +72,7 @@
           <w:r>
             <w:fldChar w:fldCharType="separate"/>
           </w:r>
-          <w:hyperlink w:anchor="_Toc201584176" w:history="1">
+          <w:hyperlink w:anchor="_Toc201585116" w:history="1">
             <w:r>
               <w:rPr>
                 <w:rStyle w:val="Hyperlink"/>
@@ -97,7 +100,7 @@
                 <w:noProof/>
                 <w:webHidden/>
               </w:rPr>
-              <w:instrText xml:space="preserve"> PAGEREF _Toc201584176 \h </w:instrText>
+              <w:instrText xml:space="preserve"> PAGEREF _Toc201585116 \h </w:instrText>
             </w:r>
             <w:r>
               <w:rPr>
@@ -135,12 +138,13 @@
               <w:tab w:val="right" w:leader="dot" w:pos="8630"/>
             </w:tabs>
             <w:rPr>
+              <w:rFonts w:asciiTheme="minorHAnsi" w:eastAsiaTheme="minorEastAsia" w:hAnsiTheme="minorHAnsi" w:cstheme="minorBidi"/>
               <w:noProof/>
               <w:kern w:val="2"/>
               <w14:ligatures w14:val="standardContextual"/>
             </w:rPr>
           </w:pPr>
-          <w:hyperlink w:anchor="_Toc201584177" w:history="1">
+          <w:hyperlink w:anchor="_Toc201585117" w:history="1">
             <w:r>
               <w:rPr>
                 <w:rStyle w:val="Hyperlink"/>
@@ -168,7 +172,7 @@
                 <w:noProof/>
                 <w:webHidden/>
               </w:rPr>
-              <w:instrText xml:space="preserve"> PAGEREF _Toc201584177 \h </w:instrText>
+              <w:instrText xml:space="preserve"> PAGEREF _Toc201585117 \h </w:instrText>
             </w:r>
             <w:r>
               <w:rPr>
@@ -206,12 +210,13 @@
               <w:tab w:val="right" w:leader="dot" w:pos="8630"/>
             </w:tabs>
             <w:rPr>
+              <w:rFonts w:asciiTheme="minorHAnsi" w:eastAsiaTheme="minorEastAsia" w:hAnsiTheme="minorHAnsi" w:cstheme="minorBidi"/>
               <w:noProof/>
               <w:kern w:val="2"/>
               <w14:ligatures w14:val="standardContextual"/>
             </w:rPr>
           </w:pPr>
-          <w:hyperlink w:anchor="_Toc201584178" w:history="1">
+          <w:hyperlink w:anchor="_Toc201585118" w:history="1">
             <w:r>
               <w:rPr>
                 <w:rStyle w:val="Hyperlink"/>
@@ -239,7 +244,7 @@
                 <w:noProof/>
                 <w:webHidden/>
               </w:rPr>
-              <w:instrText xml:space="preserve"> PAGEREF _Toc201584178 \h </w:instrText>
+              <w:instrText xml:space="preserve"> PAGEREF _Toc201585118 \h </w:instrText>
             </w:r>
             <w:r>
               <w:rPr>
@@ -277,12 +282,13 @@
               <w:tab w:val="right" w:leader="dot" w:pos="8630"/>
             </w:tabs>
             <w:rPr>
+              <w:rFonts w:asciiTheme="minorHAnsi" w:eastAsiaTheme="minorEastAsia" w:hAnsiTheme="minorHAnsi" w:cstheme="minorBidi"/>
               <w:noProof/>
               <w:kern w:val="2"/>
               <w14:ligatures w14:val="standardContextual"/>
             </w:rPr>
           </w:pPr>
-          <w:hyperlink w:anchor="_Toc201584179" w:history="1">
+          <w:hyperlink w:anchor="_Toc201585119" w:history="1">
             <w:r>
               <w:rPr>
                 <w:rStyle w:val="Hyperlink"/>
@@ -310,7 +316,7 @@
                 <w:noProof/>
                 <w:webHidden/>
               </w:rPr>
-              <w:instrText xml:space="preserve"> PAGEREF _Toc201584179 \h </w:instrText>
+              <w:instrText xml:space="preserve"> PAGEREF _Toc201585119 \h </w:instrText>
             </w:r>
             <w:r>
               <w:rPr>
@@ -348,12 +354,13 @@
               <w:tab w:val="right" w:leader="dot" w:pos="8630"/>
             </w:tabs>
             <w:rPr>
+              <w:rFonts w:asciiTheme="minorHAnsi" w:eastAsiaTheme="minorEastAsia" w:hAnsiTheme="minorHAnsi" w:cstheme="minorBidi"/>
               <w:noProof/>
               <w:kern w:val="2"/>
               <w14:ligatures w14:val="standardContextual"/>
             </w:rPr>
           </w:pPr>
-          <w:hyperlink w:anchor="_Toc201584180" w:history="1">
+          <w:hyperlink w:anchor="_Toc201585120" w:history="1">
             <w:r>
               <w:rPr>
                 <w:rStyle w:val="Hyperlink"/>
@@ -381,7 +388,7 @@
                 <w:noProof/>
                 <w:webHidden/>
               </w:rPr>
-              <w:instrText xml:space="preserve"> PAGEREF _Toc201584180 \h </w:instrText>
+              <w:instrText xml:space="preserve"> PAGEREF _Toc201585120 \h </w:instrText>
             </w:r>
             <w:r>
               <w:rPr>
@@ -401,7 +408,7 @@
                 <w:noProof/>
                 <w:webHidden/>
               </w:rPr>
-              <w:t>1</w:t>
+              <w:t>2</w:t>
             </w:r>
             <w:r>
               <w:rPr>
@@ -419,12 +426,13 @@
               <w:tab w:val="right" w:leader="dot" w:pos="8630"/>
             </w:tabs>
             <w:rPr>
+              <w:rFonts w:asciiTheme="minorHAnsi" w:eastAsiaTheme="minorEastAsia" w:hAnsiTheme="minorHAnsi" w:cstheme="minorBidi"/>
               <w:noProof/>
               <w:kern w:val="2"/>
               <w14:ligatures w14:val="standardContextual"/>
             </w:rPr>
           </w:pPr>
-          <w:hyperlink w:anchor="_Toc201584181" w:history="1">
+          <w:hyperlink w:anchor="_Toc201585121" w:history="1">
             <w:r>
               <w:rPr>
                 <w:rStyle w:val="Hyperlink"/>
@@ -452,7 +460,7 @@
                 <w:noProof/>
                 <w:webHidden/>
               </w:rPr>
-              <w:instrText xml:space="preserve"> PAGEREF _Toc201584181 \h </w:instrText>
+              <w:instrText xml:space="preserve"> PAGEREF _Toc201585121 \h </w:instrText>
             </w:r>
             <w:r>
               <w:rPr>
@@ -472,7 +480,7 @@
                 <w:noProof/>
                 <w:webHidden/>
               </w:rPr>
-              <w:t>1</w:t>
+              <w:t>2</w:t>
             </w:r>
             <w:r>
               <w:rPr>
@@ -490,12 +498,13 @@
               <w:tab w:val="right" w:leader="dot" w:pos="8630"/>
             </w:tabs>
             <w:rPr>
+              <w:rFonts w:asciiTheme="minorHAnsi" w:eastAsiaTheme="minorEastAsia" w:hAnsiTheme="minorHAnsi" w:cstheme="minorBidi"/>
               <w:noProof/>
               <w:kern w:val="2"/>
               <w14:ligatures w14:val="standardContextual"/>
             </w:rPr>
           </w:pPr>
-          <w:hyperlink w:anchor="_Toc201584182" w:history="1">
+          <w:hyperlink w:anchor="_Toc201585122" w:history="1">
             <w:r>
               <w:rPr>
                 <w:rStyle w:val="Hyperlink"/>
@@ -523,7 +532,7 @@
                 <w:noProof/>
                 <w:webHidden/>
               </w:rPr>
-              <w:instrText xml:space="preserve"> PAGEREF _Toc201584182 \h </w:instrText>
+              <w:instrText xml:space="preserve"> PAGEREF _Toc201585122 \h </w:instrText>
             </w:r>
             <w:r>
               <w:rPr>
@@ -561,12 +570,13 @@
               <w:tab w:val="right" w:leader="dot" w:pos="8630"/>
             </w:tabs>
             <w:rPr>
+              <w:rFonts w:asciiTheme="minorHAnsi" w:eastAsiaTheme="minorEastAsia" w:hAnsiTheme="minorHAnsi" w:cstheme="minorBidi"/>
               <w:noProof/>
               <w:kern w:val="2"/>
               <w14:ligatures w14:val="standardContextual"/>
             </w:rPr>
           </w:pPr>
-          <w:hyperlink w:anchor="_Toc201584183" w:history="1">
+          <w:hyperlink w:anchor="_Toc201585123" w:history="1">
             <w:r>
               <w:rPr>
                 <w:rStyle w:val="Hyperlink"/>
@@ -594,7 +604,7 @@
                 <w:noProof/>
                 <w:webHidden/>
               </w:rPr>
-              <w:instrText xml:space="preserve"> PAGEREF _Toc201584183 \h </w:instrText>
+              <w:instrText xml:space="preserve"> PAGEREF _Toc201585123 \h </w:instrText>
             </w:r>
             <w:r>
               <w:rPr>
@@ -632,12 +642,13 @@
               <w:tab w:val="right" w:leader="dot" w:pos="8630"/>
             </w:tabs>
             <w:rPr>
+              <w:rFonts w:asciiTheme="minorHAnsi" w:eastAsiaTheme="minorEastAsia" w:hAnsiTheme="minorHAnsi" w:cstheme="minorBidi"/>
               <w:noProof/>
               <w:kern w:val="2"/>
               <w14:ligatures w14:val="standardContextual"/>
             </w:rPr>
           </w:pPr>
-          <w:hyperlink w:anchor="_Toc201584184" w:history="1">
+          <w:hyperlink w:anchor="_Toc201585124" w:history="1">
             <w:r>
               <w:rPr>
                 <w:rStyle w:val="Hyperlink"/>
@@ -665,7 +676,7 @@
                 <w:noProof/>
                 <w:webHidden/>
               </w:rPr>
-              <w:instrText xml:space="preserve"> PAGEREF _Toc201584184 \h </w:instrText>
+              <w:instrText xml:space="preserve"> PAGEREF _Toc201585124 \h </w:instrText>
             </w:r>
             <w:r>
               <w:rPr>
@@ -703,12 +714,13 @@
               <w:tab w:val="right" w:leader="dot" w:pos="8630"/>
             </w:tabs>
             <w:rPr>
+              <w:rFonts w:asciiTheme="minorHAnsi" w:eastAsiaTheme="minorEastAsia" w:hAnsiTheme="minorHAnsi" w:cstheme="minorBidi"/>
               <w:noProof/>
               <w:kern w:val="2"/>
               <w14:ligatures w14:val="standardContextual"/>
             </w:rPr>
           </w:pPr>
-          <w:hyperlink w:anchor="_Toc201584185" w:history="1">
+          <w:hyperlink w:anchor="_Toc201585125" w:history="1">
             <w:r>
               <w:rPr>
                 <w:rStyle w:val="Hyperlink"/>
@@ -736,7 +748,7 @@
                 <w:noProof/>
                 <w:webHidden/>
               </w:rPr>
-              <w:instrText xml:space="preserve"> PAGEREF _Toc201584185 \h </w:instrText>
+              <w:instrText xml:space="preserve"> PAGEREF _Toc201585125 \h </w:instrText>
             </w:r>
             <w:r>
               <w:rPr>
@@ -774,12 +786,13 @@
               <w:tab w:val="right" w:leader="dot" w:pos="8630"/>
             </w:tabs>
             <w:rPr>
+              <w:rFonts w:asciiTheme="minorHAnsi" w:eastAsiaTheme="minorEastAsia" w:hAnsiTheme="minorHAnsi" w:cstheme="minorBidi"/>
               <w:noProof/>
               <w:kern w:val="2"/>
               <w14:ligatures w14:val="standardContextual"/>
             </w:rPr>
           </w:pPr>
-          <w:hyperlink w:anchor="_Toc201584186" w:history="1">
+          <w:hyperlink w:anchor="_Toc201585126" w:history="1">
             <w:r>
               <w:rPr>
                 <w:rStyle w:val="Hyperlink"/>
@@ -807,7 +820,7 @@
                 <w:noProof/>
                 <w:webHidden/>
               </w:rPr>
-              <w:instrText xml:space="preserve"> PAGEREF _Toc201584186 \h </w:instrText>
+              <w:instrText xml:space="preserve"> PAGEREF _Toc201585126 \h </w:instrText>
             </w:r>
             <w:r>
               <w:rPr>
@@ -845,12 +858,13 @@
               <w:tab w:val="right" w:leader="dot" w:pos="8630"/>
             </w:tabs>
             <w:rPr>
+              <w:rFonts w:asciiTheme="minorHAnsi" w:eastAsiaTheme="minorEastAsia" w:hAnsiTheme="minorHAnsi" w:cstheme="minorBidi"/>
               <w:noProof/>
               <w:kern w:val="2"/>
               <w14:ligatures w14:val="standardContextual"/>
             </w:rPr>
           </w:pPr>
-          <w:hyperlink w:anchor="_Toc201584187" w:history="1">
+          <w:hyperlink w:anchor="_Toc201585127" w:history="1">
             <w:r>
               <w:rPr>
                 <w:rStyle w:val="Hyperlink"/>
@@ -878,7 +892,7 @@
                 <w:noProof/>
                 <w:webHidden/>
               </w:rPr>
-              <w:instrText xml:space="preserve"> PAGEREF _Toc201584187 \h </w:instrText>
+              <w:instrText xml:space="preserve"> PAGEREF _Toc201585127 \h </w:instrText>
             </w:r>
             <w:r>
               <w:rPr>
@@ -916,12 +930,13 @@
               <w:tab w:val="right" w:leader="dot" w:pos="8630"/>
             </w:tabs>
             <w:rPr>
+              <w:rFonts w:asciiTheme="minorHAnsi" w:eastAsiaTheme="minorEastAsia" w:hAnsiTheme="minorHAnsi" w:cstheme="minorBidi"/>
               <w:noProof/>
               <w:kern w:val="2"/>
               <w14:ligatures w14:val="standardContextual"/>
             </w:rPr>
           </w:pPr>
-          <w:hyperlink w:anchor="_Toc201584188" w:history="1">
+          <w:hyperlink w:anchor="_Toc201585128" w:history="1">
             <w:r>
               <w:rPr>
                 <w:rStyle w:val="Hyperlink"/>
@@ -949,7 +964,7 @@
                 <w:noProof/>
                 <w:webHidden/>
               </w:rPr>
-              <w:instrText xml:space="preserve"> PAGEREF _Toc201584188 \h </w:instrText>
+              <w:instrText xml:space="preserve"> PAGEREF _Toc201585128 \h </w:instrText>
             </w:r>
             <w:r>
               <w:rPr>
@@ -969,7 +984,7 @@
                 <w:noProof/>
                 <w:webHidden/>
               </w:rPr>
-              <w:t>2</w:t>
+              <w:t>3</w:t>
             </w:r>
             <w:r>
               <w:rPr>
@@ -987,12 +1002,13 @@
               <w:tab w:val="right" w:leader="dot" w:pos="8630"/>
             </w:tabs>
             <w:rPr>
+              <w:rFonts w:asciiTheme="minorHAnsi" w:eastAsiaTheme="minorEastAsia" w:hAnsiTheme="minorHAnsi" w:cstheme="minorBidi"/>
               <w:noProof/>
               <w:kern w:val="2"/>
               <w14:ligatures w14:val="standardContextual"/>
             </w:rPr>
           </w:pPr>
-          <w:hyperlink w:anchor="_Toc201584189" w:history="1">
+          <w:hyperlink w:anchor="_Toc201585129" w:history="1">
             <w:r>
               <w:rPr>
                 <w:rStyle w:val="Hyperlink"/>
@@ -1020,7 +1036,7 @@
                 <w:noProof/>
                 <w:webHidden/>
               </w:rPr>
-              <w:instrText xml:space="preserve"> PAGEREF _Toc201584189 \h </w:instrText>
+              <w:instrText xml:space="preserve"> PAGEREF _Toc201585129 \h </w:instrText>
             </w:r>
             <w:r>
               <w:rPr>
@@ -1040,7 +1056,7 @@
                 <w:noProof/>
                 <w:webHidden/>
               </w:rPr>
-              <w:t>2</w:t>
+              <w:t>3</w:t>
             </w:r>
             <w:r>
               <w:rPr>
@@ -1058,12 +1074,13 @@
               <w:tab w:val="right" w:leader="dot" w:pos="8630"/>
             </w:tabs>
             <w:rPr>
+              <w:rFonts w:asciiTheme="minorHAnsi" w:eastAsiaTheme="minorEastAsia" w:hAnsiTheme="minorHAnsi" w:cstheme="minorBidi"/>
               <w:noProof/>
               <w:kern w:val="2"/>
               <w14:ligatures w14:val="standardContextual"/>
             </w:rPr>
           </w:pPr>
-          <w:hyperlink w:anchor="_Toc201584190" w:history="1">
+          <w:hyperlink w:anchor="_Toc201585130" w:history="1">
             <w:r>
               <w:rPr>
                 <w:rStyle w:val="Hyperlink"/>
@@ -1091,7 +1108,7 @@
                 <w:noProof/>
                 <w:webHidden/>
               </w:rPr>
-              <w:instrText xml:space="preserve"> PAGEREF _Toc201584190 \h </w:instrText>
+              <w:instrText xml:space="preserve"> PAGEREF _Toc201585130 \h </w:instrText>
             </w:r>
             <w:r>
               <w:rPr>
@@ -1111,7 +1128,7 @@
                 <w:noProof/>
                 <w:webHidden/>
               </w:rPr>
-              <w:t>2</w:t>
+              <w:t>3</w:t>
             </w:r>
             <w:r>
               <w:rPr>
@@ -1129,12 +1146,13 @@
               <w:tab w:val="right" w:leader="dot" w:pos="8630"/>
             </w:tabs>
             <w:rPr>
+              <w:rFonts w:asciiTheme="minorHAnsi" w:eastAsiaTheme="minorEastAsia" w:hAnsiTheme="minorHAnsi" w:cstheme="minorBidi"/>
               <w:noProof/>
               <w:kern w:val="2"/>
               <w14:ligatures w14:val="standardContextual"/>
             </w:rPr>
           </w:pPr>
-          <w:hyperlink w:anchor="_Toc201584191" w:history="1">
+          <w:hyperlink w:anchor="_Toc201585131" w:history="1">
             <w:r>
               <w:rPr>
                 <w:rStyle w:val="Hyperlink"/>
@@ -1162,7 +1180,7 @@
                 <w:noProof/>
                 <w:webHidden/>
               </w:rPr>
-              <w:instrText xml:space="preserve"> PAGEREF _Toc201584191 \h </w:instrText>
+              <w:instrText xml:space="preserve"> PAGEREF _Toc201585131 \h </w:instrText>
             </w:r>
             <w:r>
               <w:rPr>
@@ -1200,12 +1218,13 @@
               <w:tab w:val="right" w:leader="dot" w:pos="8630"/>
             </w:tabs>
             <w:rPr>
+              <w:rFonts w:asciiTheme="minorHAnsi" w:eastAsiaTheme="minorEastAsia" w:hAnsiTheme="minorHAnsi" w:cstheme="minorBidi"/>
               <w:noProof/>
               <w:kern w:val="2"/>
               <w14:ligatures w14:val="standardContextual"/>
             </w:rPr>
           </w:pPr>
-          <w:hyperlink w:anchor="_Toc201584192" w:history="1">
+          <w:hyperlink w:anchor="_Toc201585132" w:history="1">
             <w:r>
               <w:rPr>
                 <w:rStyle w:val="Hyperlink"/>
@@ -1233,7 +1252,7 @@
                 <w:noProof/>
                 <w:webHidden/>
               </w:rPr>
-              <w:instrText xml:space="preserve"> PAGEREF _Toc201584192 \h </w:instrText>
+              <w:instrText xml:space="preserve"> PAGEREF _Toc201585132 \h </w:instrText>
             </w:r>
             <w:r>
               <w:rPr>
@@ -1253,7 +1272,7 @@
                 <w:noProof/>
                 <w:webHidden/>
               </w:rPr>
-              <w:t>3</w:t>
+              <w:t>4</w:t>
             </w:r>
             <w:r>
               <w:rPr>
@@ -1271,12 +1290,13 @@
               <w:tab w:val="right" w:leader="dot" w:pos="8630"/>
             </w:tabs>
             <w:rPr>
+              <w:rFonts w:asciiTheme="minorHAnsi" w:eastAsiaTheme="minorEastAsia" w:hAnsiTheme="minorHAnsi" w:cstheme="minorBidi"/>
               <w:noProof/>
               <w:kern w:val="2"/>
               <w14:ligatures w14:val="standardContextual"/>
             </w:rPr>
           </w:pPr>
-          <w:hyperlink w:anchor="_Toc201584193" w:history="1">
+          <w:hyperlink w:anchor="_Toc201585133" w:history="1">
             <w:r>
               <w:rPr>
                 <w:rStyle w:val="Hyperlink"/>
@@ -1304,7 +1324,7 @@
                 <w:noProof/>
                 <w:webHidden/>
               </w:rPr>
-              <w:instrText xml:space="preserve"> PAGEREF _Toc201584193 \h </w:instrText>
+              <w:instrText xml:space="preserve"> PAGEREF _Toc201585133 \h </w:instrText>
             </w:r>
             <w:r>
               <w:rPr>
@@ -1342,12 +1362,13 @@
               <w:tab w:val="right" w:leader="dot" w:pos="8630"/>
             </w:tabs>
             <w:rPr>
+              <w:rFonts w:asciiTheme="minorHAnsi" w:eastAsiaTheme="minorEastAsia" w:hAnsiTheme="minorHAnsi" w:cstheme="minorBidi"/>
               <w:noProof/>
               <w:kern w:val="2"/>
               <w14:ligatures w14:val="standardContextual"/>
             </w:rPr>
           </w:pPr>
-          <w:hyperlink w:anchor="_Toc201584194" w:history="1">
+          <w:hyperlink w:anchor="_Toc201585134" w:history="1">
             <w:r>
               <w:rPr>
                 <w:rStyle w:val="Hyperlink"/>
@@ -1375,7 +1396,7 @@
                 <w:noProof/>
                 <w:webHidden/>
               </w:rPr>
-              <w:instrText xml:space="preserve"> PAGEREF _Toc201584194 \h </w:instrText>
+              <w:instrText xml:space="preserve"> PAGEREF _Toc201585134 \h </w:instrText>
             </w:r>
             <w:r>
               <w:rPr>
@@ -1413,12 +1434,13 @@
               <w:tab w:val="right" w:leader="dot" w:pos="8630"/>
             </w:tabs>
             <w:rPr>
+              <w:rFonts w:asciiTheme="minorHAnsi" w:eastAsiaTheme="minorEastAsia" w:hAnsiTheme="minorHAnsi" w:cstheme="minorBidi"/>
               <w:noProof/>
               <w:kern w:val="2"/>
               <w14:ligatures w14:val="standardContextual"/>
             </w:rPr>
           </w:pPr>
-          <w:hyperlink w:anchor="_Toc201584195" w:history="1">
+          <w:hyperlink w:anchor="_Toc201585135" w:history="1">
             <w:r>
               <w:rPr>
                 <w:rStyle w:val="Hyperlink"/>
@@ -1446,7 +1468,7 @@
                 <w:noProof/>
                 <w:webHidden/>
               </w:rPr>
-              <w:instrText xml:space="preserve"> PAGEREF _Toc201584195 \h </w:instrText>
+              <w:instrText xml:space="preserve"> PAGEREF _Toc201585135 \h </w:instrText>
             </w:r>
             <w:r>
               <w:rPr>
@@ -1484,12 +1506,13 @@
               <w:tab w:val="right" w:leader="dot" w:pos="8630"/>
             </w:tabs>
             <w:rPr>
+              <w:rFonts w:asciiTheme="minorHAnsi" w:eastAsiaTheme="minorEastAsia" w:hAnsiTheme="minorHAnsi" w:cstheme="minorBidi"/>
               <w:noProof/>
               <w:kern w:val="2"/>
               <w14:ligatures w14:val="standardContextual"/>
             </w:rPr>
           </w:pPr>
-          <w:hyperlink w:anchor="_Toc201584196" w:history="1">
+          <w:hyperlink w:anchor="_Toc201585136" w:history="1">
             <w:r>
               <w:rPr>
                 <w:rStyle w:val="Hyperlink"/>
@@ -1517,7 +1540,7 @@
                 <w:noProof/>
                 <w:webHidden/>
               </w:rPr>
-              <w:instrText xml:space="preserve"> PAGEREF _Toc201584196 \h </w:instrText>
+              <w:instrText xml:space="preserve"> PAGEREF _Toc201585136 \h </w:instrText>
             </w:r>
             <w:r>
               <w:rPr>
@@ -1537,7 +1560,7 @@
                 <w:noProof/>
                 <w:webHidden/>
               </w:rPr>
-              <w:t>4</w:t>
+              <w:t>5</w:t>
             </w:r>
             <w:r>
               <w:rPr>
@@ -1555,12 +1578,13 @@
               <w:tab w:val="right" w:leader="dot" w:pos="8630"/>
             </w:tabs>
             <w:rPr>
+              <w:rFonts w:asciiTheme="minorHAnsi" w:eastAsiaTheme="minorEastAsia" w:hAnsiTheme="minorHAnsi" w:cstheme="minorBidi"/>
               <w:noProof/>
               <w:kern w:val="2"/>
               <w14:ligatures w14:val="standardContextual"/>
             </w:rPr>
           </w:pPr>
-          <w:hyperlink w:anchor="_Toc201584197" w:history="1">
+          <w:hyperlink w:anchor="_Toc201585137" w:history="1">
             <w:r>
               <w:rPr>
                 <w:rStyle w:val="Hyperlink"/>
@@ -1588,7 +1612,7 @@
                 <w:noProof/>
                 <w:webHidden/>
               </w:rPr>
-              <w:instrText xml:space="preserve"> PAGEREF _Toc201584197 \h </w:instrText>
+              <w:instrText xml:space="preserve"> PAGEREF _Toc201585137 \h </w:instrText>
             </w:r>
             <w:r>
               <w:rPr>
@@ -1608,7 +1632,7 @@
                 <w:noProof/>
                 <w:webHidden/>
               </w:rPr>
-              <w:t>5</w:t>
+              <w:t>6</w:t>
             </w:r>
             <w:r>
               <w:rPr>
@@ -1626,12 +1650,13 @@
               <w:tab w:val="right" w:leader="dot" w:pos="8630"/>
             </w:tabs>
             <w:rPr>
+              <w:rFonts w:asciiTheme="minorHAnsi" w:eastAsiaTheme="minorEastAsia" w:hAnsiTheme="minorHAnsi" w:cstheme="minorBidi"/>
               <w:noProof/>
               <w:kern w:val="2"/>
               <w14:ligatures w14:val="standardContextual"/>
             </w:rPr>
           </w:pPr>
-          <w:hyperlink w:anchor="_Toc201584198" w:history="1">
+          <w:hyperlink w:anchor="_Toc201585138" w:history="1">
             <w:r>
               <w:rPr>
                 <w:rStyle w:val="Hyperlink"/>
@@ -1659,7 +1684,7 @@
                 <w:noProof/>
                 <w:webHidden/>
               </w:rPr>
-              <w:instrText xml:space="preserve"> PAGEREF _Toc201584198 \h </w:instrText>
+              <w:instrText xml:space="preserve"> PAGEREF _Toc201585138 \h </w:instrText>
             </w:r>
             <w:r>
               <w:rPr>
@@ -1679,7 +1704,7 @@
                 <w:noProof/>
                 <w:webHidden/>
               </w:rPr>
-              <w:t>6</w:t>
+              <w:t>7</w:t>
             </w:r>
             <w:r>
               <w:rPr>
@@ -1697,12 +1722,13 @@
               <w:tab w:val="right" w:leader="dot" w:pos="8630"/>
             </w:tabs>
             <w:rPr>
+              <w:rFonts w:asciiTheme="minorHAnsi" w:eastAsiaTheme="minorEastAsia" w:hAnsiTheme="minorHAnsi" w:cstheme="minorBidi"/>
               <w:noProof/>
               <w:kern w:val="2"/>
               <w14:ligatures w14:val="standardContextual"/>
             </w:rPr>
           </w:pPr>
-          <w:hyperlink w:anchor="_Toc201584199" w:history="1">
+          <w:hyperlink w:anchor="_Toc201585139" w:history="1">
             <w:r>
               <w:rPr>
                 <w:rStyle w:val="Hyperlink"/>
@@ -1730,7 +1756,7 @@
                 <w:noProof/>
                 <w:webHidden/>
               </w:rPr>
-              <w:instrText xml:space="preserve"> PAGEREF _Toc201584199 \h </w:instrText>
+              <w:instrText xml:space="preserve"> PAGEREF _Toc201585139 \h </w:instrText>
             </w:r>
             <w:r>
               <w:rPr>
@@ -1750,7 +1776,7 @@
                 <w:noProof/>
                 <w:webHidden/>
               </w:rPr>
-              <w:t>6</w:t>
+              <w:t>7</w:t>
             </w:r>
             <w:r>
               <w:rPr>
@@ -1762,6 +1788,12 @@
           </w:hyperlink>
         </w:p>
         <w:p>
+          <w:pPr>
+            <w:spacing w:line="276" w:lineRule="auto"/>
+            <w:rPr>
+              <w:noProof/>
+            </w:rPr>
+          </w:pPr>
           <w:r>
             <w:rPr>
               <w:b/>
@@ -1774,28 +1806,46 @@
       </w:sdtContent>
     </w:sdt>
     <w:p>
+      <w:pPr>
+        <w:pStyle w:val="Heading1"/>
+        <w:spacing w:line="276" w:lineRule="auto"/>
+        <w:rPr>
+          <w:noProof/>
+          <w:sz w:val="24"/>
+          <w:szCs w:val="24"/>
+        </w:rPr>
+      </w:pPr>
       <w:r>
         <w:br w:type="page"/>
       </w:r>
-    </w:p>
-    <w:p>
-      <w:pPr>
-        <w:pStyle w:val="Heading1"/>
-      </w:pPr>
-      <w:bookmarkStart w:id="0" w:name="_Toc201584176"/>
-      <w:r>
+      <w:bookmarkStart w:id="0" w:name="_Toc201585116"/>
+      <w:r>
+        <w:rPr>
+          <w:sz w:val="32"/>
+          <w:szCs w:val="32"/>
+        </w:rPr>
         <w:lastRenderedPageBreak/>
         <w:t>Project Overview</w:t>
       </w:r>
       <w:bookmarkEnd w:id="0"/>
     </w:p>
     <w:p>
+      <w:pPr>
+        <w:spacing w:line="276" w:lineRule="auto"/>
+      </w:pPr>
       <w:r>
         <w:t>This project sets up an end-to-end open-source data and analytics pipeline for HeyMax with an interactive analytics dashboard built using Streamlit, DuckDB, and dbt to analyze user lifecycle metrics over time. It supports monthly, weekly, and daily views with charts, retention triangle tables, KPIs, filters, and LLM-based insights.</w:t>
       </w:r>
     </w:p>
-    <w:p/>
     <w:p>
+      <w:pPr>
+        <w:spacing w:line="276" w:lineRule="auto"/>
+      </w:pPr>
+    </w:p>
+    <w:p>
+      <w:pPr>
+        <w:spacing w:line="276" w:lineRule="auto"/>
+      </w:pPr>
       <w:r>
         <w:t xml:space="preserve">Access the live dashboard here: </w:t>
       </w:r>
@@ -1811,8 +1861,9 @@
     <w:p>
       <w:pPr>
         <w:pStyle w:val="Heading1"/>
-      </w:pPr>
-      <w:bookmarkStart w:id="1" w:name="_Toc201584177"/>
+        <w:spacing w:line="276" w:lineRule="auto"/>
+      </w:pPr>
+      <w:bookmarkStart w:id="1" w:name="_Toc201585117"/>
       <w:r>
         <w:t>Features</w:t>
       </w:r>
@@ -1825,6 +1876,7 @@
           <w:tab w:val="clear" w:pos="360"/>
           <w:tab w:val="num" w:pos="720"/>
         </w:tabs>
+        <w:spacing w:line="276" w:lineRule="auto"/>
         <w:ind w:left="720"/>
       </w:pPr>
       <w:r>
@@ -1838,6 +1890,7 @@
           <w:tab w:val="clear" w:pos="360"/>
           <w:tab w:val="num" w:pos="720"/>
         </w:tabs>
+        <w:spacing w:line="276" w:lineRule="auto"/>
         <w:ind w:left="720"/>
       </w:pPr>
       <w:r>
@@ -1859,6 +1912,7 @@
           <w:tab w:val="clear" w:pos="360"/>
           <w:tab w:val="num" w:pos="720"/>
         </w:tabs>
+        <w:spacing w:line="276" w:lineRule="auto"/>
         <w:ind w:left="720"/>
       </w:pPr>
       <w:r>
@@ -1872,6 +1926,7 @@
           <w:tab w:val="clear" w:pos="360"/>
           <w:tab w:val="num" w:pos="720"/>
         </w:tabs>
+        <w:spacing w:line="276" w:lineRule="auto"/>
         <w:ind w:left="720"/>
       </w:pPr>
       <w:r>
@@ -1885,6 +1940,7 @@
           <w:tab w:val="clear" w:pos="360"/>
           <w:tab w:val="num" w:pos="720"/>
         </w:tabs>
+        <w:spacing w:line="276" w:lineRule="auto"/>
         <w:ind w:left="720"/>
       </w:pPr>
       <w:r>
@@ -1898,6 +1954,7 @@
           <w:tab w:val="clear" w:pos="360"/>
           <w:tab w:val="num" w:pos="720"/>
         </w:tabs>
+        <w:spacing w:line="276" w:lineRule="auto"/>
         <w:ind w:left="720"/>
       </w:pPr>
       <w:r>
@@ -1911,6 +1968,7 @@
           <w:tab w:val="clear" w:pos="360"/>
           <w:tab w:val="num" w:pos="720"/>
         </w:tabs>
+        <w:spacing w:line="276" w:lineRule="auto"/>
         <w:ind w:left="720"/>
       </w:pPr>
       <w:r>
@@ -1920,20 +1978,33 @@
     <w:p>
       <w:pPr>
         <w:pStyle w:val="Heading1"/>
-      </w:pPr>
-      <w:bookmarkStart w:id="2" w:name="_Toc201584178"/>
-      <w:r>
+        <w:spacing w:line="276" w:lineRule="auto"/>
+        <w:rPr>
+          <w:sz w:val="32"/>
+          <w:szCs w:val="32"/>
+        </w:rPr>
+      </w:pPr>
+      <w:bookmarkStart w:id="2" w:name="_Toc201585118"/>
+      <w:r>
+        <w:rPr>
+          <w:sz w:val="32"/>
+          <w:szCs w:val="32"/>
+        </w:rPr>
         <w:t>Setup</w:t>
       </w:r>
       <w:bookmarkEnd w:id="2"/>
     </w:p>
     <w:p>
+      <w:pPr>
+        <w:spacing w:line="276" w:lineRule="auto"/>
+      </w:pPr>
       <w:r>
         <w:t xml:space="preserve">To setup the project, please refer to the README.md file: </w:t>
       </w:r>
     </w:p>
     <w:p>
       <w:pPr>
+        <w:spacing w:line="276" w:lineRule="auto"/>
         <w:rPr>
           <w:color w:val="0000FF" w:themeColor="hyperlink"/>
           <w:u w:val="single"/>
@@ -1954,9 +2025,18 @@
     <w:p>
       <w:pPr>
         <w:pStyle w:val="Heading1"/>
-      </w:pPr>
-      <w:bookmarkStart w:id="3" w:name="_Toc201584179"/>
-      <w:r>
+        <w:spacing w:line="276" w:lineRule="auto"/>
+        <w:rPr>
+          <w:sz w:val="32"/>
+          <w:szCs w:val="32"/>
+        </w:rPr>
+      </w:pPr>
+      <w:bookmarkStart w:id="3" w:name="_Toc201585119"/>
+      <w:r>
+        <w:rPr>
+          <w:sz w:val="32"/>
+          <w:szCs w:val="32"/>
+        </w:rPr>
         <w:t>About the Data</w:t>
       </w:r>
       <w:bookmarkEnd w:id="3"/>
@@ -1968,10 +2048,16 @@
           <w:tab w:val="clear" w:pos="360"/>
           <w:tab w:val="num" w:pos="720"/>
         </w:tabs>
+        <w:spacing w:line="276" w:lineRule="auto"/>
         <w:ind w:left="720"/>
       </w:pPr>
-      <w:r>
-        <w:t>event_time: timestamp, needs to be truncated to month</w:t>
+      <w:proofErr w:type="spellStart"/>
+      <w:r>
+        <w:t>event_time</w:t>
+      </w:r>
+      <w:proofErr w:type="spellEnd"/>
+      <w:r>
+        <w:t>: timestamp, needs to be truncated to month</w:t>
       </w:r>
     </w:p>
     <w:p>
@@ -1981,6 +2067,7 @@
           <w:tab w:val="clear" w:pos="360"/>
           <w:tab w:val="num" w:pos="720"/>
         </w:tabs>
+        <w:spacing w:line="276" w:lineRule="auto"/>
         <w:ind w:left="720"/>
       </w:pPr>
       <w:r>
@@ -1994,6 +2081,7 @@
           <w:tab w:val="clear" w:pos="360"/>
           <w:tab w:val="num" w:pos="720"/>
         </w:tabs>
+        <w:spacing w:line="276" w:lineRule="auto"/>
         <w:ind w:left="720"/>
       </w:pPr>
       <w:r>
@@ -2007,6 +2095,7 @@
           <w:tab w:val="clear" w:pos="360"/>
           <w:tab w:val="num" w:pos="720"/>
         </w:tabs>
+        <w:spacing w:line="276" w:lineRule="auto"/>
         <w:ind w:left="720"/>
       </w:pPr>
       <w:proofErr w:type="spellStart"/>
@@ -2025,6 +2114,7 @@
           <w:tab w:val="clear" w:pos="360"/>
           <w:tab w:val="num" w:pos="720"/>
         </w:tabs>
+        <w:spacing w:line="276" w:lineRule="auto"/>
         <w:ind w:left="720"/>
       </w:pPr>
       <w:proofErr w:type="spellStart"/>
@@ -2043,6 +2133,7 @@
           <w:tab w:val="clear" w:pos="360"/>
           <w:tab w:val="num" w:pos="720"/>
         </w:tabs>
+        <w:spacing w:line="276" w:lineRule="auto"/>
         <w:ind w:left="720"/>
       </w:pPr>
       <w:r>
@@ -2060,9 +2151,19 @@
     <w:p>
       <w:pPr>
         <w:pStyle w:val="Heading1"/>
-      </w:pPr>
-      <w:bookmarkStart w:id="4" w:name="_Toc201584180"/>
-      <w:r>
+        <w:spacing w:line="276" w:lineRule="auto"/>
+        <w:rPr>
+          <w:sz w:val="32"/>
+          <w:szCs w:val="32"/>
+        </w:rPr>
+      </w:pPr>
+      <w:bookmarkStart w:id="4" w:name="_Toc201585120"/>
+      <w:r>
+        <w:rPr>
+          <w:sz w:val="32"/>
+          <w:szCs w:val="32"/>
+        </w:rPr>
+        <w:lastRenderedPageBreak/>
         <w:t>Technology Stack</w:t>
       </w:r>
       <w:bookmarkEnd w:id="4"/>
@@ -2070,14 +2171,18 @@
     <w:p>
       <w:pPr>
         <w:pStyle w:val="Heading2"/>
-      </w:pPr>
-      <w:bookmarkStart w:id="5" w:name="_Toc201584181"/>
+        <w:spacing w:line="276" w:lineRule="auto"/>
+      </w:pPr>
+      <w:bookmarkStart w:id="5" w:name="_Toc201585121"/>
       <w:r>
         <w:t>DBT</w:t>
       </w:r>
       <w:bookmarkEnd w:id="5"/>
     </w:p>
     <w:p>
+      <w:pPr>
+        <w:spacing w:line="276" w:lineRule="auto"/>
+      </w:pPr>
       <w:r>
         <w:t xml:space="preserve">DBT enables SQL-based transformation with support for testing, documentation, and scalable DAGs. Use </w:t>
       </w:r>
@@ -2099,23 +2204,41 @@
         <w:t>’</w:t>
       </w:r>
       <w:r>
-        <w:t xml:space="preserve"> to view model docs. Parquet storage, partitioning, and sort keys improve performance in DuckDB.</w:t>
+        <w:t xml:space="preserve"> to view model docs. Parquet storage, partitioning, and sort keys improve performance in </w:t>
+      </w:r>
+      <w:proofErr w:type="spellStart"/>
+      <w:r>
+        <w:t>DuckDB</w:t>
+      </w:r>
+      <w:proofErr w:type="spellEnd"/>
+      <w:r>
+        <w:t>.</w:t>
       </w:r>
     </w:p>
     <w:p>
       <w:pPr>
         <w:pStyle w:val="Heading2"/>
-      </w:pPr>
-      <w:bookmarkStart w:id="6" w:name="_Toc201584182"/>
-      <w:r>
-        <w:lastRenderedPageBreak/>
+        <w:spacing w:line="276" w:lineRule="auto"/>
+      </w:pPr>
+      <w:bookmarkStart w:id="6" w:name="_Toc201585122"/>
+      <w:proofErr w:type="spellStart"/>
+      <w:r>
         <w:t>DuckDB</w:t>
       </w:r>
       <w:bookmarkEnd w:id="6"/>
+      <w:proofErr w:type="spellEnd"/>
     </w:p>
     <w:p>
-      <w:r>
-        <w:t>DuckDB is an OLAP SQL engine ideal for analytical queries. It supports in-memory operations, Parquet IO, and integrates with cloud environments. Query via CLI (</w:t>
+      <w:pPr>
+        <w:spacing w:line="276" w:lineRule="auto"/>
+      </w:pPr>
+      <w:proofErr w:type="spellStart"/>
+      <w:r>
+        <w:t>DuckDB</w:t>
+      </w:r>
+      <w:proofErr w:type="spellEnd"/>
+      <w:r>
+        <w:t xml:space="preserve"> is an OLAP SQL engine ideal for analytical queries. It supports in-memory operations, Parquet IO, and integrates with cloud environments. Query via CLI (</w:t>
       </w:r>
       <w:r>
         <w:rPr>
@@ -2170,23 +2293,35 @@
     <w:p>
       <w:pPr>
         <w:pStyle w:val="Heading2"/>
-      </w:pPr>
-      <w:bookmarkStart w:id="7" w:name="_Toc201584183"/>
+        <w:spacing w:line="276" w:lineRule="auto"/>
+      </w:pPr>
+      <w:bookmarkStart w:id="7" w:name="_Toc201585123"/>
+      <w:proofErr w:type="spellStart"/>
       <w:r>
         <w:t>Streamlit</w:t>
       </w:r>
       <w:bookmarkEnd w:id="7"/>
+      <w:proofErr w:type="spellEnd"/>
     </w:p>
     <w:p>
-      <w:r>
-        <w:t>Streamlit builds interactive Python dashboards rapidly. It supports Python-native components, real-time reactivity, and deploys easily on Streamlit Cloud.</w:t>
+      <w:pPr>
+        <w:spacing w:line="276" w:lineRule="auto"/>
+      </w:pPr>
+      <w:proofErr w:type="spellStart"/>
+      <w:r>
+        <w:t>Streamlit</w:t>
+      </w:r>
+      <w:proofErr w:type="spellEnd"/>
+      <w:r>
+        <w:t xml:space="preserve"> builds interactive Python dashboards rapidly. It supports Python-native components, real-time reactivity, and deploys easily on Streamlit Cloud.</w:t>
       </w:r>
     </w:p>
     <w:p>
       <w:pPr>
         <w:pStyle w:val="Heading2"/>
-      </w:pPr>
-      <w:bookmarkStart w:id="8" w:name="_Toc201584184"/>
+        <w:spacing w:line="276" w:lineRule="auto"/>
+      </w:pPr>
+      <w:bookmarkStart w:id="8" w:name="_Toc201585124"/>
       <w:r>
         <w:t>GitHub Deployment</w:t>
       </w:r>
@@ -2199,6 +2334,7 @@
           <w:ilvl w:val="0"/>
           <w:numId w:val="15"/>
         </w:numPr>
+        <w:spacing w:line="276" w:lineRule="auto"/>
       </w:pPr>
       <w:r>
         <w:t>CI: Executes dbt runs/tests on every commit, emails logs, updates DuckDB, and runs daily at 8am.</w:t>
@@ -2214,6 +2350,7 @@
           <w:ilvl w:val="0"/>
           <w:numId w:val="15"/>
         </w:numPr>
+        <w:spacing w:line="276" w:lineRule="auto"/>
       </w:pPr>
       <w:r>
         <w:t>CD: Uses Streamlit Cloud linked to the repo for zero-touch deployments.</w:t>
@@ -2222,9 +2359,18 @@
     <w:p>
       <w:pPr>
         <w:pStyle w:val="Heading1"/>
-      </w:pPr>
-      <w:bookmarkStart w:id="9" w:name="_Toc201584185"/>
-      <w:r>
+        <w:spacing w:line="276" w:lineRule="auto"/>
+        <w:rPr>
+          <w:sz w:val="32"/>
+          <w:szCs w:val="32"/>
+        </w:rPr>
+      </w:pPr>
+      <w:bookmarkStart w:id="9" w:name="_Toc201585125"/>
+      <w:r>
+        <w:rPr>
+          <w:sz w:val="32"/>
+          <w:szCs w:val="32"/>
+        </w:rPr>
         <w:t>Design Considerations</w:t>
       </w:r>
       <w:bookmarkEnd w:id="9"/>
@@ -2232,14 +2378,18 @@
     <w:p>
       <w:pPr>
         <w:pStyle w:val="Heading2"/>
-      </w:pPr>
-      <w:bookmarkStart w:id="10" w:name="_Toc201584186"/>
+        <w:spacing w:line="276" w:lineRule="auto"/>
+      </w:pPr>
+      <w:bookmarkStart w:id="10" w:name="_Toc201585126"/>
       <w:r>
         <w:t>1. Data Modeling and Transformation Logic</w:t>
       </w:r>
       <w:bookmarkEnd w:id="10"/>
     </w:p>
     <w:p>
+      <w:pPr>
+        <w:spacing w:line="276" w:lineRule="auto"/>
+      </w:pPr>
       <w:r>
         <w:t>Raw events are loaded from CSV and staged via `</w:t>
       </w:r>
@@ -2287,14 +2437,18 @@
     <w:p>
       <w:pPr>
         <w:pStyle w:val="Heading2"/>
-      </w:pPr>
-      <w:bookmarkStart w:id="11" w:name="_Toc201584187"/>
+        <w:spacing w:line="276" w:lineRule="auto"/>
+      </w:pPr>
+      <w:bookmarkStart w:id="11" w:name="_Toc201585127"/>
       <w:r>
         <w:t>2. Dashboard Design and Metric Clarity</w:t>
       </w:r>
       <w:bookmarkEnd w:id="11"/>
     </w:p>
     <w:p>
+      <w:pPr>
+        <w:spacing w:line="276" w:lineRule="auto"/>
+      </w:pPr>
       <w:r>
         <w:t>The dashboard offers toggles for daily/weekly/monthly views, chart summaries, cohort tables, and KPIs. Users can filter by date and export CSVs. LLM integration allows natural language queries.</w:t>
       </w:r>
@@ -2316,6 +2470,7 @@
           <w:ilvl w:val="0"/>
           <w:numId w:val="19"/>
         </w:numPr>
+        <w:spacing w:line="276" w:lineRule="auto"/>
       </w:pPr>
       <w:r>
         <w:t>What month had the highest churn rate?</w:t>
@@ -2328,6 +2483,7 @@
           <w:ilvl w:val="0"/>
           <w:numId w:val="19"/>
         </w:numPr>
+        <w:spacing w:line="276" w:lineRule="auto"/>
       </w:pPr>
       <w:r>
         <w:t>Compare new users vs resurrected users in April.</w:t>
@@ -2340,6 +2496,7 @@
           <w:ilvl w:val="0"/>
           <w:numId w:val="19"/>
         </w:numPr>
+        <w:spacing w:line="276" w:lineRule="auto"/>
       </w:pPr>
       <w:r>
         <w:t>Why did quick ratio drop in May?</w:t>
@@ -2352,25 +2509,37 @@
           <w:ilvl w:val="0"/>
           <w:numId w:val="19"/>
         </w:numPr>
+        <w:spacing w:line="276" w:lineRule="auto"/>
       </w:pPr>
       <w:r>
         <w:t>How many users were retained after 3 months from the March cohort?</w:t>
       </w:r>
     </w:p>
-    <w:p/>
-    <w:p/>
     <w:p>
       <w:pPr>
+        <w:spacing w:line="276" w:lineRule="auto"/>
+      </w:pPr>
+    </w:p>
+    <w:p>
+      <w:pPr>
+        <w:spacing w:line="276" w:lineRule="auto"/>
+      </w:pPr>
+    </w:p>
+    <w:p>
+      <w:pPr>
         <w:pStyle w:val="Heading2"/>
-      </w:pPr>
-      <w:bookmarkStart w:id="12" w:name="_Toc201584188"/>
+        <w:spacing w:line="276" w:lineRule="auto"/>
+      </w:pPr>
+      <w:bookmarkStart w:id="12" w:name="_Toc201585128"/>
       <w:r>
         <w:t>3. Code Readability, Structure, and Documentation</w:t>
       </w:r>
       <w:bookmarkEnd w:id="12"/>
     </w:p>
     <w:p>
-      <w:bookmarkStart w:id="13" w:name="_Toc201584189"/>
+      <w:pPr>
+        <w:spacing w:line="276" w:lineRule="auto"/>
+      </w:pPr>
       <w:r>
         <w:t>The project uses a clean structure with layered SQL folders (</w:t>
       </w:r>
@@ -2400,14 +2569,19 @@
       <w:r>
         <w:t xml:space="preserve"> tabs. Metadata and tests are defined via </w:t>
       </w:r>
+      <w:proofErr w:type="spellStart"/>
       <w:r>
         <w:t>schema.yml</w:t>
       </w:r>
+      <w:proofErr w:type="spellEnd"/>
       <w:r>
         <w:t>.</w:t>
       </w:r>
     </w:p>
     <w:p>
+      <w:pPr>
+        <w:spacing w:line="276" w:lineRule="auto"/>
+      </w:pPr>
       <w:r>
         <w:t>CI is set up using GitHub Actions (</w:t>
       </w:r>
@@ -2460,6 +2634,9 @@
       </w:r>
     </w:p>
     <w:p>
+      <w:pPr>
+        <w:spacing w:line="276" w:lineRule="auto"/>
+      </w:pPr>
       <w:r>
         <w:t xml:space="preserve">CD is handled via </w:t>
       </w:r>
@@ -2487,9 +2664,10 @@
     <w:p>
       <w:pPr>
         <w:pStyle w:val="Heading2"/>
-      </w:pPr>
-      <w:r>
-        <w:lastRenderedPageBreak/>
+        <w:spacing w:line="276" w:lineRule="auto"/>
+      </w:pPr>
+      <w:bookmarkStart w:id="13" w:name="_Toc201585129"/>
+      <w:r>
         <w:t xml:space="preserve">4. Design </w:t>
       </w:r>
       <w:proofErr w:type="spellStart"/>
@@ -2503,6 +2681,9 @@
       <w:bookmarkEnd w:id="13"/>
     </w:p>
     <w:p>
+      <w:pPr>
+        <w:spacing w:line="276" w:lineRule="auto"/>
+      </w:pPr>
       <w:r>
         <w:t>DuckDB offers blazing speed for local analytics but isn't built for high-concurrency</w:t>
       </w:r>
@@ -2522,14 +2703,26 @@
     <w:p>
       <w:pPr>
         <w:pStyle w:val="Heading1"/>
-      </w:pPr>
-      <w:bookmarkStart w:id="14" w:name="_Toc201584190"/>
-      <w:r>
+        <w:spacing w:line="276" w:lineRule="auto"/>
+        <w:rPr>
+          <w:sz w:val="32"/>
+          <w:szCs w:val="32"/>
+        </w:rPr>
+      </w:pPr>
+      <w:bookmarkStart w:id="14" w:name="_Toc201585130"/>
+      <w:r>
+        <w:rPr>
+          <w:sz w:val="32"/>
+          <w:szCs w:val="32"/>
+        </w:rPr>
         <w:t>DBT Modeling Strategy</w:t>
       </w:r>
       <w:bookmarkEnd w:id="14"/>
     </w:p>
     <w:p>
+      <w:pPr>
+        <w:spacing w:line="276" w:lineRule="auto"/>
+      </w:pPr>
       <w:r>
         <w:t>This project uses a layered dbt modeling approach based on the Medallion Architecture. It transforms raw event data into actionable insights across daily, weekly, and monthly levels.</w:t>
       </w:r>
@@ -2537,8 +2730,9 @@
     <w:p>
       <w:pPr>
         <w:pStyle w:val="Heading2"/>
-      </w:pPr>
-      <w:bookmarkStart w:id="15" w:name="_Toc201584191"/>
+        <w:spacing w:line="276" w:lineRule="auto"/>
+      </w:pPr>
+      <w:bookmarkStart w:id="15" w:name="_Toc201585131"/>
       <w:r>
         <w:t>Model Summary</w:t>
       </w:r>
@@ -2568,6 +2762,9 @@
             <w:tcW w:w="2235" w:type="dxa"/>
           </w:tcPr>
           <w:p>
+            <w:pPr>
+              <w:spacing w:line="276" w:lineRule="auto"/>
+            </w:pPr>
             <w:r>
               <w:t>Model Name</w:t>
             </w:r>
@@ -2579,6 +2776,7 @@
           </w:tcPr>
           <w:p>
             <w:pPr>
+              <w:spacing w:line="276" w:lineRule="auto"/>
               <w:cnfStyle w:val="100000000000" w:firstRow="1" w:lastRow="0" w:firstColumn="0" w:lastColumn="0" w:oddVBand="0" w:evenVBand="0" w:oddHBand="0" w:evenHBand="0" w:firstRowFirstColumn="0" w:firstRowLastColumn="0" w:lastRowFirstColumn="0" w:lastRowLastColumn="0"/>
             </w:pPr>
             <w:r>
@@ -2592,6 +2790,7 @@
           </w:tcPr>
           <w:p>
             <w:pPr>
+              <w:spacing w:line="276" w:lineRule="auto"/>
               <w:cnfStyle w:val="100000000000" w:firstRow="1" w:lastRow="0" w:firstColumn="0" w:lastColumn="0" w:oddVBand="0" w:evenVBand="0" w:oddHBand="0" w:evenHBand="0" w:firstRowFirstColumn="0" w:firstRowLastColumn="0" w:lastRowFirstColumn="0" w:lastRowLastColumn="0"/>
             </w:pPr>
             <w:r>
@@ -2605,6 +2804,7 @@
           </w:tcPr>
           <w:p>
             <w:pPr>
+              <w:spacing w:line="276" w:lineRule="auto"/>
               <w:cnfStyle w:val="100000000000" w:firstRow="1" w:lastRow="0" w:firstColumn="0" w:lastColumn="0" w:oddVBand="0" w:evenVBand="0" w:oddHBand="0" w:evenHBand="0" w:firstRowFirstColumn="0" w:firstRowLastColumn="0" w:lastRowFirstColumn="0" w:lastRowLastColumn="0"/>
             </w:pPr>
             <w:r>
@@ -2618,6 +2818,7 @@
           </w:tcPr>
           <w:p>
             <w:pPr>
+              <w:spacing w:line="276" w:lineRule="auto"/>
               <w:cnfStyle w:val="100000000000" w:firstRow="1" w:lastRow="0" w:firstColumn="0" w:lastColumn="0" w:oddVBand="0" w:evenVBand="0" w:oddHBand="0" w:evenHBand="0" w:firstRowFirstColumn="0" w:firstRowLastColumn="0" w:lastRowFirstColumn="0" w:lastRowLastColumn="0"/>
             </w:pPr>
             <w:r>
@@ -2637,6 +2838,9 @@
             <w:tcW w:w="2235" w:type="dxa"/>
           </w:tcPr>
           <w:p>
+            <w:pPr>
+              <w:spacing w:line="276" w:lineRule="auto"/>
+            </w:pPr>
             <w:proofErr w:type="spellStart"/>
             <w:r>
               <w:t>stg_raw_events</w:t>
@@ -2650,6 +2854,7 @@
           </w:tcPr>
           <w:p>
             <w:pPr>
+              <w:spacing w:line="276" w:lineRule="auto"/>
               <w:cnfStyle w:val="000000100000" w:firstRow="0" w:lastRow="0" w:firstColumn="0" w:lastColumn="0" w:oddVBand="0" w:evenVBand="0" w:oddHBand="1" w:evenHBand="0" w:firstRowFirstColumn="0" w:firstRowLastColumn="0" w:lastRowFirstColumn="0" w:lastRowLastColumn="0"/>
             </w:pPr>
             <w:r>
@@ -2663,6 +2868,7 @@
           </w:tcPr>
           <w:p>
             <w:pPr>
+              <w:spacing w:line="276" w:lineRule="auto"/>
               <w:cnfStyle w:val="000000100000" w:firstRow="0" w:lastRow="0" w:firstColumn="0" w:lastColumn="0" w:oddVBand="0" w:evenVBand="0" w:oddHBand="1" w:evenHBand="0" w:firstRowFirstColumn="0" w:firstRowLastColumn="0" w:lastRowFirstColumn="0" w:lastRowLastColumn="0"/>
             </w:pPr>
             <w:r>
@@ -2676,6 +2882,7 @@
           </w:tcPr>
           <w:p>
             <w:pPr>
+              <w:spacing w:line="276" w:lineRule="auto"/>
               <w:cnfStyle w:val="000000100000" w:firstRow="0" w:lastRow="0" w:firstColumn="0" w:lastColumn="0" w:oddVBand="0" w:evenVBand="0" w:oddHBand="1" w:evenHBand="0" w:firstRowFirstColumn="0" w:firstRowLastColumn="0" w:lastRowFirstColumn="0" w:lastRowLastColumn="0"/>
             </w:pPr>
             <w:r>
@@ -2689,6 +2896,7 @@
           </w:tcPr>
           <w:p>
             <w:pPr>
+              <w:spacing w:line="276" w:lineRule="auto"/>
               <w:cnfStyle w:val="000000100000" w:firstRow="0" w:lastRow="0" w:firstColumn="0" w:lastColumn="0" w:oddVBand="0" w:evenVBand="0" w:oddHBand="1" w:evenHBand="0" w:firstRowFirstColumn="0" w:firstRowLastColumn="0" w:lastRowFirstColumn="0" w:lastRowLastColumn="0"/>
             </w:pPr>
             <w:r>
@@ -2707,6 +2915,9 @@
             <w:tcW w:w="2235" w:type="dxa"/>
           </w:tcPr>
           <w:p>
+            <w:pPr>
+              <w:spacing w:line="276" w:lineRule="auto"/>
+            </w:pPr>
             <w:proofErr w:type="spellStart"/>
             <w:r>
               <w:t>stg_events</w:t>
@@ -2720,6 +2931,7 @@
           </w:tcPr>
           <w:p>
             <w:pPr>
+              <w:spacing w:line="276" w:lineRule="auto"/>
               <w:cnfStyle w:val="000000000000" w:firstRow="0" w:lastRow="0" w:firstColumn="0" w:lastColumn="0" w:oddVBand="0" w:evenVBand="0" w:oddHBand="0" w:evenHBand="0" w:firstRowFirstColumn="0" w:firstRowLastColumn="0" w:lastRowFirstColumn="0" w:lastRowLastColumn="0"/>
             </w:pPr>
             <w:r>
@@ -2733,6 +2945,7 @@
           </w:tcPr>
           <w:p>
             <w:pPr>
+              <w:spacing w:line="276" w:lineRule="auto"/>
               <w:cnfStyle w:val="000000000000" w:firstRow="0" w:lastRow="0" w:firstColumn="0" w:lastColumn="0" w:oddVBand="0" w:evenVBand="0" w:oddHBand="0" w:evenHBand="0" w:firstRowFirstColumn="0" w:firstRowLastColumn="0" w:lastRowFirstColumn="0" w:lastRowLastColumn="0"/>
             </w:pPr>
             <w:r>
@@ -2746,6 +2959,7 @@
           </w:tcPr>
           <w:p>
             <w:pPr>
+              <w:spacing w:line="276" w:lineRule="auto"/>
               <w:cnfStyle w:val="000000000000" w:firstRow="0" w:lastRow="0" w:firstColumn="0" w:lastColumn="0" w:oddVBand="0" w:evenVBand="0" w:oddHBand="0" w:evenHBand="0" w:firstRowFirstColumn="0" w:firstRowLastColumn="0" w:lastRowFirstColumn="0" w:lastRowLastColumn="0"/>
             </w:pPr>
             <w:r>
@@ -2759,6 +2973,7 @@
           </w:tcPr>
           <w:p>
             <w:pPr>
+              <w:spacing w:line="276" w:lineRule="auto"/>
               <w:cnfStyle w:val="000000000000" w:firstRow="0" w:lastRow="0" w:firstColumn="0" w:lastColumn="0" w:oddVBand="0" w:evenVBand="0" w:oddHBand="0" w:evenHBand="0" w:firstRowFirstColumn="0" w:firstRowLastColumn="0" w:lastRowFirstColumn="0" w:lastRowLastColumn="0"/>
             </w:pPr>
             <w:r>
@@ -2778,6 +2993,9 @@
             <w:tcW w:w="2235" w:type="dxa"/>
           </w:tcPr>
           <w:p>
+            <w:pPr>
+              <w:spacing w:line="276" w:lineRule="auto"/>
+            </w:pPr>
             <w:proofErr w:type="spellStart"/>
             <w:r>
               <w:t>dim_users</w:t>
@@ -2791,6 +3009,7 @@
           </w:tcPr>
           <w:p>
             <w:pPr>
+              <w:spacing w:line="276" w:lineRule="auto"/>
               <w:cnfStyle w:val="000000100000" w:firstRow="0" w:lastRow="0" w:firstColumn="0" w:lastColumn="0" w:oddVBand="0" w:evenVBand="0" w:oddHBand="1" w:evenHBand="0" w:firstRowFirstColumn="0" w:firstRowLastColumn="0" w:lastRowFirstColumn="0" w:lastRowLastColumn="0"/>
             </w:pPr>
             <w:r>
@@ -2804,6 +3023,7 @@
           </w:tcPr>
           <w:p>
             <w:pPr>
+              <w:spacing w:line="276" w:lineRule="auto"/>
               <w:cnfStyle w:val="000000100000" w:firstRow="0" w:lastRow="0" w:firstColumn="0" w:lastColumn="0" w:oddVBand="0" w:evenVBand="0" w:oddHBand="1" w:evenHBand="0" w:firstRowFirstColumn="0" w:firstRowLastColumn="0" w:lastRowFirstColumn="0" w:lastRowLastColumn="0"/>
             </w:pPr>
             <w:r>
@@ -2817,6 +3037,7 @@
           </w:tcPr>
           <w:p>
             <w:pPr>
+              <w:spacing w:line="276" w:lineRule="auto"/>
               <w:cnfStyle w:val="000000100000" w:firstRow="0" w:lastRow="0" w:firstColumn="0" w:lastColumn="0" w:oddVBand="0" w:evenVBand="0" w:oddHBand="1" w:evenHBand="0" w:firstRowFirstColumn="0" w:firstRowLastColumn="0" w:lastRowFirstColumn="0" w:lastRowLastColumn="0"/>
             </w:pPr>
             <w:proofErr w:type="spellStart"/>
@@ -2832,6 +3053,7 @@
           </w:tcPr>
           <w:p>
             <w:pPr>
+              <w:spacing w:line="276" w:lineRule="auto"/>
               <w:cnfStyle w:val="000000100000" w:firstRow="0" w:lastRow="0" w:firstColumn="0" w:lastColumn="0" w:oddVBand="0" w:evenVBand="0" w:oddHBand="1" w:evenHBand="0" w:firstRowFirstColumn="0" w:firstRowLastColumn="0" w:lastRowFirstColumn="0" w:lastRowLastColumn="0"/>
             </w:pPr>
             <w:r>
@@ -2850,6 +3072,9 @@
             <w:tcW w:w="2235" w:type="dxa"/>
           </w:tcPr>
           <w:p>
+            <w:pPr>
+              <w:spacing w:line="276" w:lineRule="auto"/>
+            </w:pPr>
             <w:proofErr w:type="spellStart"/>
             <w:r>
               <w:t>fct_events</w:t>
@@ -2863,6 +3088,7 @@
           </w:tcPr>
           <w:p>
             <w:pPr>
+              <w:spacing w:line="276" w:lineRule="auto"/>
               <w:cnfStyle w:val="000000000000" w:firstRow="0" w:lastRow="0" w:firstColumn="0" w:lastColumn="0" w:oddVBand="0" w:evenVBand="0" w:oddHBand="0" w:evenHBand="0" w:firstRowFirstColumn="0" w:firstRowLastColumn="0" w:lastRowFirstColumn="0" w:lastRowLastColumn="0"/>
             </w:pPr>
             <w:r>
@@ -2876,6 +3102,7 @@
           </w:tcPr>
           <w:p>
             <w:pPr>
+              <w:spacing w:line="276" w:lineRule="auto"/>
               <w:cnfStyle w:val="000000000000" w:firstRow="0" w:lastRow="0" w:firstColumn="0" w:lastColumn="0" w:oddVBand="0" w:evenVBand="0" w:oddHBand="0" w:evenHBand="0" w:firstRowFirstColumn="0" w:firstRowLastColumn="0" w:lastRowFirstColumn="0" w:lastRowLastColumn="0"/>
             </w:pPr>
             <w:r>
@@ -2889,6 +3116,7 @@
           </w:tcPr>
           <w:p>
             <w:pPr>
+              <w:spacing w:line="276" w:lineRule="auto"/>
               <w:cnfStyle w:val="000000000000" w:firstRow="0" w:lastRow="0" w:firstColumn="0" w:lastColumn="0" w:oddVBand="0" w:evenVBand="0" w:oddHBand="0" w:evenHBand="0" w:firstRowFirstColumn="0" w:firstRowLastColumn="0" w:lastRowFirstColumn="0" w:lastRowLastColumn="0"/>
             </w:pPr>
             <w:proofErr w:type="spellStart"/>
@@ -2904,6 +3132,7 @@
           </w:tcPr>
           <w:p>
             <w:pPr>
+              <w:spacing w:line="276" w:lineRule="auto"/>
               <w:cnfStyle w:val="000000000000" w:firstRow="0" w:lastRow="0" w:firstColumn="0" w:lastColumn="0" w:oddVBand="0" w:evenVBand="0" w:oddHBand="0" w:evenHBand="0" w:firstRowFirstColumn="0" w:firstRowLastColumn="0" w:lastRowFirstColumn="0" w:lastRowLastColumn="0"/>
             </w:pPr>
             <w:r>
@@ -2923,6 +3152,9 @@
             <w:tcW w:w="2235" w:type="dxa"/>
           </w:tcPr>
           <w:p>
+            <w:pPr>
+              <w:spacing w:line="276" w:lineRule="auto"/>
+            </w:pPr>
             <w:proofErr w:type="spellStart"/>
             <w:r>
               <w:t>user_lifecycle</w:t>
@@ -2939,6 +3171,7 @@
           </w:tcPr>
           <w:p>
             <w:pPr>
+              <w:spacing w:line="276" w:lineRule="auto"/>
               <w:cnfStyle w:val="000000100000" w:firstRow="0" w:lastRow="0" w:firstColumn="0" w:lastColumn="0" w:oddVBand="0" w:evenVBand="0" w:oddHBand="1" w:evenHBand="0" w:firstRowFirstColumn="0" w:firstRowLastColumn="0" w:lastRowFirstColumn="0" w:lastRowLastColumn="0"/>
             </w:pPr>
             <w:r>
@@ -2952,6 +3185,7 @@
           </w:tcPr>
           <w:p>
             <w:pPr>
+              <w:spacing w:line="276" w:lineRule="auto"/>
               <w:cnfStyle w:val="000000100000" w:firstRow="0" w:lastRow="0" w:firstColumn="0" w:lastColumn="0" w:oddVBand="0" w:evenVBand="0" w:oddHBand="1" w:evenHBand="0" w:firstRowFirstColumn="0" w:firstRowLastColumn="0" w:lastRowFirstColumn="0" w:lastRowLastColumn="0"/>
             </w:pPr>
             <w:r>
@@ -2965,6 +3199,7 @@
           </w:tcPr>
           <w:p>
             <w:pPr>
+              <w:spacing w:line="276" w:lineRule="auto"/>
               <w:cnfStyle w:val="000000100000" w:firstRow="0" w:lastRow="0" w:firstColumn="0" w:lastColumn="0" w:oddVBand="0" w:evenVBand="0" w:oddHBand="1" w:evenHBand="0" w:firstRowFirstColumn="0" w:firstRowLastColumn="0" w:lastRowFirstColumn="0" w:lastRowLastColumn="0"/>
             </w:pPr>
             <w:proofErr w:type="spellStart"/>
@@ -2980,6 +3215,7 @@
           </w:tcPr>
           <w:p>
             <w:pPr>
+              <w:spacing w:line="276" w:lineRule="auto"/>
               <w:cnfStyle w:val="000000100000" w:firstRow="0" w:lastRow="0" w:firstColumn="0" w:lastColumn="0" w:oddVBand="0" w:evenVBand="0" w:oddHBand="1" w:evenHBand="0" w:firstRowFirstColumn="0" w:firstRowLastColumn="0" w:lastRowFirstColumn="0" w:lastRowLastColumn="0"/>
             </w:pPr>
             <w:r>
@@ -2998,6 +3234,9 @@
             <w:tcW w:w="2235" w:type="dxa"/>
           </w:tcPr>
           <w:p>
+            <w:pPr>
+              <w:spacing w:line="276" w:lineRule="auto"/>
+            </w:pPr>
             <w:proofErr w:type="spellStart"/>
             <w:r>
               <w:t>growth_metrics</w:t>
@@ -3014,6 +3253,7 @@
           </w:tcPr>
           <w:p>
             <w:pPr>
+              <w:spacing w:line="276" w:lineRule="auto"/>
               <w:cnfStyle w:val="000000000000" w:firstRow="0" w:lastRow="0" w:firstColumn="0" w:lastColumn="0" w:oddVBand="0" w:evenVBand="0" w:oddHBand="0" w:evenHBand="0" w:firstRowFirstColumn="0" w:firstRowLastColumn="0" w:lastRowFirstColumn="0" w:lastRowLastColumn="0"/>
             </w:pPr>
             <w:r>
@@ -3027,6 +3267,7 @@
           </w:tcPr>
           <w:p>
             <w:pPr>
+              <w:spacing w:line="276" w:lineRule="auto"/>
               <w:cnfStyle w:val="000000000000" w:firstRow="0" w:lastRow="0" w:firstColumn="0" w:lastColumn="0" w:oddVBand="0" w:evenVBand="0" w:oddHBand="0" w:evenHBand="0" w:firstRowFirstColumn="0" w:firstRowLastColumn="0" w:lastRowFirstColumn="0" w:lastRowLastColumn="0"/>
             </w:pPr>
             <w:r>
@@ -3040,6 +3281,7 @@
           </w:tcPr>
           <w:p>
             <w:pPr>
+              <w:spacing w:line="276" w:lineRule="auto"/>
               <w:cnfStyle w:val="000000000000" w:firstRow="0" w:lastRow="0" w:firstColumn="0" w:lastColumn="0" w:oddVBand="0" w:evenVBand="0" w:oddHBand="0" w:evenHBand="0" w:firstRowFirstColumn="0" w:firstRowLastColumn="0" w:lastRowFirstColumn="0" w:lastRowLastColumn="0"/>
             </w:pPr>
             <w:r>
@@ -3053,6 +3295,7 @@
           </w:tcPr>
           <w:p>
             <w:pPr>
+              <w:spacing w:line="276" w:lineRule="auto"/>
               <w:cnfStyle w:val="000000000000" w:firstRow="0" w:lastRow="0" w:firstColumn="0" w:lastColumn="0" w:oddVBand="0" w:evenVBand="0" w:oddHBand="0" w:evenHBand="0" w:firstRowFirstColumn="0" w:firstRowLastColumn="0" w:lastRowFirstColumn="0" w:lastRowLastColumn="0"/>
             </w:pPr>
             <w:r>
@@ -3072,6 +3315,9 @@
             <w:tcW w:w="2235" w:type="dxa"/>
           </w:tcPr>
           <w:p>
+            <w:pPr>
+              <w:spacing w:line="276" w:lineRule="auto"/>
+            </w:pPr>
             <w:proofErr w:type="spellStart"/>
             <w:r>
               <w:t>retention_triangle</w:t>
@@ -3088,6 +3334,7 @@
           </w:tcPr>
           <w:p>
             <w:pPr>
+              <w:spacing w:line="276" w:lineRule="auto"/>
               <w:cnfStyle w:val="000000100000" w:firstRow="0" w:lastRow="0" w:firstColumn="0" w:lastColumn="0" w:oddVBand="0" w:evenVBand="0" w:oddHBand="1" w:evenHBand="0" w:firstRowFirstColumn="0" w:firstRowLastColumn="0" w:lastRowFirstColumn="0" w:lastRowLastColumn="0"/>
             </w:pPr>
             <w:r>
@@ -3101,6 +3348,7 @@
           </w:tcPr>
           <w:p>
             <w:pPr>
+              <w:spacing w:line="276" w:lineRule="auto"/>
               <w:cnfStyle w:val="000000100000" w:firstRow="0" w:lastRow="0" w:firstColumn="0" w:lastColumn="0" w:oddVBand="0" w:evenVBand="0" w:oddHBand="1" w:evenHBand="0" w:firstRowFirstColumn="0" w:firstRowLastColumn="0" w:lastRowFirstColumn="0" w:lastRowLastColumn="0"/>
             </w:pPr>
             <w:r>
@@ -3114,6 +3362,7 @@
           </w:tcPr>
           <w:p>
             <w:pPr>
+              <w:spacing w:line="276" w:lineRule="auto"/>
               <w:cnfStyle w:val="000000100000" w:firstRow="0" w:lastRow="0" w:firstColumn="0" w:lastColumn="0" w:oddVBand="0" w:evenVBand="0" w:oddHBand="1" w:evenHBand="0" w:firstRowFirstColumn="0" w:firstRowLastColumn="0" w:lastRowFirstColumn="0" w:lastRowLastColumn="0"/>
             </w:pPr>
             <w:r>
@@ -3127,6 +3376,7 @@
           </w:tcPr>
           <w:p>
             <w:pPr>
+              <w:spacing w:line="276" w:lineRule="auto"/>
               <w:cnfStyle w:val="000000100000" w:firstRow="0" w:lastRow="0" w:firstColumn="0" w:lastColumn="0" w:oddVBand="0" w:evenVBand="0" w:oddHBand="1" w:evenHBand="0" w:firstRowFirstColumn="0" w:firstRowLastColumn="0" w:lastRowFirstColumn="0" w:lastRowLastColumn="0"/>
             </w:pPr>
             <w:r>
@@ -3139,22 +3389,38 @@
     <w:p>
       <w:pPr>
         <w:pStyle w:val="Heading2"/>
+        <w:spacing w:line="276" w:lineRule="auto"/>
         <w:rPr>
           <w:rFonts w:ascii="Apple Color Emoji" w:hAnsi="Apple Color Emoji" w:cs="Apple Color Emoji"/>
         </w:rPr>
       </w:pPr>
     </w:p>
+    <w:p/>
+    <w:p/>
     <w:p>
       <w:pPr>
         <w:pStyle w:val="Heading2"/>
-      </w:pPr>
-      <w:bookmarkStart w:id="16" w:name="_Toc201584192"/>
-      <w:r>
+        <w:spacing w:line="276" w:lineRule="auto"/>
+        <w:rPr>
+          <w:sz w:val="28"/>
+          <w:szCs w:val="28"/>
+        </w:rPr>
+      </w:pPr>
+      <w:bookmarkStart w:id="16" w:name="_Toc201585132"/>
+      <w:r>
+        <w:rPr>
+          <w:sz w:val="28"/>
+          <w:szCs w:val="28"/>
+        </w:rPr>
+        <w:lastRenderedPageBreak/>
         <w:t>Layering and Its Benefits</w:t>
       </w:r>
       <w:bookmarkEnd w:id="16"/>
     </w:p>
     <w:p>
+      <w:pPr>
+        <w:spacing w:line="276" w:lineRule="auto"/>
+      </w:pPr>
       <w:r>
         <w:t>This dbt project follows the Medallion Architecture:</w:t>
       </w:r>
@@ -3166,6 +3432,7 @@
           <w:ilvl w:val="0"/>
           <w:numId w:val="10"/>
         </w:numPr>
+        <w:spacing w:line="276" w:lineRule="auto"/>
       </w:pPr>
       <w:r>
         <w:t>Staging Layer</w:t>
@@ -3178,6 +3445,7 @@
           <w:ilvl w:val="1"/>
           <w:numId w:val="10"/>
         </w:numPr>
+        <w:spacing w:line="276" w:lineRule="auto"/>
       </w:pPr>
       <w:r>
         <w:t>Purpose: Clean raw source data</w:t>
@@ -3190,6 +3458,7 @@
           <w:ilvl w:val="1"/>
           <w:numId w:val="10"/>
         </w:numPr>
+        <w:spacing w:line="276" w:lineRule="auto"/>
       </w:pPr>
       <w:r>
         <w:t xml:space="preserve">Tables: </w:t>
@@ -3215,6 +3484,7 @@
           <w:ilvl w:val="1"/>
           <w:numId w:val="10"/>
         </w:numPr>
+        <w:spacing w:line="276" w:lineRule="auto"/>
       </w:pPr>
       <w:r>
         <w:t>Characteristics: Simple SELECT + CAST, no business logic</w:t>
@@ -3227,6 +3497,7 @@
           <w:ilvl w:val="1"/>
           <w:numId w:val="10"/>
         </w:numPr>
+        <w:spacing w:line="276" w:lineRule="auto"/>
       </w:pPr>
       <w:r>
         <w:t>Why Tables? DuckDB benefits from persisted Parquet tables for fast reads.</w:t>
@@ -3239,6 +3510,7 @@
           <w:ilvl w:val="0"/>
           <w:numId w:val="10"/>
         </w:numPr>
+        <w:spacing w:line="276" w:lineRule="auto"/>
       </w:pPr>
       <w:r>
         <w:t>Intermediate (Core) Layer</w:t>
@@ -3251,6 +3523,7 @@
           <w:ilvl w:val="1"/>
           <w:numId w:val="10"/>
         </w:numPr>
+        <w:spacing w:line="276" w:lineRule="auto"/>
       </w:pPr>
       <w:r>
         <w:t>Purpose: Central logic and transformations (fact/dim)</w:t>
@@ -3263,6 +3536,7 @@
           <w:ilvl w:val="1"/>
           <w:numId w:val="10"/>
         </w:numPr>
+        <w:spacing w:line="276" w:lineRule="auto"/>
       </w:pPr>
       <w:r>
         <w:t xml:space="preserve">Tables: </w:t>
@@ -3299,6 +3573,7 @@
           <w:ilvl w:val="1"/>
           <w:numId w:val="10"/>
         </w:numPr>
+        <w:spacing w:line="276" w:lineRule="auto"/>
       </w:pPr>
       <w:r>
         <w:t>Why Incremental? For scalability and pipeline efficiency</w:t>
@@ -3311,6 +3586,7 @@
           <w:ilvl w:val="1"/>
           <w:numId w:val="10"/>
         </w:numPr>
+        <w:spacing w:line="276" w:lineRule="auto"/>
       </w:pPr>
       <w:r>
         <w:t xml:space="preserve">Why </w:t>
@@ -3344,6 +3620,7 @@
           <w:ilvl w:val="0"/>
           <w:numId w:val="10"/>
         </w:numPr>
+        <w:spacing w:line="276" w:lineRule="auto"/>
       </w:pPr>
       <w:r>
         <w:t>Growth Layer</w:t>
@@ -3356,6 +3633,7 @@
           <w:ilvl w:val="1"/>
           <w:numId w:val="10"/>
         </w:numPr>
+        <w:spacing w:line="276" w:lineRule="auto"/>
       </w:pPr>
       <w:r>
         <w:t>Purpose: Analytical outputs and aggregations</w:t>
@@ -3368,6 +3646,7 @@
           <w:ilvl w:val="1"/>
           <w:numId w:val="10"/>
         </w:numPr>
+        <w:spacing w:line="276" w:lineRule="auto"/>
       </w:pPr>
       <w:r>
         <w:t xml:space="preserve">Views: </w:t>
@@ -3396,20 +3675,32 @@
           <w:ilvl w:val="1"/>
           <w:numId w:val="10"/>
         </w:numPr>
+        <w:spacing w:line="276" w:lineRule="auto"/>
       </w:pPr>
       <w:r>
         <w:t>Why Views? These depend on constantly changing input and should reflect live business metrics</w:t>
       </w:r>
     </w:p>
-    <w:p/>
-    <w:p/>
-    <w:p/>
     <w:p>
       <w:pPr>
+        <w:spacing w:line="276" w:lineRule="auto"/>
+      </w:pPr>
+    </w:p>
+    <w:p>
+      <w:pPr>
         <w:pStyle w:val="Heading1"/>
-      </w:pPr>
-      <w:bookmarkStart w:id="17" w:name="_Toc201584193"/>
-      <w:r>
+        <w:spacing w:line="276" w:lineRule="auto"/>
+        <w:rPr>
+          <w:sz w:val="32"/>
+          <w:szCs w:val="32"/>
+        </w:rPr>
+      </w:pPr>
+      <w:bookmarkStart w:id="17" w:name="_Toc201585133"/>
+      <w:r>
+        <w:rPr>
+          <w:sz w:val="32"/>
+          <w:szCs w:val="32"/>
+        </w:rPr>
         <w:t>Analysis and Insights</w:t>
       </w:r>
       <w:bookmarkEnd w:id="17"/>
@@ -3417,8 +3708,9 @@
     <w:p>
       <w:pPr>
         <w:pStyle w:val="Heading2"/>
-      </w:pPr>
-      <w:bookmarkStart w:id="18" w:name="_Toc201584194"/>
+        <w:spacing w:line="276" w:lineRule="auto"/>
+      </w:pPr>
+      <w:bookmarkStart w:id="18" w:name="_Toc201585134"/>
       <w:r>
         <w:t>Assumptions</w:t>
       </w:r>
@@ -3431,6 +3723,7 @@
           <w:ilvl w:val="0"/>
           <w:numId w:val="13"/>
         </w:numPr>
+        <w:spacing w:line="276" w:lineRule="auto"/>
       </w:pPr>
       <w:r>
         <w:t>Users are uniquely identified by `user_id`.</w:t>
@@ -3443,6 +3736,7 @@
           <w:ilvl w:val="0"/>
           <w:numId w:val="13"/>
         </w:numPr>
+        <w:spacing w:line="276" w:lineRule="auto"/>
       </w:pPr>
       <w:r>
         <w:t>The `event_time` field is the basis for all time-based aggregations (daily/weekly/monthly).</w:t>
@@ -3455,6 +3749,7 @@
           <w:ilvl w:val="0"/>
           <w:numId w:val="13"/>
         </w:numPr>
+        <w:spacing w:line="276" w:lineRule="auto"/>
       </w:pPr>
       <w:r>
         <w:t>Metrics are aggregated at the user level, not event count level.</w:t>
@@ -3463,8 +3758,9 @@
     <w:p>
       <w:pPr>
         <w:pStyle w:val="Heading2"/>
-      </w:pPr>
-      <w:bookmarkStart w:id="19" w:name="_Toc201584195"/>
+        <w:spacing w:line="276" w:lineRule="auto"/>
+      </w:pPr>
+      <w:bookmarkStart w:id="19" w:name="_Toc201585135"/>
       <w:r>
         <w:t>Metric Definitions</w:t>
       </w:r>
@@ -3477,6 +3773,7 @@
           <w:ilvl w:val="0"/>
           <w:numId w:val="14"/>
         </w:numPr>
+        <w:spacing w:line="276" w:lineRule="auto"/>
       </w:pPr>
       <w:r>
         <w:t>New Users: Users active for the first time in the selected period.</w:t>
@@ -3489,6 +3786,7 @@
           <w:ilvl w:val="0"/>
           <w:numId w:val="14"/>
         </w:numPr>
+        <w:spacing w:line="276" w:lineRule="auto"/>
       </w:pPr>
       <w:r>
         <w:t>Resurrected Users: Users who were inactive in the previous period but became active again.</w:t>
@@ -3501,6 +3799,7 @@
           <w:ilvl w:val="0"/>
           <w:numId w:val="14"/>
         </w:numPr>
+        <w:spacing w:line="276" w:lineRule="auto"/>
       </w:pPr>
       <w:r>
         <w:t>Retained Users: Users active in both the current and previous period.</w:t>
@@ -3513,6 +3812,7 @@
           <w:ilvl w:val="0"/>
           <w:numId w:val="14"/>
         </w:numPr>
+        <w:spacing w:line="276" w:lineRule="auto"/>
       </w:pPr>
       <w:r>
         <w:t>Churned Users: Users who were active previously but inactive in the current period.</w:t>
@@ -3525,6 +3825,7 @@
           <w:ilvl w:val="0"/>
           <w:numId w:val="14"/>
         </w:numPr>
+        <w:spacing w:line="276" w:lineRule="auto"/>
       </w:pPr>
       <w:r>
         <w:t>Active Users: Total users who performed at least one action in the period.</w:t>
@@ -3537,6 +3838,7 @@
           <w:ilvl w:val="0"/>
           <w:numId w:val="14"/>
         </w:numPr>
+        <w:spacing w:line="276" w:lineRule="auto"/>
       </w:pPr>
       <w:r>
         <w:t>Retention Rate: Percentage of retained users from the previous period.</w:t>
@@ -3549,6 +3851,7 @@
           <w:ilvl w:val="0"/>
           <w:numId w:val="14"/>
         </w:numPr>
+        <w:spacing w:line="276" w:lineRule="auto"/>
       </w:pPr>
       <w:r>
         <w:t>Quick Ratio: (New + Resurrected) / Churned — indicates growth vs loss balance.</w:t>
@@ -3557,9 +3860,11 @@
     <w:p>
       <w:pPr>
         <w:pStyle w:val="Heading2"/>
-      </w:pPr>
-      <w:bookmarkStart w:id="20" w:name="_Toc201584196"/>
-      <w:r>
+        <w:spacing w:line="276" w:lineRule="auto"/>
+      </w:pPr>
+      <w:bookmarkStart w:id="20" w:name="_Toc201585136"/>
+      <w:r>
+        <w:lastRenderedPageBreak/>
         <w:t>Insights</w:t>
       </w:r>
       <w:bookmarkEnd w:id="20"/>
@@ -3571,6 +3876,7 @@
           <w:ilvl w:val="0"/>
           <w:numId w:val="14"/>
         </w:numPr>
+        <w:spacing w:line="276" w:lineRule="auto"/>
       </w:pPr>
       <w:r>
         <w:rPr>
@@ -3591,6 +3897,7 @@
           <w:ilvl w:val="0"/>
           <w:numId w:val="14"/>
         </w:numPr>
+        <w:spacing w:line="276" w:lineRule="auto"/>
       </w:pPr>
       <w:r>
         <w:rPr>
@@ -3611,13 +3918,13 @@
           <w:ilvl w:val="0"/>
           <w:numId w:val="14"/>
         </w:numPr>
+        <w:spacing w:line="276" w:lineRule="auto"/>
       </w:pPr>
       <w:r>
         <w:rPr>
           <w:b/>
           <w:bCs/>
         </w:rPr>
-        <w:lastRenderedPageBreak/>
         <w:t xml:space="preserve">Cohort Retention Drop Is Artificial—A </w:t>
       </w:r>
       <w:proofErr w:type="spellStart"/>
@@ -3648,6 +3955,7 @@
           <w:ilvl w:val="0"/>
           <w:numId w:val="14"/>
         </w:numPr>
+        <w:spacing w:line="276" w:lineRule="auto"/>
       </w:pPr>
       <w:r>
         <w:rPr>
@@ -3676,6 +3984,7 @@
           <w:ilvl w:val="0"/>
           <w:numId w:val="14"/>
         </w:numPr>
+        <w:spacing w:line="276" w:lineRule="auto"/>
       </w:pPr>
       <w:r>
         <w:rPr>
@@ -3686,14 +3995,18 @@
       </w:r>
       <w:r>
         <w:br/>
+      </w:r>
+      <w:r>
+        <w:lastRenderedPageBreak/>
         <w:t>Daily user trends reveal sharp acquisition spikes—such as 52 users on March 8—followed by long periods of inactivity, including no new users from March 14 onward. While this hints at unreliable or burst-driven growth mechanisms, it again raises the question of whether this pattern is real or shaped by dataset simulation or framing artifacts. For any sustainable growth analysis, we must establish that acquisition signals are grounded in accurate and complete tracking logic.</w:t>
       </w:r>
     </w:p>
     <w:p>
       <w:pPr>
         <w:pStyle w:val="Heading2"/>
-      </w:pPr>
-      <w:bookmarkStart w:id="21" w:name="_Toc201584197"/>
+        <w:spacing w:line="276" w:lineRule="auto"/>
+      </w:pPr>
+      <w:bookmarkStart w:id="21" w:name="_Toc201585137"/>
       <w:r>
         <w:t>Follow-up Questions</w:t>
       </w:r>
@@ -3706,6 +4019,7 @@
           <w:ilvl w:val="0"/>
           <w:numId w:val="14"/>
         </w:numPr>
+        <w:spacing w:line="276" w:lineRule="auto"/>
       </w:pPr>
       <w:r>
         <w:t>What specific changes in marketing strategy, product rollout, or external conditions occurred around March 2025 that could explain the observed decline in new user acquisition?</w:t>
@@ -3718,6 +4032,7 @@
           <w:ilvl w:val="0"/>
           <w:numId w:val="14"/>
         </w:numPr>
+        <w:spacing w:line="276" w:lineRule="auto"/>
       </w:pPr>
       <w:r>
         <w:t xml:space="preserve">Are the high-retention cohorts from early March linked to specific acquisition sources, campaigns, or onboarding flows that could be </w:t>
@@ -3738,6 +4053,7 @@
           <w:ilvl w:val="0"/>
           <w:numId w:val="14"/>
         </w:numPr>
+        <w:spacing w:line="276" w:lineRule="auto"/>
       </w:pPr>
       <w:r>
         <w:t xml:space="preserve">Should the definitions of "new," "active," or "churned" users be revised to align more closely with business logic and better reflect true customer </w:t>
@@ -3758,6 +4074,7 @@
           <w:ilvl w:val="0"/>
           <w:numId w:val="14"/>
         </w:numPr>
+        <w:spacing w:line="276" w:lineRule="auto"/>
       </w:pPr>
       <w:r>
         <w:t xml:space="preserve">Given the limited timeframe and unusually high retention patterns, is the dataset complete and representative of real user </w:t>
@@ -3773,22 +4090,115 @@
     </w:p>
     <w:p>
       <w:pPr>
+        <w:spacing w:line="276" w:lineRule="auto"/>
+      </w:pPr>
+    </w:p>
+    <w:p>
+      <w:pPr>
+        <w:spacing w:line="276" w:lineRule="auto"/>
+      </w:pPr>
+    </w:p>
+    <w:p>
+      <w:pPr>
+        <w:spacing w:line="276" w:lineRule="auto"/>
+      </w:pPr>
+    </w:p>
+    <w:p>
+      <w:pPr>
+        <w:spacing w:line="276" w:lineRule="auto"/>
+      </w:pPr>
+    </w:p>
+    <w:p>
+      <w:pPr>
+        <w:spacing w:line="276" w:lineRule="auto"/>
+      </w:pPr>
+    </w:p>
+    <w:p>
+      <w:pPr>
+        <w:spacing w:line="276" w:lineRule="auto"/>
+      </w:pPr>
+    </w:p>
+    <w:p>
+      <w:pPr>
+        <w:spacing w:line="276" w:lineRule="auto"/>
+      </w:pPr>
+    </w:p>
+    <w:p>
+      <w:pPr>
+        <w:spacing w:line="276" w:lineRule="auto"/>
+      </w:pPr>
+    </w:p>
+    <w:p>
+      <w:pPr>
+        <w:spacing w:line="276" w:lineRule="auto"/>
+      </w:pPr>
+    </w:p>
+    <w:p>
+      <w:pPr>
+        <w:spacing w:line="276" w:lineRule="auto"/>
+      </w:pPr>
+    </w:p>
+    <w:p>
+      <w:pPr>
+        <w:spacing w:line="276" w:lineRule="auto"/>
+      </w:pPr>
+    </w:p>
+    <w:p>
+      <w:pPr>
+        <w:spacing w:line="276" w:lineRule="auto"/>
+      </w:pPr>
+    </w:p>
+    <w:p>
+      <w:pPr>
+        <w:spacing w:line="276" w:lineRule="auto"/>
+      </w:pPr>
+    </w:p>
+    <w:p>
+      <w:pPr>
+        <w:spacing w:line="276" w:lineRule="auto"/>
+      </w:pPr>
+    </w:p>
+    <w:p>
+      <w:pPr>
+        <w:spacing w:line="276" w:lineRule="auto"/>
+      </w:pPr>
+    </w:p>
+    <w:p>
+      <w:pPr>
+        <w:spacing w:line="276" w:lineRule="auto"/>
+      </w:pPr>
+    </w:p>
+    <w:p>
+      <w:pPr>
+        <w:spacing w:line="276" w:lineRule="auto"/>
+      </w:pPr>
+    </w:p>
+    <w:p>
+      <w:pPr>
+        <w:spacing w:line="276" w:lineRule="auto"/>
+      </w:pPr>
+    </w:p>
+    <w:p>
+      <w:pPr>
+        <w:spacing w:line="276" w:lineRule="auto"/>
+      </w:pPr>
+    </w:p>
+    <w:p>
+      <w:pPr>
         <w:pStyle w:val="Heading1"/>
-      </w:pPr>
-    </w:p>
-    <w:p/>
-    <w:p/>
-    <w:p/>
-    <w:p/>
-    <w:p>
-      <w:pPr>
-        <w:pStyle w:val="Heading1"/>
+        <w:spacing w:line="276" w:lineRule="auto"/>
         <w:rPr>
           <w:rFonts w:ascii="Apple Color Emoji" w:hAnsi="Apple Color Emoji" w:cs="Apple Color Emoji"/>
+          <w:sz w:val="32"/>
+          <w:szCs w:val="32"/>
         </w:rPr>
       </w:pPr>
-      <w:bookmarkStart w:id="22" w:name="_Toc201584198"/>
-      <w:r>
+      <w:bookmarkStart w:id="22" w:name="_Toc201585138"/>
+      <w:r>
+        <w:rPr>
+          <w:sz w:val="32"/>
+          <w:szCs w:val="32"/>
+        </w:rPr>
         <w:lastRenderedPageBreak/>
         <w:t>Future Enhancements and Scaling Roadmap</w:t>
       </w:r>
@@ -3813,6 +4223,7 @@
           </w:tcPr>
           <w:p>
             <w:pPr>
+              <w:spacing w:line="276" w:lineRule="auto"/>
               <w:jc w:val="center"/>
               <w:rPr>
                 <w:b/>
@@ -3834,6 +4245,7 @@
           </w:tcPr>
           <w:p>
             <w:pPr>
+              <w:spacing w:line="276" w:lineRule="auto"/>
               <w:jc w:val="center"/>
               <w:rPr>
                 <w:b/>
@@ -3855,6 +4267,7 @@
           </w:tcPr>
           <w:p>
             <w:pPr>
+              <w:spacing w:line="276" w:lineRule="auto"/>
               <w:jc w:val="center"/>
               <w:rPr>
                 <w:b/>
@@ -3877,6 +4290,9 @@
             <w:hideMark/>
           </w:tcPr>
           <w:p>
+            <w:pPr>
+              <w:spacing w:line="276" w:lineRule="auto"/>
+            </w:pPr>
             <w:r>
               <w:rPr>
                 <w:rStyle w:val="Strong"/>
@@ -3903,6 +4319,9 @@
             <w:hideMark/>
           </w:tcPr>
           <w:p>
+            <w:pPr>
+              <w:spacing w:line="276" w:lineRule="auto"/>
+            </w:pPr>
             <w:r>
               <w:t xml:space="preserve">Redshift , </w:t>
             </w:r>
@@ -3917,6 +4336,9 @@
             <w:hideMark/>
           </w:tcPr>
           <w:p>
+            <w:pPr>
+              <w:spacing w:line="276" w:lineRule="auto"/>
+            </w:pPr>
             <w:r>
               <w:t>Scales to handle large datasets, high concurrency, and complex analytics</w:t>
             </w:r>
@@ -3930,6 +4352,9 @@
             <w:hideMark/>
           </w:tcPr>
           <w:p>
+            <w:pPr>
+              <w:spacing w:line="276" w:lineRule="auto"/>
+            </w:pPr>
             <w:r>
               <w:rPr>
                 <w:rStyle w:val="Strong"/>
@@ -3944,6 +4369,9 @@
             <w:hideMark/>
           </w:tcPr>
           <w:p>
+            <w:pPr>
+              <w:spacing w:line="276" w:lineRule="auto"/>
+            </w:pPr>
             <w:r>
               <w:t>Airflow, dbt Cloud, Dagster</w:t>
             </w:r>
@@ -3955,6 +4383,9 @@
             <w:hideMark/>
           </w:tcPr>
           <w:p>
+            <w:pPr>
+              <w:spacing w:line="276" w:lineRule="auto"/>
+            </w:pPr>
             <w:r>
               <w:t>Automates dbt runs, testing, dependency management, and alerting</w:t>
             </w:r>
@@ -3968,6 +4399,9 @@
             <w:hideMark/>
           </w:tcPr>
           <w:p>
+            <w:pPr>
+              <w:spacing w:line="276" w:lineRule="auto"/>
+            </w:pPr>
             <w:r>
               <w:rPr>
                 <w:rStyle w:val="Strong"/>
@@ -3982,6 +4416,9 @@
             <w:hideMark/>
           </w:tcPr>
           <w:p>
+            <w:pPr>
+              <w:spacing w:line="276" w:lineRule="auto"/>
+            </w:pPr>
             <w:r>
               <w:t>Looker, Tableau, Metabase</w:t>
             </w:r>
@@ -3993,6 +4430,9 @@
             <w:hideMark/>
           </w:tcPr>
           <w:p>
+            <w:pPr>
+              <w:spacing w:line="276" w:lineRule="auto"/>
+            </w:pPr>
             <w:r>
               <w:t>Enables production-ready dashboards with fine-grained role-based access control (RBAC)</w:t>
             </w:r>
@@ -4006,6 +4446,9 @@
             <w:hideMark/>
           </w:tcPr>
           <w:p>
+            <w:pPr>
+              <w:spacing w:line="276" w:lineRule="auto"/>
+            </w:pPr>
             <w:r>
               <w:rPr>
                 <w:rStyle w:val="Strong"/>
@@ -4020,6 +4463,9 @@
             <w:hideMark/>
           </w:tcPr>
           <w:p>
+            <w:pPr>
+              <w:spacing w:line="276" w:lineRule="auto"/>
+            </w:pPr>
             <w:r>
               <w:t>Kafka, Pub/Sub</w:t>
             </w:r>
@@ -4031,6 +4477,9 @@
             <w:hideMark/>
           </w:tcPr>
           <w:p>
+            <w:pPr>
+              <w:spacing w:line="276" w:lineRule="auto"/>
+            </w:pPr>
             <w:r>
               <w:t>Supports near real-time data processing and dashboard updates</w:t>
             </w:r>
@@ -4041,8 +4490,9 @@
     <w:p>
       <w:pPr>
         <w:pStyle w:val="Heading2"/>
-      </w:pPr>
-      <w:bookmarkStart w:id="23" w:name="_Toc201584199"/>
+        <w:spacing w:line="276" w:lineRule="auto"/>
+      </w:pPr>
+      <w:bookmarkStart w:id="23" w:name="_Toc201585139"/>
       <w:r>
         <w:t>Planned UI enhancements</w:t>
       </w:r>
@@ -4055,6 +4505,7 @@
           <w:ilvl w:val="0"/>
           <w:numId w:val="12"/>
         </w:numPr>
+        <w:spacing w:line="276" w:lineRule="auto"/>
       </w:pPr>
       <w:r>
         <w:t xml:space="preserve">Add </w:t>
@@ -4084,6 +4535,7 @@
           <w:ilvl w:val="0"/>
           <w:numId w:val="12"/>
         </w:numPr>
+        <w:spacing w:line="276" w:lineRule="auto"/>
       </w:pPr>
       <w:r>
         <w:t xml:space="preserve">Have a </w:t>
@@ -4106,6 +4558,7 @@
           <w:ilvl w:val="0"/>
           <w:numId w:val="12"/>
         </w:numPr>
+        <w:spacing w:line="276" w:lineRule="auto"/>
       </w:pPr>
       <w:r>
         <w:t xml:space="preserve">Implement </w:t>
@@ -4131,6 +4584,7 @@
           <w:ilvl w:val="0"/>
           <w:numId w:val="12"/>
         </w:numPr>
+        <w:spacing w:line="276" w:lineRule="auto"/>
       </w:pPr>
       <w:r>
         <w:t xml:space="preserve">Enhance the LLM interface with </w:t>

</xml_diff>